<commit_message>
Updated to version v2.13.
</commit_message>
<xml_diff>
--- a/unity/Documentation.docx
+++ b/unity/Documentation.docx
@@ -107,7 +107,7 @@
           <w:sz w:val="32"/>
           <w:szCs w:val="32"/>
         </w:rPr>
-        <w:t>2</w:t>
+        <w:t>3</w:t>
       </w:r>
     </w:p>
     <w:p>
@@ -492,25 +492,7 @@
           <w:sz w:val="28"/>
           <w:szCs w:val="28"/>
         </w:rPr>
-        <w:t>©202</w:t>
-      </w:r>
-      <w:r>
-        <w:rPr>
-          <w:rFonts w:eastAsia="" w:cs="" w:ascii="Calibri Light" w:hAnsi="Calibri Light" w:asciiTheme="majorHAnsi" w:cstheme="majorBidi" w:eastAsiaTheme="majorEastAsia" w:hAnsiTheme="majorHAnsi"/>
-          <w:color w:themeColor="accent1" w:themeShade="bf" w:val="2F5496"/>
-          <w:sz w:val="28"/>
-          <w:szCs w:val="28"/>
-        </w:rPr>
-        <w:t>5</w:t>
-      </w:r>
-      <w:r>
-        <w:rPr>
-          <w:rFonts w:eastAsia="" w:cs="" w:ascii="Calibri Light" w:hAnsi="Calibri Light" w:asciiTheme="majorHAnsi" w:cstheme="majorBidi" w:eastAsiaTheme="majorEastAsia" w:hAnsiTheme="majorHAnsi"/>
-          <w:color w:themeColor="accent1" w:themeShade="bf" w:val="2F5496"/>
-          <w:sz w:val="28"/>
-          <w:szCs w:val="28"/>
-        </w:rPr>
-        <w:t xml:space="preserve"> MARUI-PlugIn (inc.)</w:t>
+        <w:t>©2025 MARUI-PlugIn (inc.)</w:t>
       </w:r>
       <w:r>
         <w:br w:type="page"/>
@@ -534,15 +516,7 @@
       </w:pPr>
       <w:r>
         <w:rPr/>
-        <w:t>Copyright (c) 202</w:t>
-      </w:r>
-      <w:r>
-        <w:rPr/>
-        <w:t>5</w:t>
-      </w:r>
-      <w:r>
-        <w:rPr/>
-        <w:t xml:space="preserve"> MARUI-PlugIn (inc.)</w:t>
+        <w:t>Copyright (c) 2025 MARUI-PlugIn (inc.)</w:t>
       </w:r>
     </w:p>
     <w:p>
@@ -723,7 +697,7 @@
         </w:rPr>
         <w:t xml:space="preserve">4: </w:t>
       </w:r>
-      <w:hyperlink w:anchor="_4%253A_Licensing_and">
+      <w:hyperlink w:anchor="_4%25252525253A_Licensing_and">
         <w:r>
           <w:rPr>
             <w:rStyle w:val="Hyperlink"/>
@@ -831,6 +805,24 @@
         <w:rPr/>
         <w:t xml:space="preserve">10: </w:t>
       </w:r>
+      <w:hyperlink w:anchor="_toc299">
+        <w:r>
+          <w:rPr>
+            <w:rStyle w:val="Hyperlink"/>
+          </w:rPr>
+          <w:t>Special applications</w:t>
+        </w:r>
+      </w:hyperlink>
+    </w:p>
+    <w:p>
+      <w:pPr>
+        <w:pStyle w:val="Normal"/>
+        <w:rPr/>
+      </w:pPr>
+      <w:r>
+        <w:rPr/>
+        <w:t xml:space="preserve">11: </w:t>
+      </w:r>
       <w:hyperlink w:anchor="BuildInstructionsWindows">
         <w:r>
           <w:rPr>
@@ -847,7 +839,7 @@
       </w:pPr>
       <w:r>
         <w:rPr/>
-        <w:t xml:space="preserve">11: </w:t>
+        <w:t xml:space="preserve">12: </w:t>
       </w:r>
       <w:hyperlink w:anchor="BuildinstructionsAndroid">
         <w:r>
@@ -865,7 +857,7 @@
       </w:pPr>
       <w:r>
         <w:rPr/>
-        <w:t xml:space="preserve">12: </w:t>
+        <w:t xml:space="preserve">13: </w:t>
       </w:r>
       <w:hyperlink w:anchor="TroubleshootingFAQ">
         <w:r>
@@ -883,7 +875,7 @@
       </w:pPr>
       <w:r>
         <w:rPr/>
-        <w:t xml:space="preserve">13: </w:t>
+        <w:t xml:space="preserve">14: </w:t>
       </w:r>
       <w:hyperlink w:anchor="EULA">
         <w:r>
@@ -893,15 +885,6 @@
           <w:t>Software license statement (EULA)</w:t>
         </w:r>
       </w:hyperlink>
-    </w:p>
-    <w:p>
-      <w:pPr>
-        <w:pStyle w:val="Normal"/>
-        <w:rPr/>
-      </w:pPr>
-      <w:r>
-        <w:rPr/>
-      </w:r>
     </w:p>
     <w:p>
       <w:pPr>
@@ -2165,8 +2148,8 @@
         <w:tblLook w:firstRow="1" w:noVBand="1" w:lastRow="0" w:firstColumn="1" w:lastColumn="0" w:noHBand="0" w:val="04a0"/>
       </w:tblPr>
       <w:tblGrid>
-        <w:gridCol w:w="1861"/>
-        <w:gridCol w:w="2266"/>
+        <w:gridCol w:w="1860"/>
+        <w:gridCol w:w="2267"/>
         <w:gridCol w:w="2444"/>
         <w:gridCol w:w="2256"/>
       </w:tblGrid>
@@ -2174,7 +2157,7 @@
         <w:trPr/>
         <w:tc>
           <w:tcPr>
-            <w:tcW w:w="1861" w:type="dxa"/>
+            <w:tcW w:w="1860" w:type="dxa"/>
             <w:tcBorders/>
           </w:tcPr>
           <w:p>
@@ -2205,7 +2188,7 @@
         </w:tc>
         <w:tc>
           <w:tcPr>
-            <w:tcW w:w="2266" w:type="dxa"/>
+            <w:tcW w:w="2267" w:type="dxa"/>
             <w:tcBorders/>
           </w:tcPr>
           <w:p>
@@ -2301,7 +2284,7 @@
         <w:trPr/>
         <w:tc>
           <w:tcPr>
-            <w:tcW w:w="1861" w:type="dxa"/>
+            <w:tcW w:w="1860" w:type="dxa"/>
             <w:tcBorders/>
           </w:tcPr>
           <w:p>
@@ -2333,7 +2316,7 @@
         </w:tc>
         <w:tc>
           <w:tcPr>
-            <w:tcW w:w="2266" w:type="dxa"/>
+            <w:tcW w:w="2267" w:type="dxa"/>
             <w:tcBorders/>
           </w:tcPr>
           <w:p>
@@ -2434,7 +2417,7 @@
         <w:trPr/>
         <w:tc>
           <w:tcPr>
-            <w:tcW w:w="1861" w:type="dxa"/>
+            <w:tcW w:w="1860" w:type="dxa"/>
             <w:tcBorders/>
           </w:tcPr>
           <w:p>
@@ -2466,7 +2449,7 @@
         </w:tc>
         <w:tc>
           <w:tcPr>
-            <w:tcW w:w="2266" w:type="dxa"/>
+            <w:tcW w:w="2267" w:type="dxa"/>
             <w:tcBorders/>
           </w:tcPr>
           <w:p>
@@ -2565,7 +2548,7 @@
         <w:trPr/>
         <w:tc>
           <w:tcPr>
-            <w:tcW w:w="1861" w:type="dxa"/>
+            <w:tcW w:w="1860" w:type="dxa"/>
             <w:tcBorders/>
           </w:tcPr>
           <w:p>
@@ -2597,7 +2580,7 @@
         </w:tc>
         <w:tc>
           <w:tcPr>
-            <w:tcW w:w="2266" w:type="dxa"/>
+            <w:tcW w:w="2267" w:type="dxa"/>
             <w:tcBorders/>
           </w:tcPr>
           <w:p>
@@ -2862,7 +2845,7 @@
         <w:spacing w:before="0" w:after="0"/>
         <w:rPr/>
       </w:pPr>
-      <w:bookmarkStart w:id="4" w:name="_4%253A_Licensing_and"/>
+      <w:bookmarkStart w:id="4" w:name="_4%25252525253A_Licensing_and"/>
       <w:bookmarkEnd w:id="4"/>
       <w:r>
         <w:rPr/>
@@ -3176,7 +3159,7 @@
       </w:r>
       <w:r>
         <w:rPr/>
-        <w:t>: This setting can be used when your player is moving or turning while gesturing. It will record the controller position relative to the current headset position and rotation. Usually though, compensating the head motion degrades the recognition performance, because people tend to stare at the hand or object that they're gesturing with - then "Compensating the Head Motion" will reduce all hand motion. Please note that this setting affects how gestures are recorded – it is not possible to change this after the gesture sample has been recorded.</w:t>
+        <w:t>: This setting can be used when your player is moving or turning while gesturing. It will record the controller position relative to the current headset position and rotation. Usually though, compensating the head motion degrades the recognition performance, because people tend to stare at the hand or object that they're gesturing with - then "Compensating the Head Motion" will reduce all hand motion. This setting affects how gestures are recorded – it is not possible to change this after the gesture sample has been recorded. Please note that activating the "compensate head motion" option is likely to result in lower recognition scores and lower similarity values for identified gestures. This is because people tend to look at their hands when gesturing. Imagine making a "swipe-left" gesture and a "swipe-right" gesture. If you don't compensate head motion, they are easy to distinguish. But if you look at your hands while making the gesture and compensate for that head motion, then all that MiVRy gets is that your hand stays in front of your face. Then it's difficult to distinguish whether you swiped left or right.</w:t>
       </w:r>
     </w:p>
     <w:p>
@@ -4843,12 +4826,223 @@
         <w:spacing w:before="0" w:after="0"/>
         <w:rPr/>
       </w:pPr>
-      <w:bookmarkStart w:id="11" w:name="BuildInstructionsWindows"/>
-      <w:r>
-        <w:rPr/>
-        <w:t>10: Build instructions for Windows</w:t>
-      </w:r>
+      <w:bookmarkStart w:id="11" w:name="_toc299"/>
       <w:bookmarkEnd w:id="11"/>
+      <w:r>
+        <w:rPr/>
+        <w:t>10. Special Applications</w:t>
+      </w:r>
+    </w:p>
+    <w:p>
+      <w:pPr>
+        <w:pStyle w:val="Normal"/>
+        <w:spacing w:before="0" w:after="0"/>
+        <w:rPr/>
+      </w:pPr>
+      <w:r>
+        <w:rPr/>
+      </w:r>
+    </w:p>
+    <w:p>
+      <w:pPr>
+        <w:pStyle w:val="Normal"/>
+        <w:spacing w:before="0" w:after="0"/>
+        <w:rPr>
+          <w:b/>
+          <w:bCs/>
+        </w:rPr>
+      </w:pPr>
+      <w:r>
+        <w:rPr>
+          <w:b/>
+          <w:bCs/>
+        </w:rPr>
+        <w:t>(1) Identifying gestures while walking in the real world:</w:t>
+      </w:r>
+    </w:p>
+    <w:p>
+      <w:pPr>
+        <w:pStyle w:val="Normal"/>
+        <w:spacing w:before="0" w:after="0"/>
+        <w:rPr/>
+      </w:pPr>
+      <w:r>
+        <w:rPr/>
+        <w:t>If you want to identify a gesture while changing your position or orientation in the real world, it can help to activate the "Compensate Head Motion" option of MiVRy.</w:t>
+      </w:r>
+    </w:p>
+    <w:p>
+      <w:pPr>
+        <w:pStyle w:val="Normal"/>
+        <w:spacing w:before="0" w:after="0"/>
+        <w:rPr/>
+      </w:pPr>
+      <w:r>
+        <w:rPr/>
+        <w:t>This will cause MiVRy to record the controller position relative to the current headset position and rotation.</w:t>
+      </w:r>
+    </w:p>
+    <w:p>
+      <w:pPr>
+        <w:pStyle w:val="Normal"/>
+        <w:spacing w:before="0" w:after="0"/>
+        <w:rPr/>
+      </w:pPr>
+      <w:r>
+        <w:rPr/>
+        <w:t>In the Gesture Manager this can be activates in the Menu below the Recording Submenu under "Compensate Head Motion".</w:t>
+      </w:r>
+    </w:p>
+    <w:p>
+      <w:pPr>
+        <w:pStyle w:val="Normal"/>
+        <w:spacing w:before="0" w:after="0"/>
+        <w:rPr/>
+      </w:pPr>
+      <w:r>
+        <w:rPr/>
+        <w:t>In the Mivry.cs component offers the setting "compensateHeadMotion".</w:t>
+      </w:r>
+    </w:p>
+    <w:p>
+      <w:pPr>
+        <w:pStyle w:val="Normal"/>
+        <w:spacing w:before="0" w:after="0"/>
+        <w:rPr/>
+      </w:pPr>
+      <w:r>
+        <w:rPr/>
+        <w:t>Please note that activating the "compensate head motion" option is likely to result in lower recognition scores and lower similarity values for identified gestures. This is because people tend to look at their hands when gesturing. Imagine making a "swipe-left" gesture and a "swipe-right" gesture. If you don't compensate head motion, they are easy to distinguish. But if you look at your hands while making the gesture and compensate for that head motion, then all that MiVRy gets is that your hand stays in front of your face. Then it's difficult to distinguish whether you swiped left or right.</w:t>
+      </w:r>
+    </w:p>
+    <w:p>
+      <w:pPr>
+        <w:pStyle w:val="Normal"/>
+        <w:spacing w:before="0" w:after="0"/>
+        <w:rPr/>
+      </w:pPr>
+      <w:r>
+        <w:rPr/>
+      </w:r>
+    </w:p>
+    <w:p>
+      <w:pPr>
+        <w:pStyle w:val="Normal"/>
+        <w:spacing w:before="0" w:after="0"/>
+        <w:rPr>
+          <w:b/>
+          <w:bCs/>
+        </w:rPr>
+      </w:pPr>
+      <w:r>
+        <w:rPr>
+          <w:b/>
+          <w:bCs/>
+        </w:rPr>
+        <w:t>(2) Continuous gesture identification</w:t>
+      </w:r>
+    </w:p>
+    <w:p>
+      <w:pPr>
+        <w:pStyle w:val="Normal"/>
+        <w:spacing w:before="0" w:after="0"/>
+        <w:rPr/>
+      </w:pPr>
+      <w:r>
+        <w:rPr/>
+      </w:r>
+    </w:p>
+    <w:p>
+      <w:pPr>
+        <w:pStyle w:val="Normal"/>
+        <w:spacing w:before="0" w:after="0"/>
+        <w:rPr/>
+      </w:pPr>
+      <w:r>
+        <w:rPr/>
+        <w:t>If you don't want to explicity define the beginning and end of a gesture motion (e.g. with a trigger button), you can use MiVRy to continously try to identify ongoing gesture motions while they are in the process.</w:t>
+      </w:r>
+    </w:p>
+    <w:p>
+      <w:pPr>
+        <w:pStyle w:val="Normal"/>
+        <w:spacing w:before="0" w:after="0"/>
+        <w:rPr/>
+      </w:pPr>
+      <w:r>
+        <w:rPr/>
+        <w:t>In the `Mivry.cs` script component, this can be activated with the `ContinuousGestureRecognition` option.</w:t>
+      </w:r>
+    </w:p>
+    <w:p>
+      <w:pPr>
+        <w:pStyle w:val="Normal"/>
+        <w:spacing w:before="0" w:after="0"/>
+        <w:rPr/>
+      </w:pPr>
+      <w:r>
+        <w:rPr/>
+        <w:t>Please note that you still need to define a trigger to start/stop the overall identification process. Between the start and stop indicated by the trigger, MiVRy will continously try to identify the gesture motion. However, can set the trigger to an absolute value higher than the threshold instead of using some user input - then MiVRy will start immediately when the level is started.</w:t>
+      </w:r>
+    </w:p>
+    <w:p>
+      <w:pPr>
+        <w:pStyle w:val="Normal"/>
+        <w:spacing w:before="0" w:after="0"/>
+        <w:rPr/>
+      </w:pPr>
+      <w:r>
+        <w:rPr/>
+        <w:t>To do this with the `GestureRecognition` or `GestureCombinations` objects directly, you still have to call “startStroke” once (for example at the start of the level), and then you still have to continuously provide the controller position with the “contdStroke” function.</w:t>
+      </w:r>
+    </w:p>
+    <w:p>
+      <w:pPr>
+        <w:pStyle w:val="Normal"/>
+        <w:spacing w:before="0" w:after="0"/>
+        <w:rPr/>
+      </w:pPr>
+      <w:r>
+        <w:rPr/>
+        <w:t>After each call to the “contdStroke” function, you can use the “contdIdentify” function to identify the currently performed gesture. Use the contdIdentificationPeriod value to control how long of a time frame to consider in the identification. You can also use contdIdentificationSmoothing to avoid the identification result from jumping from one gesture ID to another too easily. For recording continuous gestures, you can use the "contdRecord" function, which should also be called after each call to "contdStroke" during recording. You don't need to call "endStroke" until you're finishing your gesture recording or identification session.</w:t>
+      </w:r>
+    </w:p>
+    <w:p>
+      <w:pPr>
+        <w:pStyle w:val="Normal"/>
+        <w:spacing w:before="0" w:after="0"/>
+        <w:rPr/>
+      </w:pPr>
+      <w:r>
+        <w:rPr/>
+        <w:t>Check the settings for `ContinuousGesturePeriod` and `ContinuousGestureSmoothing` to specify details regarding the continuous gesture identification.</w:t>
+      </w:r>
+      <w:r>
+        <w:br w:type="page"/>
+      </w:r>
+    </w:p>
+    <w:p>
+      <w:pPr>
+        <w:pStyle w:val="Normal"/>
+        <w:spacing w:before="0" w:after="0"/>
+        <w:rPr/>
+      </w:pPr>
+      <w:r>
+        <w:rPr/>
+      </w:r>
+    </w:p>
+    <w:p>
+      <w:pPr>
+        <w:pStyle w:val="Heading2"/>
+        <w:spacing w:before="0" w:after="0"/>
+        <w:rPr/>
+      </w:pPr>
+      <w:bookmarkStart w:id="12" w:name="BuildInstructionsWindows"/>
+      <w:r>
+        <w:rPr/>
+        <w:t>11: Build instructions for Windows</w:t>
+      </w:r>
+      <w:bookmarkEnd w:id="12"/>
     </w:p>
     <w:p>
       <w:pPr>
@@ -4974,12 +5168,12 @@
         <w:spacing w:before="0" w:after="0"/>
         <w:rPr/>
       </w:pPr>
-      <w:bookmarkStart w:id="12" w:name="BuildinstructionsAndroid"/>
-      <w:r>
-        <w:rPr/>
-        <w:t>11: Build instructions for Android (Mobile VR, Oculus Quest, …)</w:t>
-      </w:r>
-      <w:bookmarkEnd w:id="12"/>
+      <w:bookmarkStart w:id="13" w:name="BuildinstructionsAndroid"/>
+      <w:r>
+        <w:rPr/>
+        <w:t>12: Build instructions for Android (Mobile VR, Oculus Quest, …)</w:t>
+      </w:r>
+      <w:bookmarkEnd w:id="13"/>
     </w:p>
     <w:p>
       <w:pPr>
@@ -5214,12 +5408,12 @@
         <w:spacing w:before="0" w:after="0"/>
         <w:rPr/>
       </w:pPr>
-      <w:bookmarkStart w:id="13" w:name="TroubleshootingFAQ"/>
-      <w:r>
-        <w:rPr/>
-        <w:t>12 Troubleshooting and Frequently Asked Questions (FAQ):</w:t>
-      </w:r>
-      <w:bookmarkEnd w:id="13"/>
+      <w:bookmarkStart w:id="14" w:name="TroubleshootingFAQ"/>
+      <w:r>
+        <w:rPr/>
+        <w:t>13 Troubleshooting and Frequently Asked Questions (FAQ):</w:t>
+      </w:r>
+      <w:bookmarkEnd w:id="14"/>
       <w:r>
         <w:rPr/>
         <w:br/>
@@ -6121,6 +6315,541 @@
         <w:rPr/>
         <w:t>Create a new Input Action Asset (right-click in the Project explorer -&gt; create -&gt; input action) or use one you already have. Open it and add the Action and Binding that you want to use. Save the Input Action Asset. In the Project explorer, right-click on the Input Action Asset and select "Show in Explorer". Open the ".inputactions" file in a text editor and look for the "path" entry of your Binding.</w:t>
       </w:r>
+    </w:p>
+    <w:p>
+      <w:pPr>
+        <w:pStyle w:val="ListParagraph"/>
+        <w:rPr/>
+      </w:pPr>
+      <w:r>
+        <w:rPr/>
+      </w:r>
+    </w:p>
+    <w:p>
+      <w:pPr>
+        <w:pStyle w:val="ListParagraph"/>
+        <w:rPr/>
+      </w:pPr>
+      <w:r>
+        <w:rPr/>
+      </w:r>
+    </w:p>
+    <w:p>
+      <w:pPr>
+        <w:pStyle w:val="ListParagraph"/>
+        <w:rPr>
+          <w:b/>
+          <w:bCs/>
+        </w:rPr>
+      </w:pPr>
+      <w:r>
+        <w:rPr>
+          <w:b/>
+          <w:bCs/>
+        </w:rPr>
+        <w:t>(16) I'm getting return value / error code "-1" when trying to identify a gesture.</w:t>
+      </w:r>
+    </w:p>
+    <w:p>
+      <w:pPr>
+        <w:pStyle w:val="ListParagraph"/>
+        <w:rPr/>
+      </w:pPr>
+      <w:r>
+        <w:rPr/>
+      </w:r>
+    </w:p>
+    <w:p>
+      <w:pPr>
+        <w:pStyle w:val="ListParagraph"/>
+        <w:rPr/>
+      </w:pPr>
+      <w:r>
+        <w:rPr/>
+        <w:t>The value "-1" indicates that Mivry doesn't know of any gestures to which it could compare your current gesture motion to. For example if you performed a one-handed gesture motion but Mivry has only been trained on two-handed gestures, or has not been trained at all. There are three common causes:</w:t>
+      </w:r>
+    </w:p>
+    <w:p>
+      <w:pPr>
+        <w:pStyle w:val="ListParagraph"/>
+        <w:rPr/>
+      </w:pPr>
+      <w:r>
+        <w:rPr/>
+        <w:t>(1) Make sure that your gesture database file was loaded successfully. Check the log if there are any MiVRy error message about failing to load your gesture database file.</w:t>
+      </w:r>
+    </w:p>
+    <w:p>
+      <w:pPr>
+        <w:pStyle w:val="ListParagraph"/>
+        <w:rPr/>
+      </w:pPr>
+      <w:r>
+        <w:rPr/>
+        <w:t>(2) If you are using two-handed gestures (combinations), make sure that both triggers (for your left and right hand) are working and that you engage both of them at the same time.</w:t>
+      </w:r>
+    </w:p>
+    <w:p>
+      <w:pPr>
+        <w:pStyle w:val="ListParagraph"/>
+        <w:rPr/>
+      </w:pPr>
+      <w:r>
+        <w:rPr/>
+        <w:t>(3) Make sure that you perfomed training after recording gestures as samples.</w:t>
+      </w:r>
+    </w:p>
+    <w:p>
+      <w:pPr>
+        <w:pStyle w:val="ListParagraph"/>
+        <w:rPr/>
+      </w:pPr>
+      <w:r>
+        <w:rPr/>
+      </w:r>
+    </w:p>
+    <w:p>
+      <w:pPr>
+        <w:pStyle w:val="ListParagraph"/>
+        <w:rPr/>
+      </w:pPr>
+      <w:r>
+        <w:rPr/>
+      </w:r>
+    </w:p>
+    <w:p>
+      <w:pPr>
+        <w:pStyle w:val="ListParagraph"/>
+        <w:rPr>
+          <w:b/>
+          <w:bCs/>
+        </w:rPr>
+      </w:pPr>
+      <w:r>
+        <w:rPr>
+          <w:b/>
+          <w:bCs/>
+        </w:rPr>
+        <w:t>(17) MiVRy works when running in the Editor, but not when I run a Android/Quest build.</w:t>
+      </w:r>
+    </w:p>
+    <w:p>
+      <w:pPr>
+        <w:pStyle w:val="ListParagraph"/>
+        <w:rPr/>
+      </w:pPr>
+      <w:r>
+        <w:rPr/>
+      </w:r>
+    </w:p>
+    <w:p>
+      <w:pPr>
+        <w:pStyle w:val="ListParagraph"/>
+        <w:rPr/>
+      </w:pPr>
+      <w:r>
+        <w:rPr/>
+        <w:t>Most likely your gesture database file (.DAT file) is not loaded when running on Android / the Quest. In the Editor, Unity will look for the file in your "Assets" folder, when you build for Android/Meta Quest, Unity will use the "StreamingAssets" folder, so the file needs to be in both folders.</w:t>
+      </w:r>
+    </w:p>
+    <w:p>
+      <w:pPr>
+        <w:pStyle w:val="ListParagraph"/>
+        <w:rPr/>
+      </w:pPr>
+      <w:r>
+        <w:rPr/>
+        <w:t>If you're not using the Mivry.cs script component but instead are loading the gesture database file manually via GestureRecognition.cs or GestureCombinations.cs scrips, you have to "download" the DAT file from storage to access it. Check the code of Mivry.cs as a reference on how to load the DAT file:</w:t>
+      </w:r>
+    </w:p>
+    <w:p>
+      <w:pPr>
+        <w:pStyle w:val="ListParagraph"/>
+        <w:rPr/>
+      </w:pPr>
+      <w:r>
+        <w:fldChar w:fldCharType="begin"/>
+      </w:r>
+      <w:r>
+        <w:rPr>
+          <w:rStyle w:val="Hyperlink"/>
+        </w:rPr>
+        <w:instrText xml:space="preserve"> HYPERLINK "https://github.com/MARUI-PlugIn/MiVRy/blob/eb90c6794e1bc51d1fad771d9ae02a7ac27f7f9f/unity/Mivry.cs" \l "L551"</w:instrText>
+      </w:r>
+      <w:r>
+        <w:rPr>
+          <w:rStyle w:val="Hyperlink"/>
+        </w:rPr>
+        <w:fldChar w:fldCharType="separate"/>
+      </w:r>
+      <w:r>
+        <w:rPr>
+          <w:rStyle w:val="Hyperlink"/>
+        </w:rPr>
+        <w:t>https://github.com/MARUI-PlugIn/MiVRy/blob/eb90c6794e1bc51d1fad771d9ae02a7ac27f7f9f/unity/Mivry.cs#L551</w:t>
+      </w:r>
+      <w:r>
+        <w:rPr>
+          <w:rStyle w:val="Hyperlink"/>
+        </w:rPr>
+        <w:fldChar w:fldCharType="end"/>
+      </w:r>
+    </w:p>
+    <w:p>
+      <w:pPr>
+        <w:pStyle w:val="ListParagraph"/>
+        <w:rPr/>
+      </w:pPr>
+      <w:r>
+        <w:rPr/>
+      </w:r>
+    </w:p>
+    <w:p>
+      <w:pPr>
+        <w:pStyle w:val="ListParagraph"/>
+        <w:rPr/>
+      </w:pPr>
+      <w:r>
+        <w:rPr/>
+      </w:r>
+    </w:p>
+    <w:p>
+      <w:pPr>
+        <w:pStyle w:val="ListParagraph"/>
+        <w:rPr>
+          <w:b/>
+          <w:bCs/>
+        </w:rPr>
+      </w:pPr>
+      <w:r>
+        <w:rPr>
+          <w:b/>
+          <w:bCs/>
+        </w:rPr>
+        <w:t>(18) I have a lot of gestures in my database file and the recognition performance is not so good anymore. Is there a way to limit the gestures without having to record new database files?</w:t>
+      </w:r>
+    </w:p>
+    <w:p>
+      <w:pPr>
+        <w:pStyle w:val="ListParagraph"/>
+        <w:rPr/>
+      </w:pPr>
+      <w:r>
+        <w:rPr/>
+      </w:r>
+    </w:p>
+    <w:p>
+      <w:pPr>
+        <w:pStyle w:val="ListParagraph"/>
+        <w:rPr/>
+      </w:pPr>
+      <w:r>
+        <w:rPr/>
+        <w:t>You can use the "setGestureEnabled" function to limit the gestures to which MiVRy compares the current motion and increase the recognition performance. You can do this at run-time in your app, for example to offer different gestures in different levels. There are, however, two caveats:</w:t>
+      </w:r>
+    </w:p>
+    <w:p>
+      <w:pPr>
+        <w:pStyle w:val="ListParagraph"/>
+        <w:rPr/>
+      </w:pPr>
+      <w:r>
+        <w:rPr/>
+        <w:t>(1) it disables the gesture (per one hand), not the combination (ie two-handed gesture). So if you have a combination "clap hands" which consists of the gestures "clap left hand" and "clap right hand", then you disable "clap left hand" and "clap right hand". This also means that if another gesture combination other than "clap hands" would use either "clap left hand" or "clap right hand", this other gesture combination would also be affected by disabling the gestures.</w:t>
+      </w:r>
+    </w:p>
+    <w:p>
+      <w:pPr>
+        <w:pStyle w:val="ListParagraph"/>
+        <w:rPr/>
+      </w:pPr>
+      <w:r>
+        <w:rPr/>
+        <w:t>(2) enabling/disabling gestures works by omitting these gestures during training.</w:t>
+      </w:r>
+    </w:p>
+    <w:p>
+      <w:pPr>
+        <w:pStyle w:val="ListParagraph"/>
+        <w:rPr/>
+      </w:pPr>
+      <w:r>
+        <w:rPr/>
+        <w:t>So after disabling the gestures, you need to run training again. After training, you can save a new copy of your gesture database file - the enabled/disabled gestures are saved in the database file.</w:t>
+      </w:r>
+    </w:p>
+    <w:p>
+      <w:pPr>
+        <w:pStyle w:val="ListParagraph"/>
+        <w:rPr/>
+      </w:pPr>
+      <w:r>
+        <w:rPr/>
+        <w:t>Example code for disabling the gestures (parts) of a combination:</w:t>
+      </w:r>
+    </w:p>
+    <w:p>
+      <w:pPr>
+        <w:pStyle w:val="ListParagraph"/>
+        <w:rPr/>
+      </w:pPr>
+      <w:r>
+        <w:rPr/>
+      </w:r>
+    </w:p>
+    <w:p>
+      <w:pPr>
+        <w:pStyle w:val="ListParagraph"/>
+        <w:rPr>
+          <w:rFonts w:ascii="Cascadia Code" w:hAnsi="Cascadia Code"/>
+          <w:sz w:val="14"/>
+          <w:szCs w:val="14"/>
+        </w:rPr>
+      </w:pPr>
+      <w:r>
+        <w:rPr>
+          <w:rFonts w:ascii="Cascadia Code" w:hAnsi="Cascadia Code"/>
+          <w:sz w:val="14"/>
+          <w:szCs w:val="14"/>
+        </w:rPr>
+        <w:t>```</w:t>
+      </w:r>
+    </w:p>
+    <w:p>
+      <w:pPr>
+        <w:pStyle w:val="ListParagraph"/>
+        <w:rPr>
+          <w:rFonts w:ascii="Cascadia Code" w:hAnsi="Cascadia Code"/>
+          <w:sz w:val="14"/>
+          <w:szCs w:val="14"/>
+        </w:rPr>
+      </w:pPr>
+      <w:r>
+        <w:rPr>
+          <w:rFonts w:ascii="Cascadia Code" w:hAnsi="Cascadia Code"/>
+          <w:sz w:val="14"/>
+          <w:szCs w:val="14"/>
+        </w:rPr>
+        <w:t>for (int combination = gc.numberOfGestureCombinations()-1; combination &gt;=0; combination--) {</w:t>
+      </w:r>
+    </w:p>
+    <w:p>
+      <w:pPr>
+        <w:pStyle w:val="ListParagraph"/>
+        <w:rPr>
+          <w:rFonts w:ascii="Cascadia Code" w:hAnsi="Cascadia Code"/>
+          <w:sz w:val="14"/>
+          <w:szCs w:val="14"/>
+        </w:rPr>
+      </w:pPr>
+      <w:r>
+        <w:rPr>
+          <w:rFonts w:ascii="Cascadia Code" w:hAnsi="Cascadia Code"/>
+          <w:sz w:val="14"/>
+          <w:szCs w:val="14"/>
+        </w:rPr>
+        <w:t xml:space="preserve">    </w:t>
+      </w:r>
+      <w:r>
+        <w:rPr>
+          <w:rFonts w:ascii="Cascadia Code" w:hAnsi="Cascadia Code"/>
+          <w:sz w:val="14"/>
+          <w:szCs w:val="14"/>
+        </w:rPr>
+        <w:t>bool enabled = enabledCombinations.Contains(combination);</w:t>
+      </w:r>
+    </w:p>
+    <w:p>
+      <w:pPr>
+        <w:pStyle w:val="ListParagraph"/>
+        <w:rPr>
+          <w:rFonts w:ascii="Cascadia Code" w:hAnsi="Cascadia Code"/>
+          <w:sz w:val="14"/>
+          <w:szCs w:val="14"/>
+        </w:rPr>
+      </w:pPr>
+      <w:r>
+        <w:rPr>
+          <w:rFonts w:ascii="Cascadia Code" w:hAnsi="Cascadia Code"/>
+          <w:sz w:val="14"/>
+          <w:szCs w:val="14"/>
+        </w:rPr>
+        <w:t xml:space="preserve">    </w:t>
+      </w:r>
+      <w:r>
+        <w:rPr>
+          <w:rFonts w:ascii="Cascadia Code" w:hAnsi="Cascadia Code"/>
+          <w:sz w:val="14"/>
+          <w:szCs w:val="14"/>
+        </w:rPr>
+        <w:t>int leftHandGesture = gc.getCombinationPartGesture(combination, 0);</w:t>
+      </w:r>
+    </w:p>
+    <w:p>
+      <w:pPr>
+        <w:pStyle w:val="ListParagraph"/>
+        <w:rPr>
+          <w:rFonts w:ascii="Cascadia Code" w:hAnsi="Cascadia Code"/>
+          <w:sz w:val="14"/>
+          <w:szCs w:val="14"/>
+        </w:rPr>
+      </w:pPr>
+      <w:r>
+        <w:rPr>
+          <w:rFonts w:ascii="Cascadia Code" w:hAnsi="Cascadia Code"/>
+          <w:sz w:val="14"/>
+          <w:szCs w:val="14"/>
+        </w:rPr>
+        <w:t xml:space="preserve">    </w:t>
+      </w:r>
+      <w:r>
+        <w:rPr>
+          <w:rFonts w:ascii="Cascadia Code" w:hAnsi="Cascadia Code"/>
+          <w:sz w:val="14"/>
+          <w:szCs w:val="14"/>
+        </w:rPr>
+        <w:t>int rightHandGesture = gc.getCombinationPartGesture(combination, 0);</w:t>
+      </w:r>
+    </w:p>
+    <w:p>
+      <w:pPr>
+        <w:pStyle w:val="ListParagraph"/>
+        <w:rPr>
+          <w:rFonts w:ascii="Cascadia Code" w:hAnsi="Cascadia Code"/>
+          <w:sz w:val="14"/>
+          <w:szCs w:val="14"/>
+        </w:rPr>
+      </w:pPr>
+      <w:r>
+        <w:rPr>
+          <w:rFonts w:ascii="Cascadia Code" w:hAnsi="Cascadia Code"/>
+          <w:sz w:val="14"/>
+          <w:szCs w:val="14"/>
+        </w:rPr>
+        <w:t xml:space="preserve">    </w:t>
+      </w:r>
+      <w:r>
+        <w:rPr>
+          <w:rFonts w:ascii="Cascadia Code" w:hAnsi="Cascadia Code"/>
+          <w:sz w:val="14"/>
+          <w:szCs w:val="14"/>
+        </w:rPr>
+        <w:t>gc.setGestureEnabled(0, leftHandGesture , enabled);</w:t>
+      </w:r>
+    </w:p>
+    <w:p>
+      <w:pPr>
+        <w:pStyle w:val="ListParagraph"/>
+        <w:rPr>
+          <w:rFonts w:ascii="Cascadia Code" w:hAnsi="Cascadia Code"/>
+          <w:sz w:val="14"/>
+          <w:szCs w:val="14"/>
+        </w:rPr>
+      </w:pPr>
+      <w:r>
+        <w:rPr>
+          <w:rFonts w:ascii="Cascadia Code" w:hAnsi="Cascadia Code"/>
+          <w:sz w:val="14"/>
+          <w:szCs w:val="14"/>
+        </w:rPr>
+        <w:t xml:space="preserve">    </w:t>
+      </w:r>
+      <w:r>
+        <w:rPr>
+          <w:rFonts w:ascii="Cascadia Code" w:hAnsi="Cascadia Code"/>
+          <w:sz w:val="14"/>
+          <w:szCs w:val="14"/>
+        </w:rPr>
+        <w:t>gc.setGestureEnabled(1, rightHandGesture , enabled);</w:t>
+      </w:r>
+    </w:p>
+    <w:p>
+      <w:pPr>
+        <w:pStyle w:val="ListParagraph"/>
+        <w:rPr>
+          <w:rFonts w:ascii="Cascadia Code" w:hAnsi="Cascadia Code"/>
+          <w:sz w:val="14"/>
+          <w:szCs w:val="14"/>
+        </w:rPr>
+      </w:pPr>
+      <w:r>
+        <w:rPr>
+          <w:rFonts w:ascii="Cascadia Code" w:hAnsi="Cascadia Code"/>
+          <w:sz w:val="14"/>
+          <w:szCs w:val="14"/>
+        </w:rPr>
+        <w:t>}</w:t>
+      </w:r>
+    </w:p>
+    <w:p>
+      <w:pPr>
+        <w:pStyle w:val="ListParagraph"/>
+        <w:rPr>
+          <w:rFonts w:ascii="Cascadia Code" w:hAnsi="Cascadia Code"/>
+          <w:sz w:val="14"/>
+          <w:szCs w:val="14"/>
+        </w:rPr>
+      </w:pPr>
+      <w:r>
+        <w:rPr>
+          <w:rFonts w:ascii="Cascadia Code" w:hAnsi="Cascadia Code"/>
+          <w:sz w:val="14"/>
+          <w:szCs w:val="14"/>
+        </w:rPr>
+        <w:t xml:space="preserve">gc.startTraining(); </w:t>
+      </w:r>
+    </w:p>
+    <w:p>
+      <w:pPr>
+        <w:pStyle w:val="ListParagraph"/>
+        <w:rPr>
+          <w:rFonts w:ascii="Cascadia Code" w:hAnsi="Cascadia Code"/>
+          <w:sz w:val="14"/>
+          <w:szCs w:val="14"/>
+        </w:rPr>
+      </w:pPr>
+      <w:r>
+        <w:rPr>
+          <w:rFonts w:ascii="Cascadia Code" w:hAnsi="Cascadia Code"/>
+          <w:sz w:val="14"/>
+          <w:szCs w:val="14"/>
+        </w:rPr>
+        <w:t>```</w:t>
+      </w:r>
+    </w:p>
+    <w:p>
+      <w:pPr>
+        <w:pStyle w:val="ListParagraph"/>
+        <w:rPr>
+          <w:rFonts w:ascii="Cascadia Code" w:hAnsi="Cascadia Code"/>
+          <w:sz w:val="14"/>
+          <w:szCs w:val="14"/>
+        </w:rPr>
+      </w:pPr>
+      <w:r>
+        <w:rPr>
+          <w:rFonts w:ascii="Cascadia Code" w:hAnsi="Cascadia Code"/>
+          <w:sz w:val="14"/>
+          <w:szCs w:val="14"/>
+        </w:rPr>
+      </w:r>
+    </w:p>
+    <w:p>
+      <w:pPr>
+        <w:pStyle w:val="ListParagraph"/>
+        <w:rPr>
+          <w:rFonts w:ascii="Cascadia Code" w:hAnsi="Cascadia Code"/>
+          <w:sz w:val="14"/>
+          <w:szCs w:val="14"/>
+        </w:rPr>
+      </w:pPr>
+      <w:r>
+        <w:rPr>
+          <w:rFonts w:ascii="Cascadia Code" w:hAnsi="Cascadia Code"/>
+          <w:sz w:val="14"/>
+          <w:szCs w:val="14"/>
+        </w:rPr>
+      </w:r>
       <w:r>
         <w:br w:type="page"/>
       </w:r>
@@ -6131,12 +6860,12 @@
         <w:spacing w:before="0" w:after="0"/>
         <w:rPr/>
       </w:pPr>
-      <w:bookmarkStart w:id="14" w:name="EULA"/>
-      <w:r>
-        <w:rPr/>
-        <w:t>13 Software license statement (EULA):</w:t>
-      </w:r>
-      <w:bookmarkEnd w:id="14"/>
+      <w:bookmarkStart w:id="15" w:name="EULA"/>
+      <w:r>
+        <w:rPr/>
+        <w:t>14 Software license statement (EULA):</w:t>
+      </w:r>
+      <w:bookmarkEnd w:id="15"/>
     </w:p>
     <w:p>
       <w:pPr>
@@ -7072,6 +7801,19 @@
     </w:pPr>
     <w:rPr/>
   </w:style>
+  <w:style w:type="paragraph" w:styleId="PreformattedText">
+    <w:name w:val="Preformatted Text"/>
+    <w:basedOn w:val="Normal"/>
+    <w:qFormat/>
+    <w:pPr>
+      <w:spacing w:before="0" w:after="0"/>
+    </w:pPr>
+    <w:rPr>
+      <w:rFonts w:ascii="Courier New" w:hAnsi="Courier New" w:eastAsia="MS Gothic" w:cs="Courier New"/>
+      <w:sz w:val="20"/>
+      <w:szCs w:val="20"/>
+    </w:rPr>
+  </w:style>
   <w:style w:type="numbering" w:styleId="NoList" w:default="1">
     <w:name w:val="No List"/>
     <w:uiPriority w:val="99"/>

</xml_diff>

<commit_message>
Updated to version v2.14.
</commit_message>
<xml_diff>
--- a/unity/Documentation.docx
+++ b/unity/Documentation.docx
@@ -107,7 +107,7 @@
           <w:sz w:val="32"/>
           <w:szCs w:val="32"/>
         </w:rPr>
-        <w:t>3</w:t>
+        <w:t>4</w:t>
       </w:r>
     </w:p>
     <w:p>
@@ -697,7 +697,7 @@
         </w:rPr>
         <w:t xml:space="preserve">4: </w:t>
       </w:r>
-      <w:hyperlink w:anchor="_4%25252525253A_Licensing_and">
+      <w:hyperlink w:anchor="_4%2525252525253A_Licensing_and">
         <w:r>
           <w:rPr>
             <w:rStyle w:val="Hyperlink"/>
@@ -2845,7 +2845,7 @@
         <w:spacing w:before="0" w:after="0"/>
         <w:rPr/>
       </w:pPr>
-      <w:bookmarkStart w:id="4" w:name="_4%25252525253A_Licensing_and"/>
+      <w:bookmarkStart w:id="4" w:name="_4%2525252525253A_Licensing_and"/>
       <w:bookmarkEnd w:id="4"/>
       <w:r>
         <w:rPr/>
@@ -6838,17 +6838,975 @@
       <w:pPr>
         <w:pStyle w:val="ListParagraph"/>
         <w:rPr>
-          <w:rFonts w:ascii="Cascadia Code" w:hAnsi="Cascadia Code"/>
-          <w:sz w:val="14"/>
-          <w:szCs w:val="14"/>
-        </w:rPr>
-      </w:pPr>
-      <w:r>
-        <w:rPr>
-          <w:rFonts w:ascii="Cascadia Code" w:hAnsi="Cascadia Code"/>
-          <w:sz w:val="14"/>
-          <w:szCs w:val="14"/>
-        </w:rPr>
+          <w:b/>
+          <w:bCs/>
+        </w:rPr>
+      </w:pPr>
+      <w:r>
+        <w:rPr>
+          <w:b/>
+          <w:bCs/>
+        </w:rPr>
+        <w:t>(1</w:t>
+      </w:r>
+      <w:r>
+        <w:rPr>
+          <w:b/>
+          <w:bCs/>
+        </w:rPr>
+        <w:t>9</w:t>
+      </w:r>
+      <w:r>
+        <w:rPr>
+          <w:b/>
+          <w:bCs/>
+        </w:rPr>
+        <w:t xml:space="preserve">) </w:t>
+      </w:r>
+      <w:r>
+        <w:rPr>
+          <w:b/>
+          <w:bCs/>
+        </w:rPr>
+        <w:t>What are the “TrainingParameter”s which can be set</w:t>
+      </w:r>
+      <w:r>
+        <w:rPr>
+          <w:b/>
+          <w:bCs/>
+        </w:rPr>
+        <w:t>?</w:t>
+      </w:r>
+    </w:p>
+    <w:p>
+      <w:pPr>
+        <w:pStyle w:val="ListParagraph"/>
+        <w:rPr/>
+      </w:pPr>
+      <w:r>
+        <w:rPr/>
+      </w:r>
+    </w:p>
+    <w:p>
+      <w:pPr>
+        <w:pStyle w:val="ListParagraph"/>
+        <w:rPr>
+          <w:rFonts w:ascii="Cascadia Code" w:hAnsi="Cascadia Code"/>
+          <w:sz w:val="14"/>
+          <w:szCs w:val="14"/>
+        </w:rPr>
+      </w:pPr>
+      <w:r>
+        <w:rPr>
+          <w:rFonts w:ascii="Cascadia Code" w:hAnsi="Cascadia Code"/>
+          <w:sz w:val="14"/>
+          <w:szCs w:val="14"/>
+        </w:rPr>
+        <w:t>The `setTrainingParameter` function allows you to define specific features of the AI training process. This is intended for advanced users to adust the training process for they specific requirements of their applications.</w:t>
+      </w:r>
+    </w:p>
+    <w:p>
+      <w:pPr>
+        <w:pStyle w:val="ListParagraph"/>
+        <w:rPr>
+          <w:rFonts w:ascii="Cascadia Code" w:hAnsi="Cascadia Code"/>
+          <w:sz w:val="14"/>
+          <w:szCs w:val="14"/>
+        </w:rPr>
+      </w:pPr>
+      <w:r>
+        <w:rPr>
+          <w:rFonts w:ascii="Cascadia Code" w:hAnsi="Cascadia Code"/>
+          <w:sz w:val="14"/>
+          <w:szCs w:val="14"/>
+        </w:rPr>
+        <w:t>The default for each parameter is "-1", which is to interactively adjust this value based on the progress during training.</w:t>
+        <w:br/>
+        <w:t>The meaning of the individual parameters is as follows:</w:t>
+      </w:r>
+    </w:p>
+    <w:p>
+      <w:pPr>
+        <w:pStyle w:val="ListParagraph"/>
+        <w:rPr>
+          <w:rFonts w:ascii="Cascadia Code" w:hAnsi="Cascadia Code"/>
+          <w:i/>
+          <w:i/>
+          <w:iCs/>
+          <w:sz w:val="14"/>
+          <w:szCs w:val="14"/>
+        </w:rPr>
+      </w:pPr>
+      <w:r>
+        <w:rPr>
+          <w:rFonts w:ascii="Cascadia Code" w:hAnsi="Cascadia Code"/>
+          <w:i/>
+          <w:iCs/>
+          <w:sz w:val="14"/>
+          <w:szCs w:val="14"/>
+        </w:rPr>
+        <w:br/>
+        <w:t xml:space="preserve"> Lambda (ID: 0)</w:t>
+      </w:r>
+    </w:p>
+    <w:p>
+      <w:pPr>
+        <w:pStyle w:val="ListParagraph"/>
+        <w:rPr>
+          <w:rFonts w:ascii="Cascadia Code" w:hAnsi="Cascadia Code"/>
+          <w:sz w:val="14"/>
+          <w:szCs w:val="14"/>
+        </w:rPr>
+      </w:pPr>
+      <w:r>
+        <w:rPr>
+          <w:rFonts w:ascii="Cascadia Code" w:hAnsi="Cascadia Code"/>
+          <w:sz w:val="14"/>
+          <w:szCs w:val="14"/>
+        </w:rPr>
+        <w:t>The 'lambda' parameter which controls the "speed" at which the training is performed.</w:t>
+      </w:r>
+    </w:p>
+    <w:p>
+      <w:pPr>
+        <w:pStyle w:val="ListParagraph"/>
+        <w:rPr>
+          <w:rFonts w:ascii="Cascadia Code" w:hAnsi="Cascadia Code"/>
+          <w:sz w:val="14"/>
+          <w:szCs w:val="14"/>
+        </w:rPr>
+      </w:pPr>
+      <w:r>
+        <w:rPr>
+          <w:rFonts w:ascii="Cascadia Code" w:hAnsi="Cascadia Code"/>
+          <w:sz w:val="14"/>
+          <w:szCs w:val="14"/>
+        </w:rPr>
+        <w:t>A higher value may speed up convergence to an optimal solution during training, but increases the risk of "derailing" ie not finding a good solution at all.</w:t>
+      </w:r>
+    </w:p>
+    <w:p>
+      <w:pPr>
+        <w:pStyle w:val="ListParagraph"/>
+        <w:rPr>
+          <w:rFonts w:ascii="Cascadia Code" w:hAnsi="Cascadia Code"/>
+          <w:sz w:val="14"/>
+          <w:szCs w:val="14"/>
+        </w:rPr>
+      </w:pPr>
+      <w:r>
+        <w:rPr>
+          <w:rFonts w:ascii="Cascadia Code" w:hAnsi="Cascadia Code"/>
+          <w:sz w:val="14"/>
+          <w:szCs w:val="14"/>
+        </w:rPr>
+      </w:r>
+    </w:p>
+    <w:p>
+      <w:pPr>
+        <w:pStyle w:val="ListParagraph"/>
+        <w:rPr>
+          <w:rFonts w:ascii="Cascadia Code" w:hAnsi="Cascadia Code"/>
+          <w:sz w:val="14"/>
+          <w:szCs w:val="14"/>
+        </w:rPr>
+      </w:pPr>
+      <w:r>
+        <w:rPr>
+          <w:rFonts w:ascii="Cascadia Code" w:hAnsi="Cascadia Code"/>
+          <w:sz w:val="14"/>
+          <w:szCs w:val="14"/>
+        </w:rPr>
+        <w:t xml:space="preserve"> </w:t>
+      </w:r>
+      <w:r>
+        <w:rPr>
+          <w:rFonts w:ascii="Cascadia Code" w:hAnsi="Cascadia Code"/>
+          <w:i/>
+          <w:iCs/>
+          <w:sz w:val="14"/>
+          <w:szCs w:val="14"/>
+        </w:rPr>
+        <w:t>NumberOfNodes (ID: 1)</w:t>
+      </w:r>
+    </w:p>
+    <w:p>
+      <w:pPr>
+        <w:pStyle w:val="ListParagraph"/>
+        <w:rPr>
+          <w:rFonts w:ascii="Cascadia Code" w:hAnsi="Cascadia Code"/>
+          <w:sz w:val="14"/>
+          <w:szCs w:val="14"/>
+        </w:rPr>
+      </w:pPr>
+      <w:r>
+        <w:rPr>
+          <w:rFonts w:ascii="Cascadia Code" w:hAnsi="Cascadia Code"/>
+          <w:sz w:val="14"/>
+          <w:szCs w:val="14"/>
+        </w:rPr>
+        <w:t>Sets the number of "neurons" (neural nodes) in each layer of the neural network.</w:t>
+      </w:r>
+    </w:p>
+    <w:p>
+      <w:pPr>
+        <w:pStyle w:val="ListParagraph"/>
+        <w:rPr>
+          <w:rFonts w:ascii="Cascadia Code" w:hAnsi="Cascadia Code"/>
+          <w:sz w:val="14"/>
+          <w:szCs w:val="14"/>
+        </w:rPr>
+      </w:pPr>
+      <w:r>
+        <w:rPr>
+          <w:rFonts w:ascii="Cascadia Code" w:hAnsi="Cascadia Code"/>
+          <w:sz w:val="14"/>
+          <w:szCs w:val="14"/>
+        </w:rPr>
+      </w:r>
+    </w:p>
+    <w:p>
+      <w:pPr>
+        <w:pStyle w:val="ListParagraph"/>
+        <w:rPr>
+          <w:rFonts w:ascii="Cascadia Code" w:hAnsi="Cascadia Code"/>
+          <w:sz w:val="14"/>
+          <w:szCs w:val="14"/>
+        </w:rPr>
+      </w:pPr>
+      <w:r>
+        <w:rPr>
+          <w:rFonts w:ascii="Cascadia Code" w:hAnsi="Cascadia Code"/>
+          <w:sz w:val="14"/>
+          <w:szCs w:val="14"/>
+        </w:rPr>
+        <w:t xml:space="preserve"> </w:t>
+      </w:r>
+      <w:r>
+        <w:rPr>
+          <w:rFonts w:ascii="Cascadia Code" w:hAnsi="Cascadia Code"/>
+          <w:i/>
+          <w:iCs/>
+          <w:sz w:val="14"/>
+          <w:szCs w:val="14"/>
+        </w:rPr>
+        <w:t>NumberOfLayers (ID: 2)</w:t>
+      </w:r>
+    </w:p>
+    <w:p>
+      <w:pPr>
+        <w:pStyle w:val="ListParagraph"/>
+        <w:rPr>
+          <w:rFonts w:ascii="Cascadia Code" w:hAnsi="Cascadia Code"/>
+          <w:sz w:val="14"/>
+          <w:szCs w:val="14"/>
+        </w:rPr>
+      </w:pPr>
+      <w:r>
+        <w:rPr>
+          <w:rFonts w:ascii="Cascadia Code" w:hAnsi="Cascadia Code"/>
+          <w:sz w:val="14"/>
+          <w:szCs w:val="14"/>
+        </w:rPr>
+        <w:t>Sets the number of layers in the neural network.</w:t>
+      </w:r>
+    </w:p>
+    <w:p>
+      <w:pPr>
+        <w:pStyle w:val="ListParagraph"/>
+        <w:rPr>
+          <w:rFonts w:ascii="Cascadia Code" w:hAnsi="Cascadia Code"/>
+          <w:sz w:val="14"/>
+          <w:szCs w:val="14"/>
+        </w:rPr>
+      </w:pPr>
+      <w:r>
+        <w:rPr>
+          <w:rFonts w:ascii="Cascadia Code" w:hAnsi="Cascadia Code"/>
+          <w:sz w:val="14"/>
+          <w:szCs w:val="14"/>
+        </w:rPr>
+      </w:r>
+    </w:p>
+    <w:p>
+      <w:pPr>
+        <w:pStyle w:val="ListParagraph"/>
+        <w:rPr>
+          <w:rFonts w:ascii="Cascadia Code" w:hAnsi="Cascadia Code"/>
+          <w:i/>
+          <w:i/>
+          <w:iCs/>
+          <w:sz w:val="14"/>
+          <w:szCs w:val="14"/>
+        </w:rPr>
+      </w:pPr>
+      <w:r>
+        <w:rPr>
+          <w:rFonts w:ascii="Cascadia Code" w:hAnsi="Cascadia Code"/>
+          <w:i/>
+          <w:iCs/>
+          <w:sz w:val="14"/>
+          <w:szCs w:val="14"/>
+        </w:rPr>
+        <w:t>SampleResolution (ID: 3)</w:t>
+      </w:r>
+    </w:p>
+    <w:p>
+      <w:pPr>
+        <w:pStyle w:val="ListParagraph"/>
+        <w:rPr>
+          <w:rFonts w:ascii="Cascadia Code" w:hAnsi="Cascadia Code"/>
+          <w:sz w:val="14"/>
+          <w:szCs w:val="14"/>
+        </w:rPr>
+      </w:pPr>
+      <w:r>
+        <w:rPr>
+          <w:rFonts w:ascii="Cascadia Code" w:hAnsi="Cascadia Code"/>
+          <w:sz w:val="14"/>
+          <w:szCs w:val="14"/>
+        </w:rPr>
+        <w:t>Sets the number of data points to use per sample (stroke).</w:t>
+      </w:r>
+    </w:p>
+    <w:p>
+      <w:pPr>
+        <w:pStyle w:val="ListParagraph"/>
+        <w:rPr>
+          <w:rFonts w:ascii="Cascadia Code" w:hAnsi="Cascadia Code"/>
+          <w:sz w:val="14"/>
+          <w:szCs w:val="14"/>
+        </w:rPr>
+      </w:pPr>
+      <w:r>
+        <w:rPr>
+          <w:rFonts w:ascii="Cascadia Code" w:hAnsi="Cascadia Code"/>
+          <w:sz w:val="14"/>
+          <w:szCs w:val="14"/>
+        </w:rPr>
+      </w:r>
+    </w:p>
+    <w:p>
+      <w:pPr>
+        <w:pStyle w:val="ListParagraph"/>
+        <w:rPr>
+          <w:rFonts w:ascii="Cascadia Code" w:hAnsi="Cascadia Code"/>
+          <w:i/>
+          <w:i/>
+          <w:iCs/>
+          <w:sz w:val="14"/>
+          <w:szCs w:val="14"/>
+        </w:rPr>
+      </w:pPr>
+      <w:r>
+        <w:rPr>
+          <w:rFonts w:ascii="Cascadia Code" w:hAnsi="Cascadia Code"/>
+          <w:i/>
+          <w:iCs/>
+          <w:sz w:val="14"/>
+          <w:szCs w:val="14"/>
+        </w:rPr>
+        <w:t xml:space="preserve"> </w:t>
+      </w:r>
+      <w:r>
+        <w:rPr>
+          <w:rFonts w:ascii="Cascadia Code" w:hAnsi="Cascadia Code"/>
+          <w:i/>
+          <w:iCs/>
+          <w:sz w:val="14"/>
+          <w:szCs w:val="14"/>
+        </w:rPr>
+        <w:t>ControllerRotation (ID: 4)</w:t>
+      </w:r>
+    </w:p>
+    <w:p>
+      <w:pPr>
+        <w:pStyle w:val="ListParagraph"/>
+        <w:rPr>
+          <w:rFonts w:ascii="Cascadia Code" w:hAnsi="Cascadia Code"/>
+          <w:sz w:val="14"/>
+          <w:szCs w:val="14"/>
+        </w:rPr>
+      </w:pPr>
+      <w:r>
+        <w:rPr>
+          <w:rFonts w:ascii="Cascadia Code" w:hAnsi="Cascadia Code"/>
+          <w:sz w:val="14"/>
+          <w:szCs w:val="14"/>
+        </w:rPr>
+        <w:t>Whether to use the orientation/rotation of the VR controller.</w:t>
+      </w:r>
+    </w:p>
+    <w:p>
+      <w:pPr>
+        <w:pStyle w:val="ListParagraph"/>
+        <w:rPr>
+          <w:rFonts w:ascii="Cascadia Code" w:hAnsi="Cascadia Code"/>
+          <w:sz w:val="14"/>
+          <w:szCs w:val="14"/>
+        </w:rPr>
+      </w:pPr>
+      <w:r>
+        <w:rPr>
+          <w:rFonts w:ascii="Cascadia Code" w:hAnsi="Cascadia Code"/>
+          <w:sz w:val="14"/>
+          <w:szCs w:val="14"/>
+        </w:rPr>
+        <w:t>"0" mean no, "1" means yes.</w:t>
+      </w:r>
+    </w:p>
+    <w:p>
+      <w:pPr>
+        <w:pStyle w:val="ListParagraph"/>
+        <w:rPr>
+          <w:rFonts w:ascii="Cascadia Code" w:hAnsi="Cascadia Code"/>
+          <w:sz w:val="14"/>
+          <w:szCs w:val="14"/>
+        </w:rPr>
+      </w:pPr>
+      <w:r>
+        <w:rPr>
+          <w:rFonts w:ascii="Cascadia Code" w:hAnsi="Cascadia Code"/>
+          <w:sz w:val="14"/>
+          <w:szCs w:val="14"/>
+        </w:rPr>
+      </w:r>
+    </w:p>
+    <w:p>
+      <w:pPr>
+        <w:pStyle w:val="ListParagraph"/>
+        <w:rPr>
+          <w:rFonts w:ascii="Cascadia Code" w:hAnsi="Cascadia Code"/>
+          <w:i/>
+          <w:i/>
+          <w:iCs/>
+          <w:sz w:val="14"/>
+          <w:szCs w:val="14"/>
+        </w:rPr>
+      </w:pPr>
+      <w:r>
+        <w:rPr>
+          <w:rFonts w:ascii="Cascadia Code" w:hAnsi="Cascadia Code"/>
+          <w:i/>
+          <w:iCs/>
+          <w:sz w:val="14"/>
+          <w:szCs w:val="14"/>
+        </w:rPr>
+        <w:t xml:space="preserve"> </w:t>
+      </w:r>
+      <w:r>
+        <w:rPr>
+          <w:rFonts w:ascii="Cascadia Code" w:hAnsi="Cascadia Code"/>
+          <w:i/>
+          <w:iCs/>
+          <w:sz w:val="14"/>
+          <w:szCs w:val="14"/>
+        </w:rPr>
+        <w:t>RotatePath (ID: 5)</w:t>
+      </w:r>
+    </w:p>
+    <w:p>
+      <w:pPr>
+        <w:pStyle w:val="ListParagraph"/>
+        <w:rPr>
+          <w:rFonts w:ascii="Cascadia Code" w:hAnsi="Cascadia Code"/>
+          <w:sz w:val="14"/>
+          <w:szCs w:val="14"/>
+        </w:rPr>
+      </w:pPr>
+      <w:r>
+        <w:rPr>
+          <w:rFonts w:ascii="Cascadia Code" w:hAnsi="Cascadia Code"/>
+          <w:sz w:val="14"/>
+          <w:szCs w:val="14"/>
+        </w:rPr>
+        <w:t>Training parameter for whether to use path rotation. "0" mean no, "1" means yes.</w:t>
+      </w:r>
+    </w:p>
+    <w:p>
+      <w:pPr>
+        <w:pStyle w:val="ListParagraph"/>
+        <w:rPr>
+          <w:rFonts w:ascii="Cascadia Code" w:hAnsi="Cascadia Code"/>
+          <w:sz w:val="14"/>
+          <w:szCs w:val="14"/>
+        </w:rPr>
+      </w:pPr>
+      <w:r>
+        <w:rPr>
+          <w:rFonts w:ascii="Cascadia Code" w:hAnsi="Cascadia Code"/>
+          <w:sz w:val="14"/>
+          <w:szCs w:val="14"/>
+        </w:rPr>
+      </w:r>
+    </w:p>
+    <w:p>
+      <w:pPr>
+        <w:pStyle w:val="ListParagraph"/>
+        <w:rPr>
+          <w:rFonts w:ascii="Cascadia Code" w:hAnsi="Cascadia Code"/>
+          <w:sz w:val="14"/>
+          <w:szCs w:val="14"/>
+        </w:rPr>
+      </w:pPr>
+      <w:r>
+        <w:rPr>
+          <w:rFonts w:ascii="Cascadia Code" w:hAnsi="Cascadia Code"/>
+          <w:sz w:val="14"/>
+          <w:szCs w:val="14"/>
+        </w:rPr>
+        <w:t xml:space="preserve"> </w:t>
+      </w:r>
+      <w:r>
+        <w:rPr>
+          <w:rFonts w:ascii="Cascadia Code" w:hAnsi="Cascadia Code"/>
+          <w:i/>
+          <w:iCs/>
+          <w:sz w:val="14"/>
+          <w:szCs w:val="14"/>
+        </w:rPr>
+        <w:t>ProfileAlgorithm (ID: 6)</w:t>
+      </w:r>
+    </w:p>
+    <w:p>
+      <w:pPr>
+        <w:pStyle w:val="ListParagraph"/>
+        <w:rPr>
+          <w:rFonts w:ascii="Cascadia Code" w:hAnsi="Cascadia Code"/>
+          <w:sz w:val="14"/>
+          <w:szCs w:val="14"/>
+        </w:rPr>
+      </w:pPr>
+      <w:r>
+        <w:rPr>
+          <w:rFonts w:ascii="Cascadia Code" w:hAnsi="Cascadia Code"/>
+          <w:sz w:val="14"/>
+          <w:szCs w:val="14"/>
+        </w:rPr>
+        <w:t>Which algorithm to use to represent the 3D shape of the gesture motion.</w:t>
+      </w:r>
+    </w:p>
+    <w:p>
+      <w:pPr>
+        <w:pStyle w:val="ListParagraph"/>
+        <w:rPr>
+          <w:rFonts w:ascii="Cascadia Code" w:hAnsi="Cascadia Code"/>
+          <w:sz w:val="14"/>
+          <w:szCs w:val="14"/>
+        </w:rPr>
+      </w:pPr>
+      <w:r>
+        <w:rPr>
+          <w:rFonts w:ascii="Cascadia Code" w:hAnsi="Cascadia Code"/>
+          <w:sz w:val="14"/>
+          <w:szCs w:val="14"/>
+        </w:rPr>
+        <w:t>MiVRy offers 5 algorithms which can be selected by their ID (0 through 4).</w:t>
+      </w:r>
+    </w:p>
+    <w:p>
+      <w:pPr>
+        <w:pStyle w:val="ListParagraph"/>
+        <w:rPr>
+          <w:rFonts w:ascii="Cascadia Code" w:hAnsi="Cascadia Code"/>
+          <w:sz w:val="14"/>
+          <w:szCs w:val="14"/>
+        </w:rPr>
+      </w:pPr>
+      <w:r>
+        <w:rPr>
+          <w:rFonts w:ascii="Cascadia Code" w:hAnsi="Cascadia Code"/>
+          <w:sz w:val="14"/>
+          <w:szCs w:val="14"/>
+        </w:rPr>
+      </w:r>
+    </w:p>
+    <w:p>
+      <w:pPr>
+        <w:pStyle w:val="ListParagraph"/>
+        <w:rPr>
+          <w:rFonts w:ascii="Cascadia Code" w:hAnsi="Cascadia Code"/>
+          <w:sz w:val="14"/>
+          <w:szCs w:val="14"/>
+        </w:rPr>
+      </w:pPr>
+      <w:r>
+        <w:rPr>
+          <w:rFonts w:ascii="Cascadia Code" w:hAnsi="Cascadia Code"/>
+          <w:sz w:val="14"/>
+          <w:szCs w:val="14"/>
+        </w:rPr>
+        <w:t xml:space="preserve"> </w:t>
+      </w:r>
+      <w:r>
+        <w:rPr>
+          <w:rFonts w:ascii="Cascadia Code" w:hAnsi="Cascadia Code"/>
+          <w:i/>
+          <w:iCs/>
+          <w:sz w:val="14"/>
+          <w:szCs w:val="14"/>
+        </w:rPr>
+        <w:t>OrientationAlgorithm (ID: 7)</w:t>
+      </w:r>
+    </w:p>
+    <w:p>
+      <w:pPr>
+        <w:pStyle w:val="ListParagraph"/>
+        <w:rPr>
+          <w:rFonts w:ascii="Cascadia Code" w:hAnsi="Cascadia Code"/>
+          <w:sz w:val="14"/>
+          <w:szCs w:val="14"/>
+        </w:rPr>
+      </w:pPr>
+      <w:r>
+        <w:rPr>
+          <w:rFonts w:ascii="Cascadia Code" w:hAnsi="Cascadia Code"/>
+          <w:sz w:val="14"/>
+          <w:szCs w:val="14"/>
+        </w:rPr>
+        <w:t>Which algorithm to use to interpret the orientation (direction) of the gesture motion.</w:t>
+      </w:r>
+    </w:p>
+    <w:p>
+      <w:pPr>
+        <w:pStyle w:val="ListParagraph"/>
+        <w:rPr>
+          <w:rFonts w:ascii="Cascadia Code" w:hAnsi="Cascadia Code"/>
+          <w:sz w:val="14"/>
+          <w:szCs w:val="14"/>
+        </w:rPr>
+      </w:pPr>
+      <w:r>
+        <w:rPr>
+          <w:rFonts w:ascii="Cascadia Code" w:hAnsi="Cascadia Code"/>
+          <w:sz w:val="14"/>
+          <w:szCs w:val="14"/>
+        </w:rPr>
+        <w:t>This affects the direction wich is returned as an optional parameter when a gesture was completed.</w:t>
+      </w:r>
+    </w:p>
+    <w:p>
+      <w:pPr>
+        <w:pStyle w:val="ListParagraph"/>
+        <w:rPr>
+          <w:rFonts w:ascii="Cascadia Code" w:hAnsi="Cascadia Code"/>
+          <w:sz w:val="14"/>
+          <w:szCs w:val="14"/>
+        </w:rPr>
+      </w:pPr>
+      <w:r>
+        <w:rPr>
+          <w:rFonts w:ascii="Cascadia Code" w:hAnsi="Cascadia Code"/>
+          <w:sz w:val="14"/>
+          <w:szCs w:val="14"/>
+        </w:rPr>
+        <w:t>MiVRy offers two different ways to calculate into which direction a gesture was performed which can be selected by their ID (either 0 or 1).</w:t>
+      </w:r>
+    </w:p>
+    <w:p>
+      <w:pPr>
+        <w:pStyle w:val="ListParagraph"/>
+        <w:rPr>
+          <w:rFonts w:ascii="Cascadia Code" w:hAnsi="Cascadia Code"/>
+          <w:sz w:val="14"/>
+          <w:szCs w:val="14"/>
+        </w:rPr>
+      </w:pPr>
+      <w:r>
+        <w:rPr>
+          <w:rFonts w:ascii="Cascadia Code" w:hAnsi="Cascadia Code"/>
+          <w:sz w:val="14"/>
+          <w:szCs w:val="14"/>
+        </w:rPr>
+      </w:r>
+    </w:p>
+    <w:p>
+      <w:pPr>
+        <w:pStyle w:val="ListParagraph"/>
+        <w:rPr>
+          <w:rFonts w:ascii="Cascadia Code" w:hAnsi="Cascadia Code"/>
+          <w:sz w:val="14"/>
+          <w:szCs w:val="14"/>
+        </w:rPr>
+      </w:pPr>
+      <w:r>
+        <w:rPr>
+          <w:rFonts w:ascii="Cascadia Code" w:hAnsi="Cascadia Code"/>
+          <w:sz w:val="14"/>
+          <w:szCs w:val="14"/>
+        </w:rPr>
+        <w:t xml:space="preserve"> </w:t>
+      </w:r>
+      <w:r>
+        <w:rPr>
+          <w:rFonts w:ascii="Cascadia Code" w:hAnsi="Cascadia Code"/>
+          <w:i/>
+          <w:iCs/>
+          <w:sz w:val="14"/>
+          <w:szCs w:val="14"/>
+        </w:rPr>
+        <w:t>PivotPoint (ID: 8)</w:t>
+      </w:r>
+    </w:p>
+    <w:p>
+      <w:pPr>
+        <w:pStyle w:val="ListParagraph"/>
+        <w:rPr>
+          <w:rFonts w:ascii="Cascadia Code" w:hAnsi="Cascadia Code"/>
+          <w:sz w:val="14"/>
+          <w:szCs w:val="14"/>
+        </w:rPr>
+      </w:pPr>
+      <w:r>
+        <w:rPr>
+          <w:rFonts w:ascii="Cascadia Code" w:hAnsi="Cascadia Code"/>
+          <w:sz w:val="14"/>
+          <w:szCs w:val="14"/>
+        </w:rPr>
+        <w:t>Sets which point along the gesture motion to use as basis point ("pivot").</w:t>
+      </w:r>
+    </w:p>
+    <w:p>
+      <w:pPr>
+        <w:pStyle w:val="ListParagraph"/>
+        <w:rPr>
+          <w:rFonts w:ascii="Cascadia Code" w:hAnsi="Cascadia Code"/>
+          <w:sz w:val="14"/>
+          <w:szCs w:val="14"/>
+        </w:rPr>
+      </w:pPr>
+      <w:r>
+        <w:rPr>
+          <w:rFonts w:ascii="Cascadia Code" w:hAnsi="Cascadia Code"/>
+          <w:sz w:val="14"/>
+          <w:szCs w:val="14"/>
+        </w:rPr>
+        <w:t>This can be either the start point (ID: 1) or the center point (ID: 0).</w:t>
+      </w:r>
+    </w:p>
+    <w:p>
+      <w:pPr>
+        <w:pStyle w:val="ListParagraph"/>
+        <w:rPr>
+          <w:rFonts w:ascii="Cascadia Code" w:hAnsi="Cascadia Code"/>
+          <w:sz w:val="14"/>
+          <w:szCs w:val="14"/>
+        </w:rPr>
+      </w:pPr>
+      <w:r>
+        <w:rPr>
+          <w:rFonts w:ascii="Cascadia Code" w:hAnsi="Cascadia Code"/>
+          <w:sz w:val="14"/>
+          <w:szCs w:val="14"/>
+        </w:rPr>
+      </w:r>
+    </w:p>
+    <w:p>
+      <w:pPr>
+        <w:pStyle w:val="ListParagraph"/>
+        <w:rPr>
+          <w:rFonts w:ascii="Cascadia Code" w:hAnsi="Cascadia Code"/>
+          <w:sz w:val="14"/>
+          <w:szCs w:val="14"/>
+        </w:rPr>
+      </w:pPr>
+      <w:r>
+        <w:rPr>
+          <w:rFonts w:ascii="Cascadia Code" w:hAnsi="Cascadia Code"/>
+          <w:sz w:val="14"/>
+          <w:szCs w:val="14"/>
+        </w:rPr>
+        <w:t xml:space="preserve"> </w:t>
+      </w:r>
+      <w:r>
+        <w:rPr>
+          <w:rFonts w:ascii="Cascadia Code" w:hAnsi="Cascadia Code"/>
+          <w:i/>
+          <w:iCs/>
+          <w:sz w:val="14"/>
+          <w:szCs w:val="14"/>
+        </w:rPr>
+        <w:t>ActivationFunction (ID: 9)</w:t>
+      </w:r>
+    </w:p>
+    <w:p>
+      <w:pPr>
+        <w:pStyle w:val="ListParagraph"/>
+        <w:rPr>
+          <w:rFonts w:ascii="Cascadia Code" w:hAnsi="Cascadia Code"/>
+          <w:sz w:val="14"/>
+          <w:szCs w:val="14"/>
+        </w:rPr>
+      </w:pPr>
+      <w:r>
+        <w:rPr>
+          <w:rFonts w:ascii="Cascadia Code" w:hAnsi="Cascadia Code"/>
+          <w:sz w:val="14"/>
+          <w:szCs w:val="14"/>
+        </w:rPr>
+        <w:t>Sets which activation function to use in each neuron of the neural network.</w:t>
+      </w:r>
+    </w:p>
+    <w:p>
+      <w:pPr>
+        <w:pStyle w:val="ListParagraph"/>
+        <w:rPr>
+          <w:rFonts w:ascii="Cascadia Code" w:hAnsi="Cascadia Code"/>
+          <w:sz w:val="14"/>
+          <w:szCs w:val="14"/>
+        </w:rPr>
+      </w:pPr>
+      <w:r>
+        <w:rPr>
+          <w:rFonts w:ascii="Cascadia Code" w:hAnsi="Cascadia Code"/>
+          <w:sz w:val="14"/>
+          <w:szCs w:val="14"/>
+        </w:rPr>
+        <w:t>MiVRy offers two possible activation functions which can be selected by their ID (0 or 1).</w:t>
+      </w:r>
+    </w:p>
+    <w:p>
+      <w:pPr>
+        <w:pStyle w:val="ListParagraph"/>
+        <w:rPr>
+          <w:rFonts w:ascii="Cascadia Code" w:hAnsi="Cascadia Code"/>
+          <w:sz w:val="14"/>
+          <w:szCs w:val="14"/>
+        </w:rPr>
+      </w:pPr>
+      <w:r>
+        <w:rPr>
+          <w:rFonts w:ascii="Cascadia Code" w:hAnsi="Cascadia Code"/>
+          <w:sz w:val="14"/>
+          <w:szCs w:val="14"/>
+        </w:rPr>
+      </w:r>
+    </w:p>
+    <w:p>
+      <w:pPr>
+        <w:pStyle w:val="ListParagraph"/>
+        <w:rPr>
+          <w:rFonts w:ascii="Cascadia Code" w:hAnsi="Cascadia Code"/>
+          <w:sz w:val="14"/>
+          <w:szCs w:val="14"/>
+        </w:rPr>
+      </w:pPr>
+      <w:r>
+        <w:rPr>
+          <w:rFonts w:ascii="Cascadia Code" w:hAnsi="Cascadia Code"/>
+          <w:sz w:val="14"/>
+          <w:szCs w:val="14"/>
+        </w:rPr>
+        <w:t xml:space="preserve"> </w:t>
+      </w:r>
+      <w:r>
+        <w:rPr>
+          <w:rFonts w:ascii="Cascadia Code" w:hAnsi="Cascadia Code"/>
+          <w:i/>
+          <w:iCs/>
+          <w:sz w:val="14"/>
+          <w:szCs w:val="14"/>
+        </w:rPr>
+        <w:t>ActivationFactor (ID: 10)</w:t>
+      </w:r>
+    </w:p>
+    <w:p>
+      <w:pPr>
+        <w:pStyle w:val="ListParagraph"/>
+        <w:rPr>
+          <w:rFonts w:ascii="Cascadia Code" w:hAnsi="Cascadia Code"/>
+          <w:sz w:val="14"/>
+          <w:szCs w:val="14"/>
+        </w:rPr>
+      </w:pPr>
+      <w:r>
+        <w:rPr>
+          <w:rFonts w:ascii="Cascadia Code" w:hAnsi="Cascadia Code"/>
+          <w:sz w:val="14"/>
+          <w:szCs w:val="14"/>
+        </w:rPr>
+        <w:t>Sets the activation factor to use in each neuron of the neural network.</w:t>
+      </w:r>
+    </w:p>
+    <w:p>
+      <w:pPr>
+        <w:pStyle w:val="ListParagraph"/>
+        <w:rPr>
+          <w:rFonts w:ascii="Cascadia Code" w:hAnsi="Cascadia Code"/>
+          <w:sz w:val="14"/>
+          <w:szCs w:val="14"/>
+        </w:rPr>
+      </w:pPr>
+      <w:r>
+        <w:rPr>
+          <w:rFonts w:ascii="Cascadia Code" w:hAnsi="Cascadia Code"/>
+          <w:sz w:val="14"/>
+          <w:szCs w:val="14"/>
+        </w:rPr>
+      </w:r>
+    </w:p>
+    <w:p>
+      <w:pPr>
+        <w:pStyle w:val="ListParagraph"/>
+        <w:rPr>
+          <w:rFonts w:ascii="Cascadia Code" w:hAnsi="Cascadia Code"/>
+          <w:sz w:val="14"/>
+          <w:szCs w:val="14"/>
+        </w:rPr>
+      </w:pPr>
+      <w:r>
+        <w:rPr>
+          <w:rFonts w:ascii="Cascadia Code" w:hAnsi="Cascadia Code"/>
+          <w:sz w:val="14"/>
+          <w:szCs w:val="14"/>
+        </w:rPr>
+        <w:t xml:space="preserve"> </w:t>
+      </w:r>
+      <w:r>
+        <w:rPr>
+          <w:rFonts w:ascii="Cascadia Code" w:hAnsi="Cascadia Code"/>
+          <w:i/>
+          <w:iCs/>
+          <w:sz w:val="14"/>
+          <w:szCs w:val="14"/>
+        </w:rPr>
+        <w:t>UseTimestamp (ID: 11)</w:t>
+      </w:r>
+    </w:p>
+    <w:p>
+      <w:pPr>
+        <w:pStyle w:val="ListParagraph"/>
+        <w:rPr>
+          <w:rFonts w:ascii="Cascadia Code" w:hAnsi="Cascadia Code"/>
+          <w:sz w:val="14"/>
+          <w:szCs w:val="14"/>
+        </w:rPr>
+      </w:pPr>
+      <w:r>
+        <w:rPr>
+          <w:rFonts w:ascii="Cascadia Code" w:hAnsi="Cascadia Code"/>
+          <w:sz w:val="14"/>
+          <w:szCs w:val="14"/>
+        </w:rPr>
+        <w:t>Sets whether the time (speed) of the gesture motion is used to identify the gesture.</w:t>
+      </w:r>
+    </w:p>
+    <w:p>
+      <w:pPr>
+        <w:pStyle w:val="ListParagraph"/>
+        <w:rPr>
+          <w:rFonts w:ascii="Cascadia Code" w:hAnsi="Cascadia Code"/>
+          <w:sz w:val="14"/>
+          <w:szCs w:val="14"/>
+        </w:rPr>
+      </w:pPr>
+      <w:r>
+        <w:rPr>
+          <w:rFonts w:ascii="Cascadia Code" w:hAnsi="Cascadia Code"/>
+          <w:sz w:val="14"/>
+          <w:szCs w:val="14"/>
+        </w:rPr>
+        <w:t>"0" mean no, "1" means yes.</w:t>
       </w:r>
       <w:r>
         <w:br w:type="page"/>

</xml_diff>

<commit_message>
Updated to version v2.15.
</commit_message>
<xml_diff>
--- a/unity/Documentation.docx
+++ b/unity/Documentation.docx
@@ -107,7 +107,7 @@
           <w:sz w:val="32"/>
           <w:szCs w:val="32"/>
         </w:rPr>
-        <w:t>4</w:t>
+        <w:t>5</w:t>
       </w:r>
     </w:p>
     <w:p>
@@ -492,7 +492,25 @@
           <w:sz w:val="28"/>
           <w:szCs w:val="28"/>
         </w:rPr>
-        <w:t>©2025 MARUI-PlugIn (inc.)</w:t>
+        <w:t>©202</w:t>
+      </w:r>
+      <w:r>
+        <w:rPr>
+          <w:rFonts w:eastAsia="" w:cs="" w:ascii="Calibri Light" w:hAnsi="Calibri Light" w:asciiTheme="majorHAnsi" w:cstheme="majorBidi" w:eastAsiaTheme="majorEastAsia" w:hAnsiTheme="majorHAnsi"/>
+          <w:color w:themeColor="accent1" w:themeShade="bf" w:val="2F5496"/>
+          <w:sz w:val="28"/>
+          <w:szCs w:val="28"/>
+        </w:rPr>
+        <w:t>6</w:t>
+      </w:r>
+      <w:r>
+        <w:rPr>
+          <w:rFonts w:eastAsia="" w:cs="" w:ascii="Calibri Light" w:hAnsi="Calibri Light" w:asciiTheme="majorHAnsi" w:cstheme="majorBidi" w:eastAsiaTheme="majorEastAsia" w:hAnsiTheme="majorHAnsi"/>
+          <w:color w:themeColor="accent1" w:themeShade="bf" w:val="2F5496"/>
+          <w:sz w:val="28"/>
+          <w:szCs w:val="28"/>
+        </w:rPr>
+        <w:t xml:space="preserve"> MARUI-PlugIn (inc.)</w:t>
       </w:r>
       <w:r>
         <w:br w:type="page"/>
@@ -516,7 +534,15 @@
       </w:pPr>
       <w:r>
         <w:rPr/>
-        <w:t>Copyright (c) 2025 MARUI-PlugIn (inc.)</w:t>
+        <w:t>Copyright (c) 202</w:t>
+      </w:r>
+      <w:r>
+        <w:rPr/>
+        <w:t>6</w:t>
+      </w:r>
+      <w:r>
+        <w:rPr/>
+        <w:t xml:space="preserve"> MARUI-PlugIn (inc.)</w:t>
       </w:r>
     </w:p>
     <w:p>
@@ -610,7 +636,17 @@
       </w:pPr>
       <w:r>
         <w:rPr/>
-      </w:r>
+        <w:t>Sample scenes and scripts which can be used as references can be found on GitHub:</w:t>
+        <w:br/>
+      </w:r>
+      <w:hyperlink r:id="rId5">
+        <w:r>
+          <w:rPr>
+            <w:rStyle w:val="Hyperlink"/>
+          </w:rPr>
+          <w:t>https://github.com/MARUI-PlugIn/MiVRy/tree/master/unity</w:t>
+        </w:r>
+      </w:hyperlink>
     </w:p>
     <w:p>
       <w:pPr>
@@ -697,7 +733,7 @@
         </w:rPr>
         <w:t xml:space="preserve">4: </w:t>
       </w:r>
-      <w:hyperlink w:anchor="_4%2525252525253A_Licensing_and">
+      <w:hyperlink w:anchor="_4%252525252525252525252525253A_Licensin">
         <w:r>
           <w:rPr>
             <w:rStyle w:val="Hyperlink"/>
@@ -792,7 +828,7 @@
           <w:rPr>
             <w:rStyle w:val="Hyperlink"/>
           </w:rPr>
-          <w:t>How to use MiVRy with Bolt visual programming graphs</w:t>
+          <w:t>How to use MiVRy with VisualScripting or Bolt visual programming graphs</w:t>
         </w:r>
       </w:hyperlink>
     </w:p>
@@ -1094,7 +1130,7 @@
         <w:t>A video tutorial on how to use the GestureManager is available on YouTube:</w:t>
         <w:br/>
       </w:r>
-      <w:hyperlink r:id="rId5">
+      <w:hyperlink r:id="rId6">
         <w:r>
           <w:rPr>
             <w:rStyle w:val="Hyperlink"/>
@@ -1166,7 +1202,7 @@
         <w:rPr/>
         <w:t xml:space="preserve">You can get the MiVRy Unity Package either on the Unity Asset Store ( </w:t>
       </w:r>
-      <w:hyperlink r:id="rId6">
+      <w:hyperlink r:id="rId7">
         <w:r>
           <w:rPr>
             <w:rStyle w:val="Hyperlink"/>
@@ -1178,7 +1214,7 @@
         <w:rPr/>
         <w:t xml:space="preserve"> ) or from Github ( </w:t>
       </w:r>
-      <w:hyperlink r:id="rId7">
+      <w:hyperlink r:id="rId8">
         <w:r>
           <w:rPr>
             <w:rStyle w:val="Hyperlink"/>
@@ -1278,7 +1314,7 @@
                     </pic:cNvPicPr>
                   </pic:nvPicPr>
                   <pic:blipFill>
-                    <a:blip r:embed="rId8"/>
+                    <a:blip r:embed="rId9"/>
                     <a:stretch>
                       <a:fillRect/>
                     </a:stretch>
@@ -1322,7 +1358,7 @@
                     </pic:cNvPicPr>
                   </pic:nvPicPr>
                   <pic:blipFill>
-                    <a:blip r:embed="rId9"/>
+                    <a:blip r:embed="rId10"/>
                     <a:stretch>
                       <a:fillRect/>
                     </a:stretch>
@@ -1456,7 +1492,7 @@
                     </pic:cNvPicPr>
                   </pic:nvPicPr>
                   <pic:blipFill>
-                    <a:blip r:embed="rId10"/>
+                    <a:blip r:embed="rId11"/>
                     <a:stretch>
                       <a:fillRect/>
                     </a:stretch>
@@ -1587,7 +1623,7 @@
                     </pic:cNvPicPr>
                   </pic:nvPicPr>
                   <pic:blipFill>
-                    <a:blip r:embed="rId11"/>
+                    <a:blip r:embed="rId12"/>
                     <a:stretch>
                       <a:fillRect/>
                     </a:stretch>
@@ -1697,7 +1733,7 @@
                     </pic:cNvPicPr>
                   </pic:nvPicPr>
                   <pic:blipFill>
-                    <a:blip r:embed="rId12"/>
+                    <a:blip r:embed="rId13"/>
                     <a:stretch>
                       <a:fillRect/>
                     </a:stretch>
@@ -2008,7 +2044,7 @@
                     </pic:cNvPicPr>
                   </pic:nvPicPr>
                   <pic:blipFill>
-                    <a:blip r:embed="rId13"/>
+                    <a:blip r:embed="rId14"/>
                     <a:stretch>
                       <a:fillRect/>
                     </a:stretch>
@@ -2786,7 +2822,19 @@
       </w:pPr>
       <w:r>
         <w:rPr/>
-        <w:t>The Samples/ folder offer several Unity scenes and scripts that illustrate the various use cases of MiVRy.</w:t>
+        <w:t>Samples are available on our GitHub page:</w:t>
+        <w:br/>
+      </w:r>
+      <w:hyperlink r:id="rId15">
+        <w:r>
+          <w:rPr>
+            <w:rStyle w:val="Hyperlink"/>
+          </w:rPr>
+          <w:t>https://github.com/MARUI-PlugIn/MiVRy/tree/master/unity</w:t>
+        </w:r>
+      </w:hyperlink>
+      <w:r>
+        <w:rPr/>
         <w:br/>
         <w:t>- Sample_MiVRy : Unity sample scene and script on how to use the Mivry component.</w:t>
         <w:br/>
@@ -2845,7 +2893,7 @@
         <w:spacing w:before="0" w:after="0"/>
         <w:rPr/>
       </w:pPr>
-      <w:bookmarkStart w:id="4" w:name="_4%2525252525253A_Licensing_and"/>
+      <w:bookmarkStart w:id="4" w:name="_4%252525252525252525252525253A_Licensin"/>
       <w:bookmarkEnd w:id="4"/>
       <w:r>
         <w:rPr/>
@@ -2877,7 +2925,7 @@
         <w:t>To unlock unlimited gesture recognition, you must purchase a license at:</w:t>
         <w:br/>
       </w:r>
-      <w:hyperlink r:id="rId14">
+      <w:hyperlink r:id="rId16">
         <w:r>
           <w:rPr>
             <w:rStyle w:val="Hyperlink"/>
@@ -2891,8 +2939,9 @@
         <w:t>The license key will be sent to you automatically and immediately after purchase.</w:t>
         <w:br/>
         <w:t xml:space="preserve">If the license email does not arrive, please check your spam filter, and contact </w:t>
-      </w:r>
-      <w:hyperlink r:id="rId15">
+        <w:br/>
+      </w:r>
+      <w:hyperlink r:id="rId17">
         <w:r>
           <w:rPr>
             <w:rStyle w:val="Hyperlink"/>
@@ -3069,7 +3118,7 @@
         <w:t>A video tutorial on how to use the GestureManager in VR is available on YouTube:</w:t>
         <w:br/>
       </w:r>
-      <w:hyperlink r:id="rId16">
+      <w:hyperlink r:id="rId18">
         <w:r>
           <w:rPr>
             <w:rStyle w:val="Hyperlink"/>
@@ -3359,7 +3408,7 @@
         <w:rPr/>
         <w:t>- "LeftTriggerInput" / "RightTriggerInput":</w:t>
         <w:br/>
-        <w:t>The name of the input in the Input Manager (in Project settings) which will be used to start/end the gesture.</w:t>
+        <w:t>The name of the input in the Input Manager (in Project settings) or Unity Input System path which will be used to start/end the gesture. (See FAQ #15 for details).</w:t>
       </w:r>
     </w:p>
     <w:p>
@@ -3395,7 +3444,7 @@
         <w:rPr/>
         <w:t>- "Update Head Position Policy":</w:t>
         <w:br/>
-        <w:t>Whether to update the hmd (frame of reference) position/rotation during the gesturing motion. In many cases it is not advisable to take head motions during gesturing into account, because people may watch their hands while gesturing. Following the moving hands with the head would then eliminate the hand motion relative to the headset (the hands would always be "in front of the headset"). However, in some cases it may be useful to use the changing head position, for example if the user might be walking during a gesture.</w:t>
+        <w:t>Whether to update the HMD (frame of reference) position/rotation during the gesturing motion. In many cases it is not advisable to take head motions during gesturing into account, because people may watch their hands while gesturing. Following the moving hands with the head would then eliminate the hand motion relative to the headset (the hands would always be "in front of the headset"). However, in some cases it may be useful to use the changing head position, for example if the user might be walking during a gesture.</w:t>
       </w:r>
     </w:p>
     <w:p>
@@ -3418,6 +3467,42 @@
       <w:r>
         <w:rPr/>
         <w:t>When these properties are set, the Mivry script will detect the push of the button defined as “trigger”, track the position of the GameObject defined as “Hand” and, upon release of the “trigger” button will automatically identify the gesture and call the OnGestureCompletion function with details about the detected gesture.</w:t>
+      </w:r>
+    </w:p>
+    <w:p>
+      <w:pPr>
+        <w:pStyle w:val="Normal"/>
+        <w:rPr/>
+      </w:pPr>
+      <w:r>
+        <w:rPr/>
+        <w:t>- "ContinuousGestureRecognition":</w:t>
+        <w:br/>
+        <w:t>Whether gestures should be identified continuously during gesturing, instead of after a gesture motion is finished. NOTE: You still need to start a gesture motion via the "trigger" for continuous recognition to start. You can do so via a trigger input (button) or by setting the trigger threshold to zero.</w:t>
+      </w:r>
+    </w:p>
+    <w:p>
+      <w:pPr>
+        <w:pStyle w:val="Normal"/>
+        <w:rPr/>
+      </w:pPr>
+      <w:r>
+        <w:rPr/>
+        <w:t>- "ContinuousGesturePeriod":</w:t>
+        <w:br/>
+        <w:t>Time frame (in milliseconds) that continuous gestures are expected to be. So if your gesture take about one second to perform one whole rotation, this setting should be “1000”.</w:t>
+      </w:r>
+    </w:p>
+    <w:p>
+      <w:pPr>
+        <w:pStyle w:val="Normal"/>
+        <w:rPr/>
+      </w:pPr>
+      <w:r>
+        <w:rPr/>
+        <w:t>- "ContinuousGestureSmoothing":</w:t>
+        <w:br/>
+        <w:t>The number of samples to use for smoothing continuous gesture identification results. This is offered so that the identified gesture does not abruptly change when during the gesturing the gesture motion briefly resembles a different recording. So if “Smoothing” is set to “3”, two prior identifications of the correct gesture can override the current identification and provide a smoother output. On the other side, this setting will cause a delay when switching from one gesture to another.</w:t>
       </w:r>
     </w:p>
     <w:p>
@@ -4189,7 +4274,7 @@
       <w:bookmarkStart w:id="10" w:name="Bolt"/>
       <w:r>
         <w:rPr/>
-        <w:t>9: How to use MiVRy with Bolt visual programming graphs</w:t>
+        <w:t>9: How to use MiVRy with VisualScripting or Bolt visual programming graphs</w:t>
       </w:r>
       <w:bookmarkEnd w:id="10"/>
     </w:p>
@@ -4209,7 +4294,9 @@
       </w:pPr>
       <w:r>
         <w:rPr/>
-        <w:t>This guide assumes that you have both MiVRy and Bolt already added to your project.</w:t>
+        <w:t>This guide assumes that you have both MiVRy and either VisualScripting or Bolt packages already added to your project.</w:t>
+        <w:br/>
+        <w:t>You can get VisualScripting in the Unity PackageManager under “Unity Registry”.</w:t>
         <w:br/>
         <w:t xml:space="preserve">You can get both MiVRy and Bolt on the Unity Asset store. </w:t>
       </w:r>
@@ -4221,7 +4308,7 @@
       </w:pPr>
       <w:r>
         <w:rPr/>
-        <w:t>(1) Make sure both Bolt and MiVRy are installed in your project.</w:t>
+        <w:t>(1) Make sure both MiVRy and either of VisualScripting or Bolt packages are installed in your project.</w:t>
         <w:br/>
         <w:t xml:space="preserve">Open the </w:t>
       </w:r>
@@ -4245,7 +4332,27 @@
       </w:r>
       <w:r>
         <w:rPr/>
-        <w:t xml:space="preserve"> folder and un-comment the following line by removing the “//” at the beginning of the line.</w:t>
+        <w:t xml:space="preserve"> folder and edit the appropriate line below by removing the “//” at the beginning of the line.</w:t>
+        <w:br/>
+        <w:br/>
+      </w:r>
+      <w:r>
+        <w:rPr>
+          <w:rFonts w:cs="Courier New" w:ascii="Courier New" w:hAnsi="Courier New"/>
+        </w:rPr>
+        <w:t>//#define MIVRY_USE_VISUALSCRIPTING</w:t>
+        <w:br/>
+        <w:t>//#define MIVRY_USE_BOLT</w:t>
+      </w:r>
+    </w:p>
+    <w:p>
+      <w:pPr>
+        <w:pStyle w:val="Normal"/>
+        <w:rPr/>
+      </w:pPr>
+      <w:r>
+        <w:rPr/>
+        <w:t>to</w:t>
       </w:r>
     </w:p>
     <w:p>
@@ -4259,17 +4366,19 @@
         <w:rPr>
           <w:rFonts w:cs="Courier New" w:ascii="Courier New" w:hAnsi="Courier New"/>
         </w:rPr>
-        <w:t>//#define MIVRY_USE_BOLT</w:t>
-      </w:r>
-    </w:p>
-    <w:p>
-      <w:pPr>
-        <w:pStyle w:val="Normal"/>
-        <w:rPr/>
-      </w:pPr>
-      <w:r>
-        <w:rPr/>
-        <w:t>to</w:t>
+        <w:t>#define MIVRY_USE_VISUALSCRIPTING</w:t>
+        <w:br/>
+        <w:t>// #define MIVRY_USE_BOLT</w:t>
+      </w:r>
+    </w:p>
+    <w:p>
+      <w:pPr>
+        <w:pStyle w:val="Normal"/>
+        <w:rPr/>
+      </w:pPr>
+      <w:r>
+        <w:rPr/>
+        <w:t>when using VisualScripting or to</w:t>
       </w:r>
     </w:p>
     <w:p>
@@ -4283,6 +4392,8 @@
         <w:rPr>
           <w:rFonts w:cs="Courier New" w:ascii="Courier New" w:hAnsi="Courier New"/>
         </w:rPr>
+        <w:t>// #define MIVRY_USE_VISUALSCRIPTING</w:t>
+        <w:br/>
         <w:t>#define MIVRY_USE_BOLT</w:t>
       </w:r>
     </w:p>
@@ -4293,16 +4404,17 @@
       </w:pPr>
       <w:r>
         <w:rPr/>
-      </w:r>
-    </w:p>
-    <w:p>
-      <w:pPr>
-        <w:pStyle w:val="Normal"/>
-        <w:rPr/>
-      </w:pPr>
-      <w:r>
-        <w:rPr/>
-        <w:t xml:space="preserve">(2) In Unity, open the </w:t>
+        <w:t>when using Bolt.</w:t>
+      </w:r>
+    </w:p>
+    <w:p>
+      <w:pPr>
+        <w:pStyle w:val="Normal"/>
+        <w:rPr/>
+      </w:pPr>
+      <w:r>
+        <w:rPr/>
+        <w:t xml:space="preserve">(2) If you’re using Bolt, open the </w:t>
       </w:r>
       <w:r>
         <w:rPr>
@@ -4324,7 +4436,7 @@
       </w:r>
       <w:r>
         <w:rPr/>
-        <w:t>, if the menu does not exist, check if Bolt was installed properly in your project).</w:t>
+        <w:t>, if the menu does not exist, check if Bolt was installed properly).</w:t>
         <w:br/>
         <w:t>In the Wizard, click “Next” to get to the “Type Options” page.</w:t>
         <w:br/>
@@ -4388,7 +4500,7 @@
                     </pic:cNvPicPr>
                   </pic:nvPicPr>
                   <pic:blipFill>
-                    <a:blip r:embed="rId17"/>
+                    <a:blip r:embed="rId19"/>
                     <a:stretch>
                       <a:fillRect/>
                     </a:stretch>
@@ -4463,7 +4575,7 @@
           <w:i/>
           <w:iCs/>
         </w:rPr>
-        <w:t>Alternatively, you could also create a scene variable or graph variable, but then you have to set the member variables (such as “Gesture Database File”) in a Flow Graph instead of just using the Inspector.</w:t>
+        <w:t>Alternatively, you could also create a scene variable or graph variable, but then you have to set the member variables (such as “Gesture Database File”) in a Script Graph / Flow Graph instead of just using the Inspector.</w:t>
       </w:r>
     </w:p>
     <w:p>
@@ -4489,132 +4601,132 @@
           <w:b/>
           <w:bCs/>
         </w:rPr>
-        <w:t>Bolt flow machine / flow graph</w:t>
-      </w:r>
-      <w:r>
-        <w:rPr/>
-        <w:t xml:space="preserve"> or </w:t>
+        <w:t>VisualScripting ‘</w:t>
       </w:r>
       <w:r>
         <w:rPr>
           <w:b/>
           <w:bCs/>
-        </w:rPr>
-        <w:t>state machine / state graph</w:t>
-      </w:r>
-      <w:r>
-        <w:rPr/>
-        <w:t xml:space="preserve">. </w:t>
-        <w:br/>
-        <w:t>(If you do not yet have a flow graph, you can create one on the same game object by clicking “Add Component” in the Inspector and selecting “Flow Machine”. On the new component click “Edit Graph”).</w:t>
-      </w:r>
-    </w:p>
-    <w:p>
-      <w:pPr>
-        <w:pStyle w:val="Normal"/>
-        <w:rPr/>
-      </w:pPr>
-      <w:r>
-        <w:rPr/>
-      </w:r>
-    </w:p>
-    <w:p>
-      <w:pPr>
-        <w:pStyle w:val="Normal"/>
-        <w:rPr/>
-      </w:pPr>
-      <w:r>
-        <w:rPr/>
-        <w:t xml:space="preserve">(5) In the </w:t>
+          <w:i/>
+          <w:iCs/>
+        </w:rPr>
+        <w:t>Script Machine</w:t>
       </w:r>
       <w:r>
         <w:rPr>
           <w:b/>
           <w:bCs/>
         </w:rPr>
-        <w:t>Variables “Blackboard”</w:t>
-      </w:r>
-      <w:r>
-        <w:rPr/>
-        <w:t>, switch to the “Scene” tab and create a new variable by typing in a Name in the “(New Variable Name)” field and pressing the “+” icon.</w:t>
-      </w:r>
-    </w:p>
-    <w:p>
-      <w:pPr>
-        <w:pStyle w:val="Normal"/>
-        <w:rPr/>
-      </w:pPr>
-      <w:r>
-        <w:rPr/>
-        <w:t xml:space="preserve">If you cannot see the Blackboard, you can open it from the title bar menu </w:t>
-      </w:r>
-      <w:r>
-        <w:rPr>
-          <w:i/>
-          <w:iCs/>
-        </w:rPr>
-        <w:t>“Window” -&gt; “Variables”</w:t>
-      </w:r>
-      <w:r>
-        <w:rPr/>
-        <w:t>.</w:t>
-      </w:r>
-    </w:p>
-    <w:p>
-      <w:pPr>
-        <w:pStyle w:val="Normal"/>
-        <w:rPr/>
-      </w:pPr>
-      <w:r>
-        <w:rPr/>
-        <w:t>As “</w:t>
+        <w:t>’ graph</w:t>
+      </w:r>
+      <w:r>
+        <w:rPr/>
+        <w:t xml:space="preserve">, </w:t>
       </w:r>
       <w:r>
         <w:rPr>
           <w:b/>
           <w:bCs/>
         </w:rPr>
-        <w:t>Variable Type</w:t>
-      </w:r>
-      <w:r>
-        <w:rPr/>
-        <w:t>” select “</w:t>
-      </w:r>
-      <w:r>
-        <w:rPr>
-          <w:i/>
-          <w:iCs/>
-        </w:rPr>
-        <w:t>Mivry</w:t>
-      </w:r>
-      <w:r>
-        <w:rPr/>
-        <w:t>”, and as “</w:t>
+        <w:t>VisualScripting ‘</w:t>
       </w:r>
       <w:r>
         <w:rPr>
           <w:b/>
           <w:bCs/>
-        </w:rPr>
-        <w:t>Value</w:t>
-      </w:r>
-      <w:r>
-        <w:rPr/>
-        <w:t>” select the object to which you attached the Mivry script component in step (3).</w:t>
-      </w:r>
-    </w:p>
-    <w:p>
-      <w:pPr>
-        <w:pStyle w:val="Normal"/>
-        <w:rPr/>
-      </w:pPr>
-      <w:r>
-        <w:rPr/>
+          <w:i/>
+          <w:iCs/>
+        </w:rPr>
+        <w:t>State Machine</w:t>
+      </w:r>
+      <w:r>
+        <w:rPr>
+          <w:b/>
+          <w:bCs/>
+        </w:rPr>
+        <w:t>’ graph</w:t>
+      </w:r>
+      <w:r>
+        <w:rPr/>
+        <w:t xml:space="preserve">, </w:t>
+      </w:r>
+      <w:r>
+        <w:rPr>
+          <w:b/>
+          <w:bCs/>
+        </w:rPr>
+        <w:t>Bolt ‘</w:t>
+      </w:r>
+      <w:r>
+        <w:rPr>
+          <w:b/>
+          <w:bCs/>
+          <w:i/>
+          <w:iCs/>
+        </w:rPr>
+        <w:t>flow machine</w:t>
+      </w:r>
+      <w:r>
+        <w:rPr>
+          <w:b/>
+          <w:bCs/>
+        </w:rPr>
+        <w:t>’ graph,</w:t>
+      </w:r>
+      <w:r>
+        <w:rPr/>
+        <w:t xml:space="preserve"> or </w:t>
+      </w:r>
+      <w:r>
+        <w:rPr>
+          <w:b/>
+          <w:bCs/>
+        </w:rPr>
+        <w:t>Bolt ‘</w:t>
+      </w:r>
+      <w:r>
+        <w:rPr>
+          <w:b/>
+          <w:bCs/>
+          <w:i/>
+          <w:iCs/>
+        </w:rPr>
+        <w:t>state machine’</w:t>
+      </w:r>
+      <w:r>
+        <w:rPr>
+          <w:b/>
+          <w:bCs/>
+        </w:rPr>
+        <w:t xml:space="preserve"> graph</w:t>
+      </w:r>
+      <w:r>
+        <w:rPr>
+          <w:b w:val="false"/>
+          <w:bCs w:val="false"/>
+        </w:rPr>
+        <w:t xml:space="preserve"> – whichever you are using.</w:t>
+      </w:r>
+      <w:r>
+        <w:rPr/>
+        <w:t xml:space="preserve"> </w:t>
+        <w:br/>
+        <w:t xml:space="preserve">If you do not yet have a graph, you can create one on any game object by clicking “Add Component” in the Inspector and selecting  “Visual Scripting -&gt; Script Machine” or “Flow Machine” </w:t>
+      </w:r>
+      <w:r>
         <w:drawing>
-          <wp:inline distT="0" distB="0" distL="0" distR="0">
-            <wp:extent cx="2943225" cy="1662430"/>
+          <wp:anchor behindDoc="0" distT="0" distB="0" distL="0" distR="0" simplePos="0" locked="0" layoutInCell="0" allowOverlap="1" relativeHeight="14">
+            <wp:simplePos x="0" y="0"/>
+            <wp:positionH relativeFrom="column">
+              <wp:posOffset>5715</wp:posOffset>
+            </wp:positionH>
+            <wp:positionV relativeFrom="paragraph">
+              <wp:posOffset>930275</wp:posOffset>
+            </wp:positionV>
+            <wp:extent cx="4300855" cy="1270635"/>
             <wp:effectExtent l="0" t="0" r="0" b="0"/>
-            <wp:docPr id="9" name="Picture 9" descr=""/>
+            <wp:wrapTopAndBottom/>
+            <wp:docPr id="9" name="Image1" descr=""/>
             <wp:cNvGraphicFramePr>
               <a:graphicFrameLocks xmlns:a="http://schemas.openxmlformats.org/drawingml/2006/main" noChangeAspect="1"/>
             </wp:cNvGraphicFramePr>
@@ -4622,13 +4734,178 @@
               <a:graphicData uri="http://schemas.openxmlformats.org/drawingml/2006/picture">
                 <pic:pic xmlns:pic="http://schemas.openxmlformats.org/drawingml/2006/picture">
                   <pic:nvPicPr>
-                    <pic:cNvPr id="9" name="Picture 9" descr=""/>
+                    <pic:cNvPr id="9" name="Image1" descr=""/>
                     <pic:cNvPicPr>
                       <a:picLocks noChangeAspect="1" noChangeArrowheads="1"/>
                     </pic:cNvPicPr>
                   </pic:nvPicPr>
                   <pic:blipFill>
-                    <a:blip r:embed="rId18"/>
+                    <a:blip r:embed="rId20"/>
+                    <a:stretch>
+                      <a:fillRect/>
+                    </a:stretch>
+                  </pic:blipFill>
+                  <pic:spPr bwMode="auto">
+                    <a:xfrm>
+                      <a:off x="0" y="0"/>
+                      <a:ext cx="4300855" cy="1270635"/>
+                    </a:xfrm>
+                    <a:prstGeom prst="rect">
+                      <a:avLst/>
+                    </a:prstGeom>
+                  </pic:spPr>
+                </pic:pic>
+              </a:graphicData>
+            </a:graphic>
+          </wp:anchor>
+        </w:drawing>
+      </w:r>
+      <w:r>
+        <w:rPr/>
+        <w:t>for Bolt. On the new component click “Edit Graph”.</w:t>
+      </w:r>
+    </w:p>
+    <w:p>
+      <w:pPr>
+        <w:pStyle w:val="Normal"/>
+        <w:rPr/>
+      </w:pPr>
+      <w:r>
+        <w:rPr/>
+      </w:r>
+    </w:p>
+    <w:p>
+      <w:pPr>
+        <w:pStyle w:val="Normal"/>
+        <w:rPr/>
+      </w:pPr>
+      <w:r>
+        <w:rPr/>
+        <w:t xml:space="preserve">(5) In the </w:t>
+      </w:r>
+      <w:r>
+        <w:rPr>
+          <w:b/>
+          <w:bCs/>
+        </w:rPr>
+        <w:t>Variables “Blackboard”</w:t>
+      </w:r>
+      <w:r>
+        <w:rPr/>
+        <w:t>, switch to the “Scene” tab and create a new variable by typing in a Name in the “(New Variable Name)” field and pressing the “+” icon.</w:t>
+      </w:r>
+    </w:p>
+    <w:p>
+      <w:pPr>
+        <w:pStyle w:val="Normal"/>
+        <w:rPr/>
+      </w:pPr>
+      <w:r>
+        <w:rPr/>
+        <w:t xml:space="preserve">If you cannot see the Blackboard, you can open it from the title bar menu </w:t>
+      </w:r>
+      <w:r>
+        <w:rPr>
+          <w:i/>
+          <w:iCs/>
+        </w:rPr>
+        <w:t>“Window” -&gt; “Variables”</w:t>
+      </w:r>
+      <w:r>
+        <w:rPr/>
+        <w:t>.</w:t>
+      </w:r>
+    </w:p>
+    <w:p>
+      <w:pPr>
+        <w:pStyle w:val="Normal"/>
+        <w:rPr/>
+      </w:pPr>
+      <w:r>
+        <w:rPr/>
+        <w:t>As “</w:t>
+      </w:r>
+      <w:r>
+        <w:rPr>
+          <w:b/>
+          <w:bCs/>
+        </w:rPr>
+        <w:t>Variable Type</w:t>
+      </w:r>
+      <w:r>
+        <w:rPr/>
+        <w:t>” select “</w:t>
+      </w:r>
+      <w:r>
+        <w:rPr>
+          <w:i/>
+          <w:iCs/>
+        </w:rPr>
+        <w:t>Mivry</w:t>
+      </w:r>
+      <w:r>
+        <w:rPr/>
+        <w:t>”, and as “</w:t>
+      </w:r>
+      <w:r>
+        <w:rPr>
+          <w:b/>
+          <w:bCs/>
+        </w:rPr>
+        <w:t>Value</w:t>
+      </w:r>
+      <w:r>
+        <w:rPr/>
+        <w:t>” select the object to which you attached the Mivry script component in step (3).</w:t>
+      </w:r>
+    </w:p>
+    <w:p>
+      <w:pPr>
+        <w:pStyle w:val="Normal"/>
+        <w:rPr/>
+      </w:pPr>
+      <w:r>
+        <w:rPr/>
+        <w:t>If you cannot select “</w:t>
+      </w:r>
+      <w:r>
+        <w:rPr>
+          <w:i/>
+          <w:iCs/>
+        </w:rPr>
+        <w:t>Mivry</w:t>
+      </w:r>
+      <w:r>
+        <w:rPr/>
+        <w:t>” as a type, either check step (2) if you’re using Bolt, or if you’re using VisualScripting open the Unity Project Settings and under “VisualScripting” click “Regenerate Nodes”.</w:t>
+      </w:r>
+    </w:p>
+    <w:p>
+      <w:pPr>
+        <w:pStyle w:val="Normal"/>
+        <w:rPr/>
+      </w:pPr>
+      <w:r>
+        <w:rPr/>
+        <w:drawing>
+          <wp:inline distT="0" distB="0" distL="0" distR="0">
+            <wp:extent cx="2943225" cy="1662430"/>
+            <wp:effectExtent l="0" t="0" r="0" b="0"/>
+            <wp:docPr id="10" name="Picture 9" descr=""/>
+            <wp:cNvGraphicFramePr>
+              <a:graphicFrameLocks xmlns:a="http://schemas.openxmlformats.org/drawingml/2006/main" noChangeAspect="1"/>
+            </wp:cNvGraphicFramePr>
+            <a:graphic xmlns:a="http://schemas.openxmlformats.org/drawingml/2006/main">
+              <a:graphicData uri="http://schemas.openxmlformats.org/drawingml/2006/picture">
+                <pic:pic xmlns:pic="http://schemas.openxmlformats.org/drawingml/2006/picture">
+                  <pic:nvPicPr>
+                    <pic:cNvPr id="10" name="Picture 9" descr=""/>
+                    <pic:cNvPicPr>
+                      <a:picLocks noChangeAspect="1" noChangeArrowheads="1"/>
+                    </pic:cNvPicPr>
+                  </pic:nvPicPr>
+                  <pic:blipFill>
+                    <a:blip r:embed="rId21"/>
                     <a:stretch>
                       <a:fillRect/>
                     </a:stretch>
@@ -4665,7 +4942,7 @@
       </w:pPr>
       <w:r>
         <w:rPr/>
-        <w:t xml:space="preserve">(6) In the Flow Graph, add a </w:t>
+        <w:t xml:space="preserve">(6) In the Script Graph (or Flow Graph when using Bolt), add a </w:t>
       </w:r>
       <w:r>
         <w:rPr>
@@ -4736,7 +5013,7 @@
         <w:rPr/>
         <w:t xml:space="preserve"> String to the name of your gesture.</w:t>
         <w:br/>
-        <w:t>This event will now be triggered when the user performed the gesture. You can use this event to trigger further changes in your own code or trigger a transition in a Bolt state machine.</w:t>
+        <w:t>This event will now be triggered when the user performed the gesture. You can use this event to trigger further changes in your own code or trigger a transition in a state machine.</w:t>
       </w:r>
     </w:p>
     <w:p>
@@ -4782,7 +5059,7 @@
           <wp:inline distT="0" distB="0" distL="0" distR="0">
             <wp:extent cx="5657850" cy="1466850"/>
             <wp:effectExtent l="0" t="0" r="0" b="0"/>
-            <wp:docPr id="10" name="Picture 10" descr=""/>
+            <wp:docPr id="11" name="Picture 10" descr=""/>
             <wp:cNvGraphicFramePr>
               <a:graphicFrameLocks xmlns:a="http://schemas.openxmlformats.org/drawingml/2006/main" noChangeAspect="1"/>
             </wp:cNvGraphicFramePr>
@@ -4790,13 +5067,13 @@
               <a:graphicData uri="http://schemas.openxmlformats.org/drawingml/2006/picture">
                 <pic:pic xmlns:pic="http://schemas.openxmlformats.org/drawingml/2006/picture">
                   <pic:nvPicPr>
-                    <pic:cNvPr id="10" name="Picture 10" descr=""/>
+                    <pic:cNvPr id="11" name="Picture 10" descr=""/>
                     <pic:cNvPicPr>
                       <a:picLocks noChangeAspect="1" noChangeArrowheads="1"/>
                     </pic:cNvPicPr>
                   </pic:nvPicPr>
                   <pic:blipFill>
-                    <a:blip r:embed="rId19"/>
+                    <a:blip r:embed="rId22"/>
                     <a:stretch>
                       <a:fillRect/>
                     </a:stretch>
@@ -4816,6 +5093,84 @@
           </wp:inline>
         </w:drawing>
       </w:r>
+    </w:p>
+    <w:p>
+      <w:pPr>
+        <w:pStyle w:val="Normal"/>
+        <w:rPr/>
+      </w:pPr>
+      <w:r>
+        <w:rPr/>
+      </w:r>
+    </w:p>
+    <w:p>
+      <w:pPr>
+        <w:pStyle w:val="Normal"/>
+        <w:rPr/>
+      </w:pPr>
+      <w:r>
+        <w:rPr/>
+        <w:t>You can also expose any of the “Parts” (ie gesture motions performed by one hand) to retrieve further information about how the user performed the gesture. In case of one-handed gestures, there will only be one part, in case of 2-handed gestures there will be two (left and right).</w:t>
+        <w:br/>
+        <w:t>From this part information you can for example use the “Primary Direction” at which the user performed the gesture motion to control the direction of a spell command triggered by the gesture.</w:t>
+      </w:r>
+    </w:p>
+    <w:p>
+      <w:pPr>
+        <w:pStyle w:val="Normal"/>
+        <w:rPr/>
+      </w:pPr>
+      <w:r>
+        <w:drawing>
+          <wp:anchor behindDoc="0" distT="0" distB="0" distL="0" distR="0" simplePos="0" locked="0" layoutInCell="0" allowOverlap="1" relativeHeight="15">
+            <wp:simplePos x="0" y="0"/>
+            <wp:positionH relativeFrom="column">
+              <wp:posOffset>54610</wp:posOffset>
+            </wp:positionH>
+            <wp:positionV relativeFrom="paragraph">
+              <wp:posOffset>54610</wp:posOffset>
+            </wp:positionV>
+            <wp:extent cx="5612130" cy="1706880"/>
+            <wp:effectExtent l="0" t="0" r="0" b="0"/>
+            <wp:wrapSquare wrapText="largest"/>
+            <wp:docPr id="12" name="Image2" descr=""/>
+            <wp:cNvGraphicFramePr>
+              <a:graphicFrameLocks xmlns:a="http://schemas.openxmlformats.org/drawingml/2006/main" noChangeAspect="1"/>
+            </wp:cNvGraphicFramePr>
+            <a:graphic xmlns:a="http://schemas.openxmlformats.org/drawingml/2006/main">
+              <a:graphicData uri="http://schemas.openxmlformats.org/drawingml/2006/picture">
+                <pic:pic xmlns:pic="http://schemas.openxmlformats.org/drawingml/2006/picture">
+                  <pic:nvPicPr>
+                    <pic:cNvPr id="12" name="Image2" descr=""/>
+                    <pic:cNvPicPr>
+                      <a:picLocks noChangeAspect="1" noChangeArrowheads="1"/>
+                    </pic:cNvPicPr>
+                  </pic:nvPicPr>
+                  <pic:blipFill>
+                    <a:blip r:embed="rId23"/>
+                    <a:stretch>
+                      <a:fillRect/>
+                    </a:stretch>
+                  </pic:blipFill>
+                  <pic:spPr bwMode="auto">
+                    <a:xfrm>
+                      <a:off x="0" y="0"/>
+                      <a:ext cx="5612130" cy="1706880"/>
+                    </a:xfrm>
+                    <a:prstGeom prst="rect">
+                      <a:avLst/>
+                    </a:prstGeom>
+                  </pic:spPr>
+                </pic:pic>
+              </a:graphicData>
+            </a:graphic>
+          </wp:anchor>
+        </w:drawing>
+      </w:r>
+      <w:r>
+        <w:rPr/>
+        <w:br/>
+      </w:r>
       <w:r>
         <w:br w:type="page"/>
       </w:r>
@@ -5371,7 +5726,7 @@
         <w:rPr/>
         <w:t xml:space="preserve">(5) In your project settings, make sure that your settings comply with the Oculus Quest requirements and best practices described at </w:t>
       </w:r>
-      <w:hyperlink r:id="rId20">
+      <w:hyperlink r:id="rId24">
         <w:r>
           <w:rPr>
             <w:rStyle w:val="Hyperlink"/>
@@ -5585,7 +5940,7 @@
         <w:pStyle w:val="ListParagraph"/>
         <w:rPr/>
       </w:pPr>
-      <w:hyperlink r:id="rId21">
+      <w:hyperlink r:id="rId25">
         <w:r>
           <w:rPr>
             <w:rStyle w:val="Hyperlink"/>
@@ -5927,7 +6282,7 @@
             <wp:extent cx="4207510" cy="1957705"/>
             <wp:effectExtent l="0" t="0" r="0" b="0"/>
             <wp:wrapSquare wrapText="largest"/>
-            <wp:docPr id="11" name="Picture 2" descr=""/>
+            <wp:docPr id="13" name="Picture 2" descr=""/>
             <wp:cNvGraphicFramePr>
               <a:graphicFrameLocks xmlns:a="http://schemas.openxmlformats.org/drawingml/2006/main" noChangeAspect="1"/>
             </wp:cNvGraphicFramePr>
@@ -5935,13 +6290,13 @@
               <a:graphicData uri="http://schemas.openxmlformats.org/drawingml/2006/picture">
                 <pic:pic xmlns:pic="http://schemas.openxmlformats.org/drawingml/2006/picture">
                   <pic:nvPicPr>
-                    <pic:cNvPr id="11" name="Picture 2" descr=""/>
+                    <pic:cNvPr id="13" name="Picture 2" descr=""/>
                     <pic:cNvPicPr>
                       <a:picLocks noChangeAspect="1" noChangeArrowheads="1"/>
                     </pic:cNvPicPr>
                   </pic:nvPicPr>
                   <pic:blipFill>
-                    <a:blip r:embed="rId22"/>
+                    <a:blip r:embed="rId26"/>
                     <a:stretch>
                       <a:fillRect/>
                     </a:stretch>
@@ -5972,7 +6327,7 @@
             <wp:extent cx="3751580" cy="2402205"/>
             <wp:effectExtent l="0" t="0" r="0" b="0"/>
             <wp:wrapSquare wrapText="largest"/>
-            <wp:docPr id="12" name="Picture 6" descr=""/>
+            <wp:docPr id="14" name="Picture 6" descr=""/>
             <wp:cNvGraphicFramePr>
               <a:graphicFrameLocks xmlns:a="http://schemas.openxmlformats.org/drawingml/2006/main" noChangeAspect="1"/>
             </wp:cNvGraphicFramePr>
@@ -5980,13 +6335,13 @@
               <a:graphicData uri="http://schemas.openxmlformats.org/drawingml/2006/picture">
                 <pic:pic xmlns:pic="http://schemas.openxmlformats.org/drawingml/2006/picture">
                   <pic:nvPicPr>
-                    <pic:cNvPr id="12" name="Picture 6" descr=""/>
+                    <pic:cNvPr id="14" name="Picture 6" descr=""/>
                     <pic:cNvPicPr>
                       <a:picLocks noChangeAspect="1" noChangeArrowheads="1"/>
                     </pic:cNvPicPr>
                   </pic:nvPicPr>
                   <pic:blipFill>
-                    <a:blip r:embed="rId23"/>
+                    <a:blip r:embed="rId27"/>
                     <a:stretch>
                       <a:fillRect/>
                     </a:stretch>
@@ -6085,7 +6440,7 @@
         </w:rPr>
         <w:t xml:space="preserve">You have used up all “free” gesture recognitions of the free version of MiVRy for this session. To identify more gestures, restart the app, or purchase an “unlimited” license at </w:t>
       </w:r>
-      <w:hyperlink r:id="rId24">
+      <w:hyperlink r:id="rId28">
         <w:r>
           <w:rPr>
             <w:rStyle w:val="Hyperlink"/>
@@ -6847,966 +7202,1151 @@
           <w:b/>
           <w:bCs/>
         </w:rPr>
-        <w:t>(1</w:t>
-      </w:r>
-      <w:r>
+        <w:t>(19) What are the “TrainingParameter”s which can be set?</w:t>
+      </w:r>
+    </w:p>
+    <w:p>
+      <w:pPr>
+        <w:pStyle w:val="ListParagraph"/>
+        <w:rPr/>
+      </w:pPr>
+      <w:r>
+        <w:rPr/>
+      </w:r>
+    </w:p>
+    <w:p>
+      <w:pPr>
+        <w:pStyle w:val="ListParagraph"/>
+        <w:rPr>
+          <w:rFonts w:ascii="Cascadia Code" w:hAnsi="Cascadia Code"/>
+          <w:sz w:val="14"/>
+          <w:szCs w:val="14"/>
+        </w:rPr>
+      </w:pPr>
+      <w:r>
+        <w:rPr>
+          <w:rFonts w:ascii="Cascadia Code" w:hAnsi="Cascadia Code"/>
+          <w:sz w:val="14"/>
+          <w:szCs w:val="14"/>
+        </w:rPr>
+        <w:t>The `setTrainingParameter` function allows you to define specific features of the AI training process. This is intended for advanced users to adust the training process for they specific requirements of their applications.</w:t>
+      </w:r>
+    </w:p>
+    <w:p>
+      <w:pPr>
+        <w:pStyle w:val="ListParagraph"/>
+        <w:rPr>
+          <w:rFonts w:ascii="Cascadia Code" w:hAnsi="Cascadia Code"/>
+          <w:sz w:val="14"/>
+          <w:szCs w:val="14"/>
+        </w:rPr>
+      </w:pPr>
+      <w:r>
+        <w:rPr>
+          <w:rFonts w:ascii="Cascadia Code" w:hAnsi="Cascadia Code"/>
+          <w:sz w:val="14"/>
+          <w:szCs w:val="14"/>
+        </w:rPr>
+        <w:t>The default for each parameter is "-1", which is to interactively adjust this value based on the progress during training.</w:t>
+        <w:br/>
+        <w:t>The meaning of the individual parameters is as follows:</w:t>
+      </w:r>
+    </w:p>
+    <w:p>
+      <w:pPr>
+        <w:pStyle w:val="ListParagraph"/>
+        <w:rPr>
+          <w:rFonts w:ascii="Cascadia Code" w:hAnsi="Cascadia Code"/>
+          <w:i/>
+          <w:i/>
+          <w:iCs/>
+          <w:sz w:val="14"/>
+          <w:szCs w:val="14"/>
+        </w:rPr>
+      </w:pPr>
+      <w:r>
+        <w:rPr>
+          <w:rFonts w:ascii="Cascadia Code" w:hAnsi="Cascadia Code"/>
+          <w:i/>
+          <w:iCs/>
+          <w:sz w:val="14"/>
+          <w:szCs w:val="14"/>
+        </w:rPr>
+        <w:br/>
+        <w:t xml:space="preserve"> Lambda (ID: 0)</w:t>
+      </w:r>
+    </w:p>
+    <w:p>
+      <w:pPr>
+        <w:pStyle w:val="ListParagraph"/>
+        <w:rPr>
+          <w:rFonts w:ascii="Cascadia Code" w:hAnsi="Cascadia Code"/>
+          <w:sz w:val="14"/>
+          <w:szCs w:val="14"/>
+        </w:rPr>
+      </w:pPr>
+      <w:r>
+        <w:rPr>
+          <w:rFonts w:ascii="Cascadia Code" w:hAnsi="Cascadia Code"/>
+          <w:sz w:val="14"/>
+          <w:szCs w:val="14"/>
+        </w:rPr>
+        <w:t>The 'lambda' parameter which controls the "speed" at which the training is performed.</w:t>
+      </w:r>
+    </w:p>
+    <w:p>
+      <w:pPr>
+        <w:pStyle w:val="ListParagraph"/>
+        <w:rPr>
+          <w:rFonts w:ascii="Cascadia Code" w:hAnsi="Cascadia Code"/>
+          <w:sz w:val="14"/>
+          <w:szCs w:val="14"/>
+        </w:rPr>
+      </w:pPr>
+      <w:r>
+        <w:rPr>
+          <w:rFonts w:ascii="Cascadia Code" w:hAnsi="Cascadia Code"/>
+          <w:sz w:val="14"/>
+          <w:szCs w:val="14"/>
+        </w:rPr>
+        <w:t>A higher value may speed up convergence to an optimal solution during training, but increases the risk of "derailing" ie not finding a good solution at all.</w:t>
+      </w:r>
+    </w:p>
+    <w:p>
+      <w:pPr>
+        <w:pStyle w:val="ListParagraph"/>
+        <w:rPr>
+          <w:rFonts w:ascii="Cascadia Code" w:hAnsi="Cascadia Code"/>
+          <w:sz w:val="14"/>
+          <w:szCs w:val="14"/>
+        </w:rPr>
+      </w:pPr>
+      <w:r>
+        <w:rPr>
+          <w:rFonts w:ascii="Cascadia Code" w:hAnsi="Cascadia Code"/>
+          <w:sz w:val="14"/>
+          <w:szCs w:val="14"/>
+        </w:rPr>
+      </w:r>
+    </w:p>
+    <w:p>
+      <w:pPr>
+        <w:pStyle w:val="ListParagraph"/>
+        <w:rPr>
+          <w:rFonts w:ascii="Cascadia Code" w:hAnsi="Cascadia Code"/>
+          <w:sz w:val="14"/>
+          <w:szCs w:val="14"/>
+        </w:rPr>
+      </w:pPr>
+      <w:r>
+        <w:rPr>
+          <w:rFonts w:ascii="Cascadia Code" w:hAnsi="Cascadia Code"/>
+          <w:sz w:val="14"/>
+          <w:szCs w:val="14"/>
+        </w:rPr>
+        <w:t xml:space="preserve"> </w:t>
+      </w:r>
+      <w:r>
+        <w:rPr>
+          <w:rFonts w:ascii="Cascadia Code" w:hAnsi="Cascadia Code"/>
+          <w:i/>
+          <w:iCs/>
+          <w:sz w:val="14"/>
+          <w:szCs w:val="14"/>
+        </w:rPr>
+        <w:t>NumberOfNodes (ID: 1)</w:t>
+      </w:r>
+    </w:p>
+    <w:p>
+      <w:pPr>
+        <w:pStyle w:val="ListParagraph"/>
+        <w:rPr>
+          <w:rFonts w:ascii="Cascadia Code" w:hAnsi="Cascadia Code"/>
+          <w:sz w:val="14"/>
+          <w:szCs w:val="14"/>
+        </w:rPr>
+      </w:pPr>
+      <w:r>
+        <w:rPr>
+          <w:rFonts w:ascii="Cascadia Code" w:hAnsi="Cascadia Code"/>
+          <w:sz w:val="14"/>
+          <w:szCs w:val="14"/>
+        </w:rPr>
+        <w:t>Sets the number of "neurons" (neural nodes) in each layer of the neural network.</w:t>
+      </w:r>
+    </w:p>
+    <w:p>
+      <w:pPr>
+        <w:pStyle w:val="ListParagraph"/>
+        <w:rPr>
+          <w:rFonts w:ascii="Cascadia Code" w:hAnsi="Cascadia Code"/>
+          <w:sz w:val="14"/>
+          <w:szCs w:val="14"/>
+        </w:rPr>
+      </w:pPr>
+      <w:r>
+        <w:rPr>
+          <w:rFonts w:ascii="Cascadia Code" w:hAnsi="Cascadia Code"/>
+          <w:sz w:val="14"/>
+          <w:szCs w:val="14"/>
+        </w:rPr>
+      </w:r>
+    </w:p>
+    <w:p>
+      <w:pPr>
+        <w:pStyle w:val="ListParagraph"/>
+        <w:rPr>
+          <w:rFonts w:ascii="Cascadia Code" w:hAnsi="Cascadia Code"/>
+          <w:sz w:val="14"/>
+          <w:szCs w:val="14"/>
+        </w:rPr>
+      </w:pPr>
+      <w:r>
+        <w:rPr>
+          <w:rFonts w:ascii="Cascadia Code" w:hAnsi="Cascadia Code"/>
+          <w:sz w:val="14"/>
+          <w:szCs w:val="14"/>
+        </w:rPr>
+        <w:t xml:space="preserve"> </w:t>
+      </w:r>
+      <w:r>
+        <w:rPr>
+          <w:rFonts w:ascii="Cascadia Code" w:hAnsi="Cascadia Code"/>
+          <w:i/>
+          <w:iCs/>
+          <w:sz w:val="14"/>
+          <w:szCs w:val="14"/>
+        </w:rPr>
+        <w:t>NumberOfLayers (ID: 2)</w:t>
+      </w:r>
+    </w:p>
+    <w:p>
+      <w:pPr>
+        <w:pStyle w:val="ListParagraph"/>
+        <w:rPr>
+          <w:rFonts w:ascii="Cascadia Code" w:hAnsi="Cascadia Code"/>
+          <w:sz w:val="14"/>
+          <w:szCs w:val="14"/>
+        </w:rPr>
+      </w:pPr>
+      <w:r>
+        <w:rPr>
+          <w:rFonts w:ascii="Cascadia Code" w:hAnsi="Cascadia Code"/>
+          <w:sz w:val="14"/>
+          <w:szCs w:val="14"/>
+        </w:rPr>
+        <w:t>Sets the number of layers in the neural network.</w:t>
+      </w:r>
+    </w:p>
+    <w:p>
+      <w:pPr>
+        <w:pStyle w:val="ListParagraph"/>
+        <w:rPr>
+          <w:rFonts w:ascii="Cascadia Code" w:hAnsi="Cascadia Code"/>
+          <w:sz w:val="14"/>
+          <w:szCs w:val="14"/>
+        </w:rPr>
+      </w:pPr>
+      <w:r>
+        <w:rPr>
+          <w:rFonts w:ascii="Cascadia Code" w:hAnsi="Cascadia Code"/>
+          <w:sz w:val="14"/>
+          <w:szCs w:val="14"/>
+        </w:rPr>
+      </w:r>
+    </w:p>
+    <w:p>
+      <w:pPr>
+        <w:pStyle w:val="ListParagraph"/>
+        <w:rPr>
+          <w:rFonts w:ascii="Cascadia Code" w:hAnsi="Cascadia Code"/>
+          <w:i/>
+          <w:i/>
+          <w:iCs/>
+          <w:sz w:val="14"/>
+          <w:szCs w:val="14"/>
+        </w:rPr>
+      </w:pPr>
+      <w:r>
+        <w:rPr>
+          <w:rFonts w:ascii="Cascadia Code" w:hAnsi="Cascadia Code"/>
+          <w:i/>
+          <w:iCs/>
+          <w:sz w:val="14"/>
+          <w:szCs w:val="14"/>
+        </w:rPr>
+        <w:t>SampleResolution (ID: 3)</w:t>
+      </w:r>
+    </w:p>
+    <w:p>
+      <w:pPr>
+        <w:pStyle w:val="ListParagraph"/>
+        <w:rPr>
+          <w:rFonts w:ascii="Cascadia Code" w:hAnsi="Cascadia Code"/>
+          <w:sz w:val="14"/>
+          <w:szCs w:val="14"/>
+        </w:rPr>
+      </w:pPr>
+      <w:r>
+        <w:rPr>
+          <w:rFonts w:ascii="Cascadia Code" w:hAnsi="Cascadia Code"/>
+          <w:sz w:val="14"/>
+          <w:szCs w:val="14"/>
+        </w:rPr>
+        <w:t>Sets the number of data points to use per sample (stroke).</w:t>
+      </w:r>
+    </w:p>
+    <w:p>
+      <w:pPr>
+        <w:pStyle w:val="ListParagraph"/>
+        <w:rPr>
+          <w:rFonts w:ascii="Cascadia Code" w:hAnsi="Cascadia Code"/>
+          <w:sz w:val="14"/>
+          <w:szCs w:val="14"/>
+        </w:rPr>
+      </w:pPr>
+      <w:r>
+        <w:rPr>
+          <w:rFonts w:ascii="Cascadia Code" w:hAnsi="Cascadia Code"/>
+          <w:sz w:val="14"/>
+          <w:szCs w:val="14"/>
+        </w:rPr>
+      </w:r>
+    </w:p>
+    <w:p>
+      <w:pPr>
+        <w:pStyle w:val="ListParagraph"/>
+        <w:rPr>
+          <w:rFonts w:ascii="Cascadia Code" w:hAnsi="Cascadia Code"/>
+          <w:i/>
+          <w:i/>
+          <w:iCs/>
+          <w:sz w:val="14"/>
+          <w:szCs w:val="14"/>
+        </w:rPr>
+      </w:pPr>
+      <w:r>
+        <w:rPr>
+          <w:rFonts w:ascii="Cascadia Code" w:hAnsi="Cascadia Code"/>
+          <w:i/>
+          <w:iCs/>
+          <w:sz w:val="14"/>
+          <w:szCs w:val="14"/>
+        </w:rPr>
+        <w:t xml:space="preserve"> </w:t>
+      </w:r>
+      <w:r>
+        <w:rPr>
+          <w:rFonts w:ascii="Cascadia Code" w:hAnsi="Cascadia Code"/>
+          <w:i/>
+          <w:iCs/>
+          <w:sz w:val="14"/>
+          <w:szCs w:val="14"/>
+        </w:rPr>
+        <w:t>ControllerRotation (ID: 4)</w:t>
+      </w:r>
+    </w:p>
+    <w:p>
+      <w:pPr>
+        <w:pStyle w:val="ListParagraph"/>
+        <w:rPr>
+          <w:rFonts w:ascii="Cascadia Code" w:hAnsi="Cascadia Code"/>
+          <w:sz w:val="14"/>
+          <w:szCs w:val="14"/>
+        </w:rPr>
+      </w:pPr>
+      <w:r>
+        <w:rPr>
+          <w:rFonts w:ascii="Cascadia Code" w:hAnsi="Cascadia Code"/>
+          <w:sz w:val="14"/>
+          <w:szCs w:val="14"/>
+        </w:rPr>
+        <w:t>Whether to use the orientation/rotation of the VR controller.</w:t>
+      </w:r>
+    </w:p>
+    <w:p>
+      <w:pPr>
+        <w:pStyle w:val="ListParagraph"/>
+        <w:rPr>
+          <w:rFonts w:ascii="Cascadia Code" w:hAnsi="Cascadia Code"/>
+          <w:sz w:val="14"/>
+          <w:szCs w:val="14"/>
+        </w:rPr>
+      </w:pPr>
+      <w:r>
+        <w:rPr>
+          <w:rFonts w:ascii="Cascadia Code" w:hAnsi="Cascadia Code"/>
+          <w:sz w:val="14"/>
+          <w:szCs w:val="14"/>
+        </w:rPr>
+        <w:t>"0" mean no, "1" means yes.</w:t>
+      </w:r>
+    </w:p>
+    <w:p>
+      <w:pPr>
+        <w:pStyle w:val="ListParagraph"/>
+        <w:rPr>
+          <w:rFonts w:ascii="Cascadia Code" w:hAnsi="Cascadia Code"/>
+          <w:sz w:val="14"/>
+          <w:szCs w:val="14"/>
+        </w:rPr>
+      </w:pPr>
+      <w:r>
+        <w:rPr>
+          <w:rFonts w:ascii="Cascadia Code" w:hAnsi="Cascadia Code"/>
+          <w:sz w:val="14"/>
+          <w:szCs w:val="14"/>
+        </w:rPr>
+      </w:r>
+    </w:p>
+    <w:p>
+      <w:pPr>
+        <w:pStyle w:val="ListParagraph"/>
+        <w:rPr>
+          <w:rFonts w:ascii="Cascadia Code" w:hAnsi="Cascadia Code"/>
+          <w:i/>
+          <w:i/>
+          <w:iCs/>
+          <w:sz w:val="14"/>
+          <w:szCs w:val="14"/>
+        </w:rPr>
+      </w:pPr>
+      <w:r>
+        <w:rPr>
+          <w:rFonts w:ascii="Cascadia Code" w:hAnsi="Cascadia Code"/>
+          <w:i/>
+          <w:iCs/>
+          <w:sz w:val="14"/>
+          <w:szCs w:val="14"/>
+        </w:rPr>
+        <w:t xml:space="preserve"> </w:t>
+      </w:r>
+      <w:r>
+        <w:rPr>
+          <w:rFonts w:ascii="Cascadia Code" w:hAnsi="Cascadia Code"/>
+          <w:i/>
+          <w:iCs/>
+          <w:sz w:val="14"/>
+          <w:szCs w:val="14"/>
+        </w:rPr>
+        <w:t>RotatePath (ID: 5)</w:t>
+      </w:r>
+    </w:p>
+    <w:p>
+      <w:pPr>
+        <w:pStyle w:val="ListParagraph"/>
+        <w:rPr>
+          <w:rFonts w:ascii="Cascadia Code" w:hAnsi="Cascadia Code"/>
+          <w:sz w:val="14"/>
+          <w:szCs w:val="14"/>
+        </w:rPr>
+      </w:pPr>
+      <w:r>
+        <w:rPr>
+          <w:rFonts w:ascii="Cascadia Code" w:hAnsi="Cascadia Code"/>
+          <w:sz w:val="14"/>
+          <w:szCs w:val="14"/>
+        </w:rPr>
+        <w:t>Training parameter for whether to use path rotation. "0" mean no, "1" means yes.</w:t>
+      </w:r>
+    </w:p>
+    <w:p>
+      <w:pPr>
+        <w:pStyle w:val="ListParagraph"/>
+        <w:rPr>
+          <w:rFonts w:ascii="Cascadia Code" w:hAnsi="Cascadia Code"/>
+          <w:sz w:val="14"/>
+          <w:szCs w:val="14"/>
+        </w:rPr>
+      </w:pPr>
+      <w:r>
+        <w:rPr>
+          <w:rFonts w:ascii="Cascadia Code" w:hAnsi="Cascadia Code"/>
+          <w:sz w:val="14"/>
+          <w:szCs w:val="14"/>
+        </w:rPr>
+      </w:r>
+    </w:p>
+    <w:p>
+      <w:pPr>
+        <w:pStyle w:val="ListParagraph"/>
+        <w:rPr>
+          <w:rFonts w:ascii="Cascadia Code" w:hAnsi="Cascadia Code"/>
+          <w:sz w:val="14"/>
+          <w:szCs w:val="14"/>
+        </w:rPr>
+      </w:pPr>
+      <w:r>
+        <w:rPr>
+          <w:rFonts w:ascii="Cascadia Code" w:hAnsi="Cascadia Code"/>
+          <w:sz w:val="14"/>
+          <w:szCs w:val="14"/>
+        </w:rPr>
+        <w:t xml:space="preserve"> </w:t>
+      </w:r>
+      <w:r>
+        <w:rPr>
+          <w:rFonts w:ascii="Cascadia Code" w:hAnsi="Cascadia Code"/>
+          <w:i/>
+          <w:iCs/>
+          <w:sz w:val="14"/>
+          <w:szCs w:val="14"/>
+        </w:rPr>
+        <w:t>ProfileAlgorithm (ID: 6)</w:t>
+      </w:r>
+    </w:p>
+    <w:p>
+      <w:pPr>
+        <w:pStyle w:val="ListParagraph"/>
+        <w:rPr>
+          <w:rFonts w:ascii="Cascadia Code" w:hAnsi="Cascadia Code"/>
+          <w:sz w:val="14"/>
+          <w:szCs w:val="14"/>
+        </w:rPr>
+      </w:pPr>
+      <w:r>
+        <w:rPr>
+          <w:rFonts w:ascii="Cascadia Code" w:hAnsi="Cascadia Code"/>
+          <w:sz w:val="14"/>
+          <w:szCs w:val="14"/>
+        </w:rPr>
+        <w:t>Which algorithm to use to represent the 3D shape of the gesture motion.</w:t>
+      </w:r>
+    </w:p>
+    <w:p>
+      <w:pPr>
+        <w:pStyle w:val="ListParagraph"/>
+        <w:rPr>
+          <w:rFonts w:ascii="Cascadia Code" w:hAnsi="Cascadia Code"/>
+          <w:sz w:val="14"/>
+          <w:szCs w:val="14"/>
+        </w:rPr>
+      </w:pPr>
+      <w:r>
+        <w:rPr>
+          <w:rFonts w:ascii="Cascadia Code" w:hAnsi="Cascadia Code"/>
+          <w:sz w:val="14"/>
+          <w:szCs w:val="14"/>
+        </w:rPr>
+        <w:t>MiVRy offers 5 algorithms which can be selected by their ID (0 through 4).</w:t>
+      </w:r>
+    </w:p>
+    <w:p>
+      <w:pPr>
+        <w:pStyle w:val="ListParagraph"/>
+        <w:rPr>
+          <w:rFonts w:ascii="Cascadia Code" w:hAnsi="Cascadia Code"/>
+          <w:sz w:val="14"/>
+          <w:szCs w:val="14"/>
+        </w:rPr>
+      </w:pPr>
+      <w:r>
+        <w:rPr>
+          <w:rFonts w:ascii="Cascadia Code" w:hAnsi="Cascadia Code"/>
+          <w:sz w:val="14"/>
+          <w:szCs w:val="14"/>
+        </w:rPr>
+      </w:r>
+    </w:p>
+    <w:p>
+      <w:pPr>
+        <w:pStyle w:val="ListParagraph"/>
+        <w:rPr>
+          <w:rFonts w:ascii="Cascadia Code" w:hAnsi="Cascadia Code"/>
+          <w:sz w:val="14"/>
+          <w:szCs w:val="14"/>
+        </w:rPr>
+      </w:pPr>
+      <w:r>
+        <w:rPr>
+          <w:rFonts w:ascii="Cascadia Code" w:hAnsi="Cascadia Code"/>
+          <w:sz w:val="14"/>
+          <w:szCs w:val="14"/>
+        </w:rPr>
+        <w:t xml:space="preserve"> </w:t>
+      </w:r>
+      <w:r>
+        <w:rPr>
+          <w:rFonts w:ascii="Cascadia Code" w:hAnsi="Cascadia Code"/>
+          <w:i/>
+          <w:iCs/>
+          <w:sz w:val="14"/>
+          <w:szCs w:val="14"/>
+        </w:rPr>
+        <w:t>OrientationAlgorithm (ID: 7)</w:t>
+      </w:r>
+    </w:p>
+    <w:p>
+      <w:pPr>
+        <w:pStyle w:val="ListParagraph"/>
+        <w:rPr>
+          <w:rFonts w:ascii="Cascadia Code" w:hAnsi="Cascadia Code"/>
+          <w:sz w:val="14"/>
+          <w:szCs w:val="14"/>
+        </w:rPr>
+      </w:pPr>
+      <w:r>
+        <w:rPr>
+          <w:rFonts w:ascii="Cascadia Code" w:hAnsi="Cascadia Code"/>
+          <w:sz w:val="14"/>
+          <w:szCs w:val="14"/>
+        </w:rPr>
+        <w:t>Which algorithm to use to interpret the orientation (direction) of the gesture motion.</w:t>
+      </w:r>
+    </w:p>
+    <w:p>
+      <w:pPr>
+        <w:pStyle w:val="ListParagraph"/>
+        <w:rPr>
+          <w:rFonts w:ascii="Cascadia Code" w:hAnsi="Cascadia Code"/>
+          <w:sz w:val="14"/>
+          <w:szCs w:val="14"/>
+        </w:rPr>
+      </w:pPr>
+      <w:r>
+        <w:rPr>
+          <w:rFonts w:ascii="Cascadia Code" w:hAnsi="Cascadia Code"/>
+          <w:sz w:val="14"/>
+          <w:szCs w:val="14"/>
+        </w:rPr>
+        <w:t>This affects the direction wich is returned as an optional parameter when a gesture was completed.</w:t>
+      </w:r>
+    </w:p>
+    <w:p>
+      <w:pPr>
+        <w:pStyle w:val="ListParagraph"/>
+        <w:rPr>
+          <w:rFonts w:ascii="Cascadia Code" w:hAnsi="Cascadia Code"/>
+          <w:sz w:val="14"/>
+          <w:szCs w:val="14"/>
+        </w:rPr>
+      </w:pPr>
+      <w:r>
+        <w:rPr>
+          <w:rFonts w:ascii="Cascadia Code" w:hAnsi="Cascadia Code"/>
+          <w:sz w:val="14"/>
+          <w:szCs w:val="14"/>
+        </w:rPr>
+        <w:t>MiVRy offers two different ways to calculate into which direction a gesture was performed which can be selected by their ID (either 0 or 1).</w:t>
+      </w:r>
+    </w:p>
+    <w:p>
+      <w:pPr>
+        <w:pStyle w:val="ListParagraph"/>
+        <w:rPr>
+          <w:rFonts w:ascii="Cascadia Code" w:hAnsi="Cascadia Code"/>
+          <w:sz w:val="14"/>
+          <w:szCs w:val="14"/>
+        </w:rPr>
+      </w:pPr>
+      <w:r>
+        <w:rPr>
+          <w:rFonts w:ascii="Cascadia Code" w:hAnsi="Cascadia Code"/>
+          <w:sz w:val="14"/>
+          <w:szCs w:val="14"/>
+        </w:rPr>
+      </w:r>
+    </w:p>
+    <w:p>
+      <w:pPr>
+        <w:pStyle w:val="ListParagraph"/>
+        <w:rPr>
+          <w:rFonts w:ascii="Cascadia Code" w:hAnsi="Cascadia Code"/>
+          <w:sz w:val="14"/>
+          <w:szCs w:val="14"/>
+        </w:rPr>
+      </w:pPr>
+      <w:r>
+        <w:rPr>
+          <w:rFonts w:ascii="Cascadia Code" w:hAnsi="Cascadia Code"/>
+          <w:sz w:val="14"/>
+          <w:szCs w:val="14"/>
+        </w:rPr>
+        <w:t xml:space="preserve"> </w:t>
+      </w:r>
+      <w:r>
+        <w:rPr>
+          <w:rFonts w:ascii="Cascadia Code" w:hAnsi="Cascadia Code"/>
+          <w:i/>
+          <w:iCs/>
+          <w:sz w:val="14"/>
+          <w:szCs w:val="14"/>
+        </w:rPr>
+        <w:t>PivotPoint (ID: 8)</w:t>
+      </w:r>
+    </w:p>
+    <w:p>
+      <w:pPr>
+        <w:pStyle w:val="ListParagraph"/>
+        <w:rPr>
+          <w:rFonts w:ascii="Cascadia Code" w:hAnsi="Cascadia Code"/>
+          <w:sz w:val="14"/>
+          <w:szCs w:val="14"/>
+        </w:rPr>
+      </w:pPr>
+      <w:r>
+        <w:rPr>
+          <w:rFonts w:ascii="Cascadia Code" w:hAnsi="Cascadia Code"/>
+          <w:sz w:val="14"/>
+          <w:szCs w:val="14"/>
+        </w:rPr>
+        <w:t>Sets which point along the gesture motion to use as basis point ("pivot").</w:t>
+      </w:r>
+    </w:p>
+    <w:p>
+      <w:pPr>
+        <w:pStyle w:val="ListParagraph"/>
+        <w:rPr>
+          <w:rFonts w:ascii="Cascadia Code" w:hAnsi="Cascadia Code"/>
+          <w:sz w:val="14"/>
+          <w:szCs w:val="14"/>
+        </w:rPr>
+      </w:pPr>
+      <w:r>
+        <w:rPr>
+          <w:rFonts w:ascii="Cascadia Code" w:hAnsi="Cascadia Code"/>
+          <w:sz w:val="14"/>
+          <w:szCs w:val="14"/>
+        </w:rPr>
+        <w:t>This can be either the start point (ID: 1) or the center point (ID: 0).</w:t>
+      </w:r>
+    </w:p>
+    <w:p>
+      <w:pPr>
+        <w:pStyle w:val="ListParagraph"/>
+        <w:rPr>
+          <w:rFonts w:ascii="Cascadia Code" w:hAnsi="Cascadia Code"/>
+          <w:sz w:val="14"/>
+          <w:szCs w:val="14"/>
+        </w:rPr>
+      </w:pPr>
+      <w:r>
+        <w:rPr>
+          <w:rFonts w:ascii="Cascadia Code" w:hAnsi="Cascadia Code"/>
+          <w:sz w:val="14"/>
+          <w:szCs w:val="14"/>
+        </w:rPr>
+      </w:r>
+    </w:p>
+    <w:p>
+      <w:pPr>
+        <w:pStyle w:val="ListParagraph"/>
+        <w:rPr>
+          <w:rFonts w:ascii="Cascadia Code" w:hAnsi="Cascadia Code"/>
+          <w:sz w:val="14"/>
+          <w:szCs w:val="14"/>
+        </w:rPr>
+      </w:pPr>
+      <w:r>
+        <w:rPr>
+          <w:rFonts w:ascii="Cascadia Code" w:hAnsi="Cascadia Code"/>
+          <w:sz w:val="14"/>
+          <w:szCs w:val="14"/>
+        </w:rPr>
+        <w:t xml:space="preserve"> </w:t>
+      </w:r>
+      <w:r>
+        <w:rPr>
+          <w:rFonts w:ascii="Cascadia Code" w:hAnsi="Cascadia Code"/>
+          <w:i/>
+          <w:iCs/>
+          <w:sz w:val="14"/>
+          <w:szCs w:val="14"/>
+        </w:rPr>
+        <w:t>ActivationFunction (ID: 9)</w:t>
+      </w:r>
+    </w:p>
+    <w:p>
+      <w:pPr>
+        <w:pStyle w:val="ListParagraph"/>
+        <w:rPr>
+          <w:rFonts w:ascii="Cascadia Code" w:hAnsi="Cascadia Code"/>
+          <w:sz w:val="14"/>
+          <w:szCs w:val="14"/>
+        </w:rPr>
+      </w:pPr>
+      <w:r>
+        <w:rPr>
+          <w:rFonts w:ascii="Cascadia Code" w:hAnsi="Cascadia Code"/>
+          <w:sz w:val="14"/>
+          <w:szCs w:val="14"/>
+        </w:rPr>
+        <w:t>Sets which activation function to use in each neuron of the neural network.</w:t>
+      </w:r>
+    </w:p>
+    <w:p>
+      <w:pPr>
+        <w:pStyle w:val="ListParagraph"/>
+        <w:rPr>
+          <w:rFonts w:ascii="Cascadia Code" w:hAnsi="Cascadia Code"/>
+          <w:sz w:val="14"/>
+          <w:szCs w:val="14"/>
+        </w:rPr>
+      </w:pPr>
+      <w:r>
+        <w:rPr>
+          <w:rFonts w:ascii="Cascadia Code" w:hAnsi="Cascadia Code"/>
+          <w:sz w:val="14"/>
+          <w:szCs w:val="14"/>
+        </w:rPr>
+        <w:t>MiVRy offers two possible activation functions which can be selected by their ID (0 or 1).</w:t>
+      </w:r>
+    </w:p>
+    <w:p>
+      <w:pPr>
+        <w:pStyle w:val="ListParagraph"/>
+        <w:rPr>
+          <w:rFonts w:ascii="Cascadia Code" w:hAnsi="Cascadia Code"/>
+          <w:sz w:val="14"/>
+          <w:szCs w:val="14"/>
+        </w:rPr>
+      </w:pPr>
+      <w:r>
+        <w:rPr>
+          <w:rFonts w:ascii="Cascadia Code" w:hAnsi="Cascadia Code"/>
+          <w:sz w:val="14"/>
+          <w:szCs w:val="14"/>
+        </w:rPr>
+      </w:r>
+    </w:p>
+    <w:p>
+      <w:pPr>
+        <w:pStyle w:val="ListParagraph"/>
+        <w:rPr>
+          <w:rFonts w:ascii="Cascadia Code" w:hAnsi="Cascadia Code"/>
+          <w:sz w:val="14"/>
+          <w:szCs w:val="14"/>
+        </w:rPr>
+      </w:pPr>
+      <w:r>
+        <w:rPr>
+          <w:rFonts w:ascii="Cascadia Code" w:hAnsi="Cascadia Code"/>
+          <w:sz w:val="14"/>
+          <w:szCs w:val="14"/>
+        </w:rPr>
+        <w:t xml:space="preserve"> </w:t>
+      </w:r>
+      <w:r>
+        <w:rPr>
+          <w:rFonts w:ascii="Cascadia Code" w:hAnsi="Cascadia Code"/>
+          <w:i/>
+          <w:iCs/>
+          <w:sz w:val="14"/>
+          <w:szCs w:val="14"/>
+        </w:rPr>
+        <w:t>ActivationFactor (ID: 10)</w:t>
+      </w:r>
+    </w:p>
+    <w:p>
+      <w:pPr>
+        <w:pStyle w:val="ListParagraph"/>
+        <w:rPr>
+          <w:rFonts w:ascii="Cascadia Code" w:hAnsi="Cascadia Code"/>
+          <w:sz w:val="14"/>
+          <w:szCs w:val="14"/>
+        </w:rPr>
+      </w:pPr>
+      <w:r>
+        <w:rPr>
+          <w:rFonts w:ascii="Cascadia Code" w:hAnsi="Cascadia Code"/>
+          <w:sz w:val="14"/>
+          <w:szCs w:val="14"/>
+        </w:rPr>
+        <w:t>Sets the activation factor to use in each neuron of the neural network.</w:t>
+      </w:r>
+    </w:p>
+    <w:p>
+      <w:pPr>
+        <w:pStyle w:val="ListParagraph"/>
+        <w:rPr>
+          <w:rFonts w:ascii="Cascadia Code" w:hAnsi="Cascadia Code"/>
+          <w:sz w:val="14"/>
+          <w:szCs w:val="14"/>
+        </w:rPr>
+      </w:pPr>
+      <w:r>
+        <w:rPr>
+          <w:rFonts w:ascii="Cascadia Code" w:hAnsi="Cascadia Code"/>
+          <w:sz w:val="14"/>
+          <w:szCs w:val="14"/>
+        </w:rPr>
+      </w:r>
+    </w:p>
+    <w:p>
+      <w:pPr>
+        <w:pStyle w:val="ListParagraph"/>
+        <w:rPr>
+          <w:rFonts w:ascii="Cascadia Code" w:hAnsi="Cascadia Code"/>
+          <w:sz w:val="14"/>
+          <w:szCs w:val="14"/>
+        </w:rPr>
+      </w:pPr>
+      <w:r>
+        <w:rPr>
+          <w:rFonts w:ascii="Cascadia Code" w:hAnsi="Cascadia Code"/>
+          <w:sz w:val="14"/>
+          <w:szCs w:val="14"/>
+        </w:rPr>
+        <w:t xml:space="preserve"> </w:t>
+      </w:r>
+      <w:r>
+        <w:rPr>
+          <w:rFonts w:ascii="Cascadia Code" w:hAnsi="Cascadia Code"/>
+          <w:i/>
+          <w:iCs/>
+          <w:sz w:val="14"/>
+          <w:szCs w:val="14"/>
+        </w:rPr>
+        <w:t>UseTimestamp (ID: 11)</w:t>
+      </w:r>
+    </w:p>
+    <w:p>
+      <w:pPr>
+        <w:pStyle w:val="ListParagraph"/>
+        <w:rPr>
+          <w:rFonts w:ascii="Cascadia Code" w:hAnsi="Cascadia Code"/>
+          <w:sz w:val="14"/>
+          <w:szCs w:val="14"/>
+        </w:rPr>
+      </w:pPr>
+      <w:r>
+        <w:rPr>
+          <w:rFonts w:ascii="Cascadia Code" w:hAnsi="Cascadia Code"/>
+          <w:sz w:val="14"/>
+          <w:szCs w:val="14"/>
+        </w:rPr>
+        <w:t>Sets whether the time (speed) of the gesture motion is used to identify the gesture.</w:t>
+      </w:r>
+    </w:p>
+    <w:p>
+      <w:pPr>
+        <w:pStyle w:val="ListParagraph"/>
+        <w:rPr>
+          <w:rFonts w:ascii="Cascadia Code" w:hAnsi="Cascadia Code"/>
+          <w:sz w:val="14"/>
+          <w:szCs w:val="14"/>
+        </w:rPr>
+      </w:pPr>
+      <w:r>
+        <w:rPr>
+          <w:rFonts w:ascii="Cascadia Code" w:hAnsi="Cascadia Code"/>
+          <w:sz w:val="14"/>
+          <w:szCs w:val="14"/>
+        </w:rPr>
+        <w:t>"0" mean no, "1" means yes.</w:t>
+      </w:r>
+    </w:p>
+    <w:p>
+      <w:pPr>
+        <w:pStyle w:val="ListParagraph"/>
+        <w:rPr>
+          <w:rFonts w:ascii="Cascadia Code" w:hAnsi="Cascadia Code"/>
+          <w:sz w:val="14"/>
+          <w:szCs w:val="14"/>
+        </w:rPr>
+      </w:pPr>
+      <w:r>
+        <w:rPr>
+          <w:rFonts w:ascii="Cascadia Code" w:hAnsi="Cascadia Code"/>
+          <w:sz w:val="14"/>
+          <w:szCs w:val="14"/>
+        </w:rPr>
+      </w:r>
+    </w:p>
+    <w:p>
+      <w:pPr>
+        <w:pStyle w:val="ListParagraph"/>
+        <w:rPr>
+          <w:rFonts w:ascii="Cascadia Code" w:hAnsi="Cascadia Code"/>
+          <w:sz w:val="14"/>
+          <w:szCs w:val="14"/>
+        </w:rPr>
+      </w:pPr>
+      <w:r>
+        <w:rPr>
+          <w:rFonts w:ascii="Cascadia Code" w:hAnsi="Cascadia Code"/>
+          <w:sz w:val="14"/>
+          <w:szCs w:val="14"/>
+        </w:rPr>
+        <w:t xml:space="preserve"> </w:t>
+      </w:r>
+      <w:r>
+        <w:rPr>
+          <w:rFonts w:ascii="Cascadia Code" w:hAnsi="Cascadia Code"/>
+          <w:i/>
+          <w:iCs/>
+          <w:sz w:val="14"/>
+          <w:szCs w:val="14"/>
+        </w:rPr>
+        <w:t>StrokeTypeOverride (ID: 11)</w:t>
+      </w:r>
+    </w:p>
+    <w:p>
+      <w:pPr>
+        <w:pStyle w:val="ListParagraph"/>
+        <w:rPr>
+          <w:rFonts w:ascii="Cascadia Code" w:hAnsi="Cascadia Code"/>
+          <w:sz w:val="14"/>
+          <w:szCs w:val="14"/>
+        </w:rPr>
+      </w:pPr>
+      <w:r>
+        <w:rPr>
+          <w:rFonts w:ascii="Cascadia Code" w:hAnsi="Cascadia Code"/>
+          <w:sz w:val="14"/>
+          <w:szCs w:val="14"/>
+        </w:rPr>
+        <w:t>Sets whether type of recorded sample gesture motions should be reinterpreted during training.</w:t>
+        <w:br/>
+        <w:t>"0" to interpret all samples as “normal”, "1" to interpret all samples as “continuous gesture identification”, -1 to not change the sample type.</w:t>
+      </w:r>
+    </w:p>
+    <w:p>
+      <w:pPr>
+        <w:pStyle w:val="ListParagraph"/>
+        <w:rPr>
+          <w:rFonts w:ascii="Cascadia Code" w:hAnsi="Cascadia Code"/>
+          <w:sz w:val="14"/>
+          <w:szCs w:val="14"/>
+        </w:rPr>
+      </w:pPr>
+      <w:r>
+        <w:rPr>
+          <w:rFonts w:ascii="Cascadia Code" w:hAnsi="Cascadia Code"/>
+          <w:sz w:val="14"/>
+          <w:szCs w:val="14"/>
+        </w:rPr>
+      </w:r>
+    </w:p>
+    <w:p>
+      <w:pPr>
+        <w:pStyle w:val="ListParagraph"/>
         <w:rPr>
           <w:b/>
           <w:bCs/>
         </w:rPr>
-        <w:t>9</w:t>
-      </w:r>
+      </w:pPr>
       <w:r>
         <w:rPr>
           <w:b/>
           <w:bCs/>
         </w:rPr>
-        <w:t xml:space="preserve">) </w:t>
-      </w:r>
-      <w:r>
-        <w:rPr>
-          <w:b/>
-          <w:bCs/>
-        </w:rPr>
-        <w:t>What are the “TrainingParameter”s which can be set</w:t>
-      </w:r>
-      <w:r>
-        <w:rPr>
-          <w:b/>
-          <w:bCs/>
-        </w:rPr>
-        <w:t>?</w:t>
-      </w:r>
-    </w:p>
-    <w:p>
-      <w:pPr>
-        <w:pStyle w:val="ListParagraph"/>
-        <w:rPr/>
-      </w:pPr>
-      <w:r>
-        <w:rPr/>
-      </w:r>
-    </w:p>
-    <w:p>
-      <w:pPr>
-        <w:pStyle w:val="ListParagraph"/>
-        <w:rPr>
-          <w:rFonts w:ascii="Cascadia Code" w:hAnsi="Cascadia Code"/>
-          <w:sz w:val="14"/>
-          <w:szCs w:val="14"/>
-        </w:rPr>
-      </w:pPr>
-      <w:r>
-        <w:rPr>
-          <w:rFonts w:ascii="Cascadia Code" w:hAnsi="Cascadia Code"/>
-          <w:sz w:val="14"/>
-          <w:szCs w:val="14"/>
-        </w:rPr>
-        <w:t>The `setTrainingParameter` function allows you to define specific features of the AI training process. This is intended for advanced users to adust the training process for they specific requirements of their applications.</w:t>
-      </w:r>
-    </w:p>
-    <w:p>
-      <w:pPr>
-        <w:pStyle w:val="ListParagraph"/>
-        <w:rPr>
-          <w:rFonts w:ascii="Cascadia Code" w:hAnsi="Cascadia Code"/>
-          <w:sz w:val="14"/>
-          <w:szCs w:val="14"/>
-        </w:rPr>
-      </w:pPr>
-      <w:r>
-        <w:rPr>
-          <w:rFonts w:ascii="Cascadia Code" w:hAnsi="Cascadia Code"/>
-          <w:sz w:val="14"/>
-          <w:szCs w:val="14"/>
-        </w:rPr>
-        <w:t>The default for each parameter is "-1", which is to interactively adjust this value based on the progress during training.</w:t>
-        <w:br/>
-        <w:t>The meaning of the individual parameters is as follows:</w:t>
-      </w:r>
-    </w:p>
-    <w:p>
-      <w:pPr>
-        <w:pStyle w:val="ListParagraph"/>
-        <w:rPr>
-          <w:rFonts w:ascii="Cascadia Code" w:hAnsi="Cascadia Code"/>
-          <w:i/>
-          <w:i/>
-          <w:iCs/>
-          <w:sz w:val="14"/>
-          <w:szCs w:val="14"/>
-        </w:rPr>
-      </w:pPr>
-      <w:r>
-        <w:rPr>
-          <w:rFonts w:ascii="Cascadia Code" w:hAnsi="Cascadia Code"/>
-          <w:i/>
-          <w:iCs/>
-          <w:sz w:val="14"/>
-          <w:szCs w:val="14"/>
-        </w:rPr>
-        <w:br/>
-        <w:t xml:space="preserve"> Lambda (ID: 0)</w:t>
-      </w:r>
-    </w:p>
-    <w:p>
-      <w:pPr>
-        <w:pStyle w:val="ListParagraph"/>
-        <w:rPr>
-          <w:rFonts w:ascii="Cascadia Code" w:hAnsi="Cascadia Code"/>
-          <w:sz w:val="14"/>
-          <w:szCs w:val="14"/>
-        </w:rPr>
-      </w:pPr>
-      <w:r>
-        <w:rPr>
-          <w:rFonts w:ascii="Cascadia Code" w:hAnsi="Cascadia Code"/>
-          <w:sz w:val="14"/>
-          <w:szCs w:val="14"/>
-        </w:rPr>
-        <w:t>The 'lambda' parameter which controls the "speed" at which the training is performed.</w:t>
-      </w:r>
-    </w:p>
-    <w:p>
-      <w:pPr>
-        <w:pStyle w:val="ListParagraph"/>
-        <w:rPr>
-          <w:rFonts w:ascii="Cascadia Code" w:hAnsi="Cascadia Code"/>
-          <w:sz w:val="14"/>
-          <w:szCs w:val="14"/>
-        </w:rPr>
-      </w:pPr>
-      <w:r>
-        <w:rPr>
-          <w:rFonts w:ascii="Cascadia Code" w:hAnsi="Cascadia Code"/>
-          <w:sz w:val="14"/>
-          <w:szCs w:val="14"/>
-        </w:rPr>
-        <w:t>A higher value may speed up convergence to an optimal solution during training, but increases the risk of "derailing" ie not finding a good solution at all.</w:t>
-      </w:r>
-    </w:p>
-    <w:p>
-      <w:pPr>
-        <w:pStyle w:val="ListParagraph"/>
-        <w:rPr>
-          <w:rFonts w:ascii="Cascadia Code" w:hAnsi="Cascadia Code"/>
-          <w:sz w:val="14"/>
-          <w:szCs w:val="14"/>
-        </w:rPr>
-      </w:pPr>
-      <w:r>
-        <w:rPr>
-          <w:rFonts w:ascii="Cascadia Code" w:hAnsi="Cascadia Code"/>
-          <w:sz w:val="14"/>
-          <w:szCs w:val="14"/>
-        </w:rPr>
-      </w:r>
-    </w:p>
-    <w:p>
-      <w:pPr>
-        <w:pStyle w:val="ListParagraph"/>
-        <w:rPr>
-          <w:rFonts w:ascii="Cascadia Code" w:hAnsi="Cascadia Code"/>
-          <w:sz w:val="14"/>
-          <w:szCs w:val="14"/>
-        </w:rPr>
-      </w:pPr>
-      <w:r>
-        <w:rPr>
-          <w:rFonts w:ascii="Cascadia Code" w:hAnsi="Cascadia Code"/>
-          <w:sz w:val="14"/>
-          <w:szCs w:val="14"/>
-        </w:rPr>
-        <w:t xml:space="preserve"> </w:t>
-      </w:r>
-      <w:r>
-        <w:rPr>
-          <w:rFonts w:ascii="Cascadia Code" w:hAnsi="Cascadia Code"/>
-          <w:i/>
-          <w:iCs/>
-          <w:sz w:val="14"/>
-          <w:szCs w:val="14"/>
-        </w:rPr>
-        <w:t>NumberOfNodes (ID: 1)</w:t>
-      </w:r>
-    </w:p>
-    <w:p>
-      <w:pPr>
-        <w:pStyle w:val="ListParagraph"/>
-        <w:rPr>
-          <w:rFonts w:ascii="Cascadia Code" w:hAnsi="Cascadia Code"/>
-          <w:sz w:val="14"/>
-          <w:szCs w:val="14"/>
-        </w:rPr>
-      </w:pPr>
-      <w:r>
-        <w:rPr>
-          <w:rFonts w:ascii="Cascadia Code" w:hAnsi="Cascadia Code"/>
-          <w:sz w:val="14"/>
-          <w:szCs w:val="14"/>
-        </w:rPr>
-        <w:t>Sets the number of "neurons" (neural nodes) in each layer of the neural network.</w:t>
-      </w:r>
-    </w:p>
-    <w:p>
-      <w:pPr>
-        <w:pStyle w:val="ListParagraph"/>
-        <w:rPr>
-          <w:rFonts w:ascii="Cascadia Code" w:hAnsi="Cascadia Code"/>
-          <w:sz w:val="14"/>
-          <w:szCs w:val="14"/>
-        </w:rPr>
-      </w:pPr>
-      <w:r>
-        <w:rPr>
-          <w:rFonts w:ascii="Cascadia Code" w:hAnsi="Cascadia Code"/>
-          <w:sz w:val="14"/>
-          <w:szCs w:val="14"/>
-        </w:rPr>
-      </w:r>
-    </w:p>
-    <w:p>
-      <w:pPr>
-        <w:pStyle w:val="ListParagraph"/>
-        <w:rPr>
-          <w:rFonts w:ascii="Cascadia Code" w:hAnsi="Cascadia Code"/>
-          <w:sz w:val="14"/>
-          <w:szCs w:val="14"/>
-        </w:rPr>
-      </w:pPr>
-      <w:r>
-        <w:rPr>
-          <w:rFonts w:ascii="Cascadia Code" w:hAnsi="Cascadia Code"/>
-          <w:sz w:val="14"/>
-          <w:szCs w:val="14"/>
-        </w:rPr>
-        <w:t xml:space="preserve"> </w:t>
-      </w:r>
-      <w:r>
-        <w:rPr>
-          <w:rFonts w:ascii="Cascadia Code" w:hAnsi="Cascadia Code"/>
-          <w:i/>
-          <w:iCs/>
-          <w:sz w:val="14"/>
-          <w:szCs w:val="14"/>
-        </w:rPr>
-        <w:t>NumberOfLayers (ID: 2)</w:t>
-      </w:r>
-    </w:p>
-    <w:p>
-      <w:pPr>
-        <w:pStyle w:val="ListParagraph"/>
-        <w:rPr>
-          <w:rFonts w:ascii="Cascadia Code" w:hAnsi="Cascadia Code"/>
-          <w:sz w:val="14"/>
-          <w:szCs w:val="14"/>
-        </w:rPr>
-      </w:pPr>
-      <w:r>
-        <w:rPr>
-          <w:rFonts w:ascii="Cascadia Code" w:hAnsi="Cascadia Code"/>
-          <w:sz w:val="14"/>
-          <w:szCs w:val="14"/>
-        </w:rPr>
-        <w:t>Sets the number of layers in the neural network.</w:t>
-      </w:r>
-    </w:p>
-    <w:p>
-      <w:pPr>
-        <w:pStyle w:val="ListParagraph"/>
-        <w:rPr>
-          <w:rFonts w:ascii="Cascadia Code" w:hAnsi="Cascadia Code"/>
-          <w:sz w:val="14"/>
-          <w:szCs w:val="14"/>
-        </w:rPr>
-      </w:pPr>
-      <w:r>
-        <w:rPr>
-          <w:rFonts w:ascii="Cascadia Code" w:hAnsi="Cascadia Code"/>
-          <w:sz w:val="14"/>
-          <w:szCs w:val="14"/>
-        </w:rPr>
-      </w:r>
-    </w:p>
-    <w:p>
-      <w:pPr>
-        <w:pStyle w:val="ListParagraph"/>
-        <w:rPr>
-          <w:rFonts w:ascii="Cascadia Code" w:hAnsi="Cascadia Code"/>
-          <w:i/>
-          <w:i/>
-          <w:iCs/>
-          <w:sz w:val="14"/>
-          <w:szCs w:val="14"/>
-        </w:rPr>
-      </w:pPr>
-      <w:r>
-        <w:rPr>
-          <w:rFonts w:ascii="Cascadia Code" w:hAnsi="Cascadia Code"/>
-          <w:i/>
-          <w:iCs/>
-          <w:sz w:val="14"/>
-          <w:szCs w:val="14"/>
-        </w:rPr>
-        <w:t>SampleResolution (ID: 3)</w:t>
-      </w:r>
-    </w:p>
-    <w:p>
-      <w:pPr>
-        <w:pStyle w:val="ListParagraph"/>
-        <w:rPr>
-          <w:rFonts w:ascii="Cascadia Code" w:hAnsi="Cascadia Code"/>
-          <w:sz w:val="14"/>
-          <w:szCs w:val="14"/>
-        </w:rPr>
-      </w:pPr>
-      <w:r>
-        <w:rPr>
-          <w:rFonts w:ascii="Cascadia Code" w:hAnsi="Cascadia Code"/>
-          <w:sz w:val="14"/>
-          <w:szCs w:val="14"/>
-        </w:rPr>
-        <w:t>Sets the number of data points to use per sample (stroke).</w:t>
-      </w:r>
-    </w:p>
-    <w:p>
-      <w:pPr>
-        <w:pStyle w:val="ListParagraph"/>
-        <w:rPr>
-          <w:rFonts w:ascii="Cascadia Code" w:hAnsi="Cascadia Code"/>
-          <w:sz w:val="14"/>
-          <w:szCs w:val="14"/>
-        </w:rPr>
-      </w:pPr>
-      <w:r>
-        <w:rPr>
-          <w:rFonts w:ascii="Cascadia Code" w:hAnsi="Cascadia Code"/>
-          <w:sz w:val="14"/>
-          <w:szCs w:val="14"/>
-        </w:rPr>
-      </w:r>
-    </w:p>
-    <w:p>
-      <w:pPr>
-        <w:pStyle w:val="ListParagraph"/>
-        <w:rPr>
-          <w:rFonts w:ascii="Cascadia Code" w:hAnsi="Cascadia Code"/>
-          <w:i/>
-          <w:i/>
-          <w:iCs/>
-          <w:sz w:val="14"/>
-          <w:szCs w:val="14"/>
-        </w:rPr>
-      </w:pPr>
-      <w:r>
-        <w:rPr>
-          <w:rFonts w:ascii="Cascadia Code" w:hAnsi="Cascadia Code"/>
-          <w:i/>
-          <w:iCs/>
-          <w:sz w:val="14"/>
-          <w:szCs w:val="14"/>
-        </w:rPr>
-        <w:t xml:space="preserve"> </w:t>
-      </w:r>
-      <w:r>
-        <w:rPr>
-          <w:rFonts w:ascii="Cascadia Code" w:hAnsi="Cascadia Code"/>
-          <w:i/>
-          <w:iCs/>
-          <w:sz w:val="14"/>
-          <w:szCs w:val="14"/>
-        </w:rPr>
-        <w:t>ControllerRotation (ID: 4)</w:t>
-      </w:r>
-    </w:p>
-    <w:p>
-      <w:pPr>
-        <w:pStyle w:val="ListParagraph"/>
-        <w:rPr>
-          <w:rFonts w:ascii="Cascadia Code" w:hAnsi="Cascadia Code"/>
-          <w:sz w:val="14"/>
-          <w:szCs w:val="14"/>
-        </w:rPr>
-      </w:pPr>
-      <w:r>
-        <w:rPr>
-          <w:rFonts w:ascii="Cascadia Code" w:hAnsi="Cascadia Code"/>
-          <w:sz w:val="14"/>
-          <w:szCs w:val="14"/>
-        </w:rPr>
-        <w:t>Whether to use the orientation/rotation of the VR controller.</w:t>
-      </w:r>
-    </w:p>
-    <w:p>
-      <w:pPr>
-        <w:pStyle w:val="ListParagraph"/>
-        <w:rPr>
-          <w:rFonts w:ascii="Cascadia Code" w:hAnsi="Cascadia Code"/>
-          <w:sz w:val="14"/>
-          <w:szCs w:val="14"/>
-        </w:rPr>
-      </w:pPr>
-      <w:r>
-        <w:rPr>
-          <w:rFonts w:ascii="Cascadia Code" w:hAnsi="Cascadia Code"/>
-          <w:sz w:val="14"/>
-          <w:szCs w:val="14"/>
-        </w:rPr>
-        <w:t>"0" mean no, "1" means yes.</w:t>
-      </w:r>
-    </w:p>
-    <w:p>
-      <w:pPr>
-        <w:pStyle w:val="ListParagraph"/>
-        <w:rPr>
-          <w:rFonts w:ascii="Cascadia Code" w:hAnsi="Cascadia Code"/>
-          <w:sz w:val="14"/>
-          <w:szCs w:val="14"/>
-        </w:rPr>
-      </w:pPr>
-      <w:r>
-        <w:rPr>
-          <w:rFonts w:ascii="Cascadia Code" w:hAnsi="Cascadia Code"/>
-          <w:sz w:val="14"/>
-          <w:szCs w:val="14"/>
-        </w:rPr>
-      </w:r>
-    </w:p>
-    <w:p>
-      <w:pPr>
-        <w:pStyle w:val="ListParagraph"/>
-        <w:rPr>
-          <w:rFonts w:ascii="Cascadia Code" w:hAnsi="Cascadia Code"/>
-          <w:i/>
-          <w:i/>
-          <w:iCs/>
-          <w:sz w:val="14"/>
-          <w:szCs w:val="14"/>
-        </w:rPr>
-      </w:pPr>
-      <w:r>
-        <w:rPr>
-          <w:rFonts w:ascii="Cascadia Code" w:hAnsi="Cascadia Code"/>
-          <w:i/>
-          <w:iCs/>
-          <w:sz w:val="14"/>
-          <w:szCs w:val="14"/>
-        </w:rPr>
-        <w:t xml:space="preserve"> </w:t>
-      </w:r>
-      <w:r>
-        <w:rPr>
-          <w:rFonts w:ascii="Cascadia Code" w:hAnsi="Cascadia Code"/>
-          <w:i/>
-          <w:iCs/>
-          <w:sz w:val="14"/>
-          <w:szCs w:val="14"/>
-        </w:rPr>
-        <w:t>RotatePath (ID: 5)</w:t>
-      </w:r>
-    </w:p>
-    <w:p>
-      <w:pPr>
-        <w:pStyle w:val="ListParagraph"/>
-        <w:rPr>
-          <w:rFonts w:ascii="Cascadia Code" w:hAnsi="Cascadia Code"/>
-          <w:sz w:val="14"/>
-          <w:szCs w:val="14"/>
-        </w:rPr>
-      </w:pPr>
-      <w:r>
-        <w:rPr>
-          <w:rFonts w:ascii="Cascadia Code" w:hAnsi="Cascadia Code"/>
-          <w:sz w:val="14"/>
-          <w:szCs w:val="14"/>
-        </w:rPr>
-        <w:t>Training parameter for whether to use path rotation. "0" mean no, "1" means yes.</w:t>
-      </w:r>
-    </w:p>
-    <w:p>
-      <w:pPr>
-        <w:pStyle w:val="ListParagraph"/>
-        <w:rPr>
-          <w:rFonts w:ascii="Cascadia Code" w:hAnsi="Cascadia Code"/>
-          <w:sz w:val="14"/>
-          <w:szCs w:val="14"/>
-        </w:rPr>
-      </w:pPr>
-      <w:r>
-        <w:rPr>
-          <w:rFonts w:ascii="Cascadia Code" w:hAnsi="Cascadia Code"/>
-          <w:sz w:val="14"/>
-          <w:szCs w:val="14"/>
-        </w:rPr>
-      </w:r>
-    </w:p>
-    <w:p>
-      <w:pPr>
-        <w:pStyle w:val="ListParagraph"/>
-        <w:rPr>
-          <w:rFonts w:ascii="Cascadia Code" w:hAnsi="Cascadia Code"/>
-          <w:sz w:val="14"/>
-          <w:szCs w:val="14"/>
-        </w:rPr>
-      </w:pPr>
-      <w:r>
-        <w:rPr>
-          <w:rFonts w:ascii="Cascadia Code" w:hAnsi="Cascadia Code"/>
-          <w:sz w:val="14"/>
-          <w:szCs w:val="14"/>
-        </w:rPr>
-        <w:t xml:space="preserve"> </w:t>
-      </w:r>
-      <w:r>
-        <w:rPr>
-          <w:rFonts w:ascii="Cascadia Code" w:hAnsi="Cascadia Code"/>
-          <w:i/>
-          <w:iCs/>
-          <w:sz w:val="14"/>
-          <w:szCs w:val="14"/>
-        </w:rPr>
-        <w:t>ProfileAlgorithm (ID: 6)</w:t>
-      </w:r>
-    </w:p>
-    <w:p>
-      <w:pPr>
-        <w:pStyle w:val="ListParagraph"/>
-        <w:rPr>
-          <w:rFonts w:ascii="Cascadia Code" w:hAnsi="Cascadia Code"/>
-          <w:sz w:val="14"/>
-          <w:szCs w:val="14"/>
-        </w:rPr>
-      </w:pPr>
-      <w:r>
-        <w:rPr>
-          <w:rFonts w:ascii="Cascadia Code" w:hAnsi="Cascadia Code"/>
-          <w:sz w:val="14"/>
-          <w:szCs w:val="14"/>
-        </w:rPr>
-        <w:t>Which algorithm to use to represent the 3D shape of the gesture motion.</w:t>
-      </w:r>
-    </w:p>
-    <w:p>
-      <w:pPr>
-        <w:pStyle w:val="ListParagraph"/>
-        <w:rPr>
-          <w:rFonts w:ascii="Cascadia Code" w:hAnsi="Cascadia Code"/>
-          <w:sz w:val="14"/>
-          <w:szCs w:val="14"/>
-        </w:rPr>
-      </w:pPr>
-      <w:r>
-        <w:rPr>
-          <w:rFonts w:ascii="Cascadia Code" w:hAnsi="Cascadia Code"/>
-          <w:sz w:val="14"/>
-          <w:szCs w:val="14"/>
-        </w:rPr>
-        <w:t>MiVRy offers 5 algorithms which can be selected by their ID (0 through 4).</w:t>
-      </w:r>
-    </w:p>
-    <w:p>
-      <w:pPr>
-        <w:pStyle w:val="ListParagraph"/>
-        <w:rPr>
-          <w:rFonts w:ascii="Cascadia Code" w:hAnsi="Cascadia Code"/>
-          <w:sz w:val="14"/>
-          <w:szCs w:val="14"/>
-        </w:rPr>
-      </w:pPr>
-      <w:r>
-        <w:rPr>
-          <w:rFonts w:ascii="Cascadia Code" w:hAnsi="Cascadia Code"/>
-          <w:sz w:val="14"/>
-          <w:szCs w:val="14"/>
-        </w:rPr>
-      </w:r>
-    </w:p>
-    <w:p>
-      <w:pPr>
-        <w:pStyle w:val="ListParagraph"/>
-        <w:rPr>
-          <w:rFonts w:ascii="Cascadia Code" w:hAnsi="Cascadia Code"/>
-          <w:sz w:val="14"/>
-          <w:szCs w:val="14"/>
-        </w:rPr>
-      </w:pPr>
-      <w:r>
-        <w:rPr>
-          <w:rFonts w:ascii="Cascadia Code" w:hAnsi="Cascadia Code"/>
-          <w:sz w:val="14"/>
-          <w:szCs w:val="14"/>
-        </w:rPr>
-        <w:t xml:space="preserve"> </w:t>
-      </w:r>
-      <w:r>
-        <w:rPr>
-          <w:rFonts w:ascii="Cascadia Code" w:hAnsi="Cascadia Code"/>
-          <w:i/>
-          <w:iCs/>
-          <w:sz w:val="14"/>
-          <w:szCs w:val="14"/>
-        </w:rPr>
-        <w:t>OrientationAlgorithm (ID: 7)</w:t>
-      </w:r>
-    </w:p>
-    <w:p>
-      <w:pPr>
-        <w:pStyle w:val="ListParagraph"/>
-        <w:rPr>
-          <w:rFonts w:ascii="Cascadia Code" w:hAnsi="Cascadia Code"/>
-          <w:sz w:val="14"/>
-          <w:szCs w:val="14"/>
-        </w:rPr>
-      </w:pPr>
-      <w:r>
-        <w:rPr>
-          <w:rFonts w:ascii="Cascadia Code" w:hAnsi="Cascadia Code"/>
-          <w:sz w:val="14"/>
-          <w:szCs w:val="14"/>
-        </w:rPr>
-        <w:t>Which algorithm to use to interpret the orientation (direction) of the gesture motion.</w:t>
-      </w:r>
-    </w:p>
-    <w:p>
-      <w:pPr>
-        <w:pStyle w:val="ListParagraph"/>
-        <w:rPr>
-          <w:rFonts w:ascii="Cascadia Code" w:hAnsi="Cascadia Code"/>
-          <w:sz w:val="14"/>
-          <w:szCs w:val="14"/>
-        </w:rPr>
-      </w:pPr>
-      <w:r>
-        <w:rPr>
-          <w:rFonts w:ascii="Cascadia Code" w:hAnsi="Cascadia Code"/>
-          <w:sz w:val="14"/>
-          <w:szCs w:val="14"/>
-        </w:rPr>
-        <w:t>This affects the direction wich is returned as an optional parameter when a gesture was completed.</w:t>
-      </w:r>
-    </w:p>
-    <w:p>
-      <w:pPr>
-        <w:pStyle w:val="ListParagraph"/>
-        <w:rPr>
-          <w:rFonts w:ascii="Cascadia Code" w:hAnsi="Cascadia Code"/>
-          <w:sz w:val="14"/>
-          <w:szCs w:val="14"/>
-        </w:rPr>
-      </w:pPr>
-      <w:r>
-        <w:rPr>
-          <w:rFonts w:ascii="Cascadia Code" w:hAnsi="Cascadia Code"/>
-          <w:sz w:val="14"/>
-          <w:szCs w:val="14"/>
-        </w:rPr>
-        <w:t>MiVRy offers two different ways to calculate into which direction a gesture was performed which can be selected by their ID (either 0 or 1).</w:t>
-      </w:r>
-    </w:p>
-    <w:p>
-      <w:pPr>
-        <w:pStyle w:val="ListParagraph"/>
-        <w:rPr>
-          <w:rFonts w:ascii="Cascadia Code" w:hAnsi="Cascadia Code"/>
-          <w:sz w:val="14"/>
-          <w:szCs w:val="14"/>
-        </w:rPr>
-      </w:pPr>
-      <w:r>
-        <w:rPr>
-          <w:rFonts w:ascii="Cascadia Code" w:hAnsi="Cascadia Code"/>
-          <w:sz w:val="14"/>
-          <w:szCs w:val="14"/>
-        </w:rPr>
-      </w:r>
-    </w:p>
-    <w:p>
-      <w:pPr>
-        <w:pStyle w:val="ListParagraph"/>
-        <w:rPr>
-          <w:rFonts w:ascii="Cascadia Code" w:hAnsi="Cascadia Code"/>
-          <w:sz w:val="14"/>
-          <w:szCs w:val="14"/>
-        </w:rPr>
-      </w:pPr>
-      <w:r>
-        <w:rPr>
-          <w:rFonts w:ascii="Cascadia Code" w:hAnsi="Cascadia Code"/>
-          <w:sz w:val="14"/>
-          <w:szCs w:val="14"/>
-        </w:rPr>
-        <w:t xml:space="preserve"> </w:t>
-      </w:r>
-      <w:r>
-        <w:rPr>
-          <w:rFonts w:ascii="Cascadia Code" w:hAnsi="Cascadia Code"/>
-          <w:i/>
-          <w:iCs/>
-          <w:sz w:val="14"/>
-          <w:szCs w:val="14"/>
-        </w:rPr>
-        <w:t>PivotPoint (ID: 8)</w:t>
-      </w:r>
-    </w:p>
-    <w:p>
-      <w:pPr>
-        <w:pStyle w:val="ListParagraph"/>
-        <w:rPr>
-          <w:rFonts w:ascii="Cascadia Code" w:hAnsi="Cascadia Code"/>
-          <w:sz w:val="14"/>
-          <w:szCs w:val="14"/>
-        </w:rPr>
-      </w:pPr>
-      <w:r>
-        <w:rPr>
-          <w:rFonts w:ascii="Cascadia Code" w:hAnsi="Cascadia Code"/>
-          <w:sz w:val="14"/>
-          <w:szCs w:val="14"/>
-        </w:rPr>
-        <w:t>Sets which point along the gesture motion to use as basis point ("pivot").</w:t>
-      </w:r>
-    </w:p>
-    <w:p>
-      <w:pPr>
-        <w:pStyle w:val="ListParagraph"/>
-        <w:rPr>
-          <w:rFonts w:ascii="Cascadia Code" w:hAnsi="Cascadia Code"/>
-          <w:sz w:val="14"/>
-          <w:szCs w:val="14"/>
-        </w:rPr>
-      </w:pPr>
-      <w:r>
-        <w:rPr>
-          <w:rFonts w:ascii="Cascadia Code" w:hAnsi="Cascadia Code"/>
-          <w:sz w:val="14"/>
-          <w:szCs w:val="14"/>
-        </w:rPr>
-        <w:t>This can be either the start point (ID: 1) or the center point (ID: 0).</w:t>
-      </w:r>
-    </w:p>
-    <w:p>
-      <w:pPr>
-        <w:pStyle w:val="ListParagraph"/>
-        <w:rPr>
-          <w:rFonts w:ascii="Cascadia Code" w:hAnsi="Cascadia Code"/>
-          <w:sz w:val="14"/>
-          <w:szCs w:val="14"/>
-        </w:rPr>
-      </w:pPr>
-      <w:r>
-        <w:rPr>
-          <w:rFonts w:ascii="Cascadia Code" w:hAnsi="Cascadia Code"/>
-          <w:sz w:val="14"/>
-          <w:szCs w:val="14"/>
-        </w:rPr>
-      </w:r>
-    </w:p>
-    <w:p>
-      <w:pPr>
-        <w:pStyle w:val="ListParagraph"/>
-        <w:rPr>
-          <w:rFonts w:ascii="Cascadia Code" w:hAnsi="Cascadia Code"/>
-          <w:sz w:val="14"/>
-          <w:szCs w:val="14"/>
-        </w:rPr>
-      </w:pPr>
-      <w:r>
-        <w:rPr>
-          <w:rFonts w:ascii="Cascadia Code" w:hAnsi="Cascadia Code"/>
-          <w:sz w:val="14"/>
-          <w:szCs w:val="14"/>
-        </w:rPr>
-        <w:t xml:space="preserve"> </w:t>
-      </w:r>
-      <w:r>
-        <w:rPr>
-          <w:rFonts w:ascii="Cascadia Code" w:hAnsi="Cascadia Code"/>
-          <w:i/>
-          <w:iCs/>
-          <w:sz w:val="14"/>
-          <w:szCs w:val="14"/>
-        </w:rPr>
-        <w:t>ActivationFunction (ID: 9)</w:t>
-      </w:r>
-    </w:p>
-    <w:p>
-      <w:pPr>
-        <w:pStyle w:val="ListParagraph"/>
-        <w:rPr>
-          <w:rFonts w:ascii="Cascadia Code" w:hAnsi="Cascadia Code"/>
-          <w:sz w:val="14"/>
-          <w:szCs w:val="14"/>
-        </w:rPr>
-      </w:pPr>
-      <w:r>
-        <w:rPr>
-          <w:rFonts w:ascii="Cascadia Code" w:hAnsi="Cascadia Code"/>
-          <w:sz w:val="14"/>
-          <w:szCs w:val="14"/>
-        </w:rPr>
-        <w:t>Sets which activation function to use in each neuron of the neural network.</w:t>
-      </w:r>
-    </w:p>
-    <w:p>
-      <w:pPr>
-        <w:pStyle w:val="ListParagraph"/>
-        <w:rPr>
-          <w:rFonts w:ascii="Cascadia Code" w:hAnsi="Cascadia Code"/>
-          <w:sz w:val="14"/>
-          <w:szCs w:val="14"/>
-        </w:rPr>
-      </w:pPr>
-      <w:r>
-        <w:rPr>
-          <w:rFonts w:ascii="Cascadia Code" w:hAnsi="Cascadia Code"/>
-          <w:sz w:val="14"/>
-          <w:szCs w:val="14"/>
-        </w:rPr>
-        <w:t>MiVRy offers two possible activation functions which can be selected by their ID (0 or 1).</w:t>
-      </w:r>
-    </w:p>
-    <w:p>
-      <w:pPr>
-        <w:pStyle w:val="ListParagraph"/>
-        <w:rPr>
-          <w:rFonts w:ascii="Cascadia Code" w:hAnsi="Cascadia Code"/>
-          <w:sz w:val="14"/>
-          <w:szCs w:val="14"/>
-        </w:rPr>
-      </w:pPr>
-      <w:r>
-        <w:rPr>
-          <w:rFonts w:ascii="Cascadia Code" w:hAnsi="Cascadia Code"/>
-          <w:sz w:val="14"/>
-          <w:szCs w:val="14"/>
-        </w:rPr>
-      </w:r>
-    </w:p>
-    <w:p>
-      <w:pPr>
-        <w:pStyle w:val="ListParagraph"/>
-        <w:rPr>
-          <w:rFonts w:ascii="Cascadia Code" w:hAnsi="Cascadia Code"/>
-          <w:sz w:val="14"/>
-          <w:szCs w:val="14"/>
-        </w:rPr>
-      </w:pPr>
-      <w:r>
-        <w:rPr>
-          <w:rFonts w:ascii="Cascadia Code" w:hAnsi="Cascadia Code"/>
-          <w:sz w:val="14"/>
-          <w:szCs w:val="14"/>
-        </w:rPr>
-        <w:t xml:space="preserve"> </w:t>
-      </w:r>
-      <w:r>
-        <w:rPr>
-          <w:rFonts w:ascii="Cascadia Code" w:hAnsi="Cascadia Code"/>
-          <w:i/>
-          <w:iCs/>
-          <w:sz w:val="14"/>
-          <w:szCs w:val="14"/>
-        </w:rPr>
-        <w:t>ActivationFactor (ID: 10)</w:t>
-      </w:r>
-    </w:p>
-    <w:p>
-      <w:pPr>
-        <w:pStyle w:val="ListParagraph"/>
-        <w:rPr>
-          <w:rFonts w:ascii="Cascadia Code" w:hAnsi="Cascadia Code"/>
-          <w:sz w:val="14"/>
-          <w:szCs w:val="14"/>
-        </w:rPr>
-      </w:pPr>
-      <w:r>
-        <w:rPr>
-          <w:rFonts w:ascii="Cascadia Code" w:hAnsi="Cascadia Code"/>
-          <w:sz w:val="14"/>
-          <w:szCs w:val="14"/>
-        </w:rPr>
-        <w:t>Sets the activation factor to use in each neuron of the neural network.</w:t>
-      </w:r>
-    </w:p>
-    <w:p>
-      <w:pPr>
-        <w:pStyle w:val="ListParagraph"/>
-        <w:rPr>
-          <w:rFonts w:ascii="Cascadia Code" w:hAnsi="Cascadia Code"/>
-          <w:sz w:val="14"/>
-          <w:szCs w:val="14"/>
-        </w:rPr>
-      </w:pPr>
-      <w:r>
-        <w:rPr>
-          <w:rFonts w:ascii="Cascadia Code" w:hAnsi="Cascadia Code"/>
-          <w:sz w:val="14"/>
-          <w:szCs w:val="14"/>
-        </w:rPr>
-      </w:r>
-    </w:p>
-    <w:p>
-      <w:pPr>
-        <w:pStyle w:val="ListParagraph"/>
-        <w:rPr>
-          <w:rFonts w:ascii="Cascadia Code" w:hAnsi="Cascadia Code"/>
-          <w:sz w:val="14"/>
-          <w:szCs w:val="14"/>
-        </w:rPr>
-      </w:pPr>
-      <w:r>
-        <w:rPr>
-          <w:rFonts w:ascii="Cascadia Code" w:hAnsi="Cascadia Code"/>
-          <w:sz w:val="14"/>
-          <w:szCs w:val="14"/>
-        </w:rPr>
-        <w:t xml:space="preserve"> </w:t>
-      </w:r>
-      <w:r>
-        <w:rPr>
-          <w:rFonts w:ascii="Cascadia Code" w:hAnsi="Cascadia Code"/>
-          <w:i/>
-          <w:iCs/>
-          <w:sz w:val="14"/>
-          <w:szCs w:val="14"/>
-        </w:rPr>
-        <w:t>UseTimestamp (ID: 11)</w:t>
-      </w:r>
-    </w:p>
-    <w:p>
-      <w:pPr>
-        <w:pStyle w:val="ListParagraph"/>
-        <w:rPr>
-          <w:rFonts w:ascii="Cascadia Code" w:hAnsi="Cascadia Code"/>
-          <w:sz w:val="14"/>
-          <w:szCs w:val="14"/>
-        </w:rPr>
-      </w:pPr>
-      <w:r>
-        <w:rPr>
-          <w:rFonts w:ascii="Cascadia Code" w:hAnsi="Cascadia Code"/>
-          <w:sz w:val="14"/>
-          <w:szCs w:val="14"/>
-        </w:rPr>
-        <w:t>Sets whether the time (speed) of the gesture motion is used to identify the gesture.</w:t>
-      </w:r>
-    </w:p>
-    <w:p>
-      <w:pPr>
-        <w:pStyle w:val="ListParagraph"/>
-        <w:rPr>
-          <w:rFonts w:ascii="Cascadia Code" w:hAnsi="Cascadia Code"/>
-          <w:sz w:val="14"/>
-          <w:szCs w:val="14"/>
-        </w:rPr>
-      </w:pPr>
-      <w:r>
-        <w:rPr>
-          <w:rFonts w:ascii="Cascadia Code" w:hAnsi="Cascadia Code"/>
-          <w:sz w:val="14"/>
-          <w:szCs w:val="14"/>
-        </w:rPr>
-        <w:t>"0" mean no, "1" means yes.</w:t>
+        <w:t>(20) I have recorded some gesture combinations which only use the left hand or right hand. When gesturing with both hands they do not get recognized.</w:t>
+      </w:r>
+    </w:p>
+    <w:p>
+      <w:pPr>
+        <w:pStyle w:val="ListParagraph"/>
+        <w:rPr/>
+      </w:pPr>
+      <w:r>
+        <w:rPr/>
+      </w:r>
+    </w:p>
+    <w:p>
+      <w:pPr>
+        <w:pStyle w:val="ListParagraph"/>
+        <w:rPr>
+          <w:rFonts w:ascii="Cascadia Code" w:hAnsi="Cascadia Code"/>
+          <w:sz w:val="14"/>
+          <w:szCs w:val="14"/>
+        </w:rPr>
+      </w:pPr>
+      <w:r>
+        <w:rPr>
+          <w:rFonts w:ascii="Cascadia Code" w:hAnsi="Cascadia Code"/>
+          <w:sz w:val="14"/>
+          <w:szCs w:val="14"/>
+        </w:rPr>
+        <w:t>If you define a gesture to only include one hand, but then make a gesture motion with both hands (ie performing the 'trigger' for both hands) then MiVRy will conclude that obviously you do not intend to make the one-handed gesture, hence it will not be included in the possible results.</w:t>
+      </w:r>
+    </w:p>
+    <w:p>
+      <w:pPr>
+        <w:pStyle w:val="ListParagraph"/>
+        <w:rPr>
+          <w:rFonts w:ascii="Cascadia Code" w:hAnsi="Cascadia Code"/>
+          <w:sz w:val="14"/>
+          <w:szCs w:val="14"/>
+        </w:rPr>
+      </w:pPr>
+      <w:r>
+        <w:rPr>
+          <w:rFonts w:ascii="Cascadia Code" w:hAnsi="Cascadia Code"/>
+          <w:sz w:val="14"/>
+          <w:szCs w:val="14"/>
+        </w:rPr>
+      </w:r>
+    </w:p>
+    <w:p>
+      <w:pPr>
+        <w:pStyle w:val="ListParagraph"/>
+        <w:rPr>
+          <w:rFonts w:ascii="Cascadia Code" w:hAnsi="Cascadia Code"/>
+          <w:sz w:val="14"/>
+          <w:szCs w:val="14"/>
+        </w:rPr>
+      </w:pPr>
+      <w:r>
+        <w:rPr>
+          <w:rFonts w:ascii="Cascadia Code" w:hAnsi="Cascadia Code"/>
+          <w:sz w:val="14"/>
+          <w:szCs w:val="14"/>
+        </w:rPr>
+        <w:t>If you want a gesture to be identified when making a gesture motion with both hands, you should define what the other hands is doing during the gesture motion.</w:t>
+      </w:r>
+    </w:p>
+    <w:p>
+      <w:pPr>
+        <w:pStyle w:val="ListParagraph"/>
+        <w:rPr>
+          <w:rFonts w:ascii="Cascadia Code" w:hAnsi="Cascadia Code"/>
+          <w:sz w:val="14"/>
+          <w:szCs w:val="14"/>
+        </w:rPr>
+      </w:pPr>
+      <w:r>
+        <w:rPr>
+          <w:rFonts w:ascii="Cascadia Code" w:hAnsi="Cascadia Code"/>
+          <w:sz w:val="14"/>
+          <w:szCs w:val="14"/>
+        </w:rPr>
+        <w:t>Leaving hand samples empty is also possible, but recognition performance may not be as good.</w:t>
+      </w:r>
+    </w:p>
+    <w:p>
+      <w:pPr>
+        <w:pStyle w:val="ListParagraph"/>
+        <w:rPr>
+          <w:rFonts w:ascii="Cascadia Code" w:hAnsi="Cascadia Code"/>
+          <w:sz w:val="14"/>
+          <w:szCs w:val="14"/>
+        </w:rPr>
+      </w:pPr>
+      <w:r>
+        <w:rPr>
+          <w:rFonts w:ascii="Cascadia Code" w:hAnsi="Cascadia Code"/>
+          <w:sz w:val="14"/>
+          <w:szCs w:val="14"/>
+        </w:rPr>
+      </w:r>
+    </w:p>
+    <w:p>
+      <w:pPr>
+        <w:pStyle w:val="ListParagraph"/>
+        <w:rPr>
+          <w:rFonts w:ascii="Cascadia Code" w:hAnsi="Cascadia Code"/>
+          <w:sz w:val="14"/>
+          <w:szCs w:val="14"/>
+        </w:rPr>
+      </w:pPr>
+      <w:r>
+        <w:rPr>
+          <w:rFonts w:ascii="Cascadia Code" w:hAnsi="Cascadia Code"/>
+          <w:sz w:val="14"/>
+          <w:szCs w:val="14"/>
+        </w:rPr>
+        <w:t>Alternatively you can choose to record your left hand gesture and right hand gesture into two separate files, and use two separate `Mivry.cs` script components or `GestureRecognition.cs` objects in your scene, one which only track the left hand and the other to only track the right hand.</w:t>
       </w:r>
       <w:r>
         <w:br w:type="page"/>

</xml_diff>